<commit_message>
Weekly report: cut to a third of its length
Co-Authored-By: Claude Opus 5 <noreply@anthropic.com>
Claude-Session: https://claude.ai/code/session_018JAoc1BQgQ82dR8t2BxgrR
</commit_message>
<xml_diff>
--- a/hitl_bench/docs/report_week_2026-09-07.docx
+++ b/hitl_bench/docs/report_week_2026-09-07.docx
@@ -8,7 +8,6 @@
       </w:pPr>
       <w:r>
         <w:rPr>
-          <w:i w:val="0"/>
           <w:color w:val="176F8B"/>
           <w:sz w:val="18"/>
         </w:rPr>
@@ -25,28 +24,14 @@
     </w:p>
     <w:p>
       <w:pPr>
-        <w:spacing w:after="80"/>
+        <w:spacing w:after="160"/>
       </w:pPr>
       <w:r>
         <w:rPr>
-          <w:i w:val="0"/>
-          <w:color w:val="5A6876"/>
-          <w:sz w:val="23"/>
-        </w:rPr>
-        <w:t>From “which reaction should the chemists be shown?” to a working REACTO page on which they can be shown it — with the in-silico arms, the trigger and the reproducibility fix that make the human arm interpretable.</w:t>
-      </w:r>
-    </w:p>
-    <w:p>
-      <w:pPr>
-        <w:spacing w:after="200"/>
-      </w:pPr>
-      <w:r>
-        <w:rPr>
-          <w:i w:val="0"/>
           <w:color w:val="5A6876"/>
           <w:sz w:val="18"/>
         </w:rPr>
-        <w:t>CiTOS, ULiège · REACTO branch hitl-bench · study owner M. Croissant · written 14 September 2026</w:t>
+        <w:t>CiTOS, ULiège · REACTO branch hitl-bench · M. Croissant · 14 September 2026</w:t>
       </w:r>
     </w:p>
     <w:tbl>
@@ -63,7 +48,7 @@
       <w:tr>
         <w:tc>
           <w:tcPr>
-            <w:tcW w:type="dxa" w:w="2551"/>
+            <w:tcW w:type="dxa" w:w="2268"/>
           </w:tcPr>
           <w:p>
             <w:r/>
@@ -78,7 +63,7 @@
         </w:tc>
         <w:tc>
           <w:tcPr>
-            <w:tcW w:type="dxa" w:w="6803"/>
+            <w:tcW w:type="dxa" w:w="7087"/>
           </w:tcPr>
           <w:p>
             <w:r/>
@@ -87,7 +72,6 @@
                 <w:b/>
                 <w:sz w:val="18"/>
               </w:rPr>
-              <w:t>What it is</w:t>
             </w:r>
           </w:p>
         </w:tc>
@@ -95,7 +79,7 @@
       <w:tr>
         <w:tc>
           <w:tcPr>
-            <w:tcW w:type="dxa" w:w="2551"/>
+            <w:tcW w:type="dxa" w:w="2268"/>
           </w:tcPr>
           <w:p>
             <w:r/>
@@ -109,7 +93,7 @@
         </w:tc>
         <w:tc>
           <w:tcPr>
-            <w:tcW w:type="dxa" w:w="6803"/>
+            <w:tcW w:type="dxa" w:w="7087"/>
           </w:tcPr>
           <w:p>
             <w:r/>
@@ -117,7 +101,7 @@
               <w:rPr>
                 <w:sz w:val="18"/>
               </w:rPr>
-              <w:t>benchmarks kept out of 12 grids: Suzuki I, Suzuki II, C–H arylation</w:t>
+              <w:t>benchmarks kept out of 12 grids</w:t>
             </w:r>
           </w:p>
         </w:tc>
@@ -125,7 +109,7 @@
       <w:tr>
         <w:tc>
           <w:tcPr>
-            <w:tcW w:type="dxa" w:w="2551"/>
+            <w:tcW w:type="dxa" w:w="2268"/>
           </w:tcPr>
           <w:p>
             <w:r/>
@@ -133,13 +117,13 @@
               <w:rPr>
                 <w:sz w:val="18"/>
               </w:rPr>
-              <w:t>65 % · 25 % · 50 %</w:t>
+              <w:t>65 · 25 · 50 %</w:t>
             </w:r>
           </w:p>
         </w:tc>
         <w:tc>
           <w:tcPr>
-            <w:tcW w:type="dxa" w:w="6803"/>
+            <w:tcW w:type="dxa" w:w="7087"/>
           </w:tcPr>
           <w:p>
             <w:r/>
@@ -147,7 +131,7 @@
               <w:rPr>
                 <w:sz w:val="18"/>
               </w:rPr>
-              <w:t>plain-BO failure rate on 20 seeds (Suzuki II · Suzuki I · arylation)</w:t>
+              <w:t>plain-BO failure rate, 20 seeds (Suzuki II · I · arylation)</w:t>
             </w:r>
           </w:p>
         </w:tc>
@@ -155,7 +139,7 @@
       <w:tr>
         <w:tc>
           <w:tcPr>
-            <w:tcW w:type="dxa" w:w="2551"/>
+            <w:tcW w:type="dxa" w:w="2268"/>
           </w:tcPr>
           <w:p>
             <w:r/>
@@ -169,7 +153,7 @@
         </w:tc>
         <w:tc>
           <w:tcPr>
-            <w:tcW w:type="dxa" w:w="6803"/>
+            <w:tcW w:type="dxa" w:w="7087"/>
           </w:tcPr>
           <w:p>
             <w:r/>
@@ -177,7 +161,7 @@
               <w:rPr>
                 <w:sz w:val="18"/>
               </w:rPr>
-              <w:t>paired gain of a random point at the alerts — the null model — over 40 branches</w:t>
+              <w:t>gain of a random point at the alerts — the null model</w:t>
             </w:r>
           </w:p>
         </w:tc>
@@ -185,7 +169,7 @@
       <w:tr>
         <w:tc>
           <w:tcPr>
-            <w:tcW w:type="dxa" w:w="2551"/>
+            <w:tcW w:type="dxa" w:w="2268"/>
           </w:tcPr>
           <w:p>
             <w:r/>
@@ -199,7 +183,7 @@
         </w:tc>
         <w:tc>
           <w:tcPr>
-            <w:tcW w:type="dxa" w:w="6803"/>
+            <w:tcW w:type="dxa" w:w="7087"/>
           </w:tcPr>
           <w:p>
             <w:r/>
@@ -207,7 +191,7 @@
               <w:rPr>
                 <w:sz w:val="18"/>
               </w:rPr>
-              <w:t>REACTO /hitl-live: chemists run the three trapped campaigns and answer the trigger</w:t>
+              <w:t>REACTO /hitl-live, ready for the chemists</w:t>
             </w:r>
           </w:p>
         </w:tc>
@@ -215,7 +199,7 @@
     </w:tbl>
     <w:p>
       <w:pPr>
-        <w:spacing w:after="40"/>
+        <w:spacing w:after="0"/>
       </w:pPr>
     </w:p>
     <w:p>
@@ -264,7 +248,6 @@
                 <w:b/>
                 <w:sz w:val="18"/>
               </w:rPr>
-              <w:t>What happened</w:t>
             </w:r>
           </w:p>
         </w:tc>
@@ -294,7 +277,7 @@
               <w:rPr>
                 <w:sz w:val="18"/>
               </w:rPr>
-              <w:t>The study moved into REACTO's own repository (branch hitl-bench) and now calls REACTO's optimiser; Olympus and its environment dropped; the Minerva grids verified and versioned; campaign core written; first five case II campaigns reproduce the known bimodality.</w:t>
+              <w:t>Study moved into the REACTO repository; Olympus dropped; grids verified; campaign core written.</w:t>
             </w:r>
           </w:p>
         </w:tc>
@@ -310,7 +293,7 @@
               <w:rPr>
                 <w:sz w:val="18"/>
               </w:rPr>
-              <w:t>Tue 8 → Wed 9</w:t>
+              <w:t>Tue 8 – Wed 9</w:t>
             </w:r>
           </w:p>
         </w:tc>
@@ -324,37 +307,7 @@
               <w:rPr>
                 <w:sz w:val="18"/>
               </w:rPr>
-              <w:t>Trigger candidates measured on the Suzuki campaigns; overnight, nine additional reaction grids collected and plain BO run on each to find reactions where the optimiser can fail.</w:t>
-            </w:r>
-          </w:p>
-        </w:tc>
-      </w:tr>
-      <w:tr>
-        <w:tc>
-          <w:tcPr>
-            <w:tcW w:type="dxa" w:w="1701"/>
-          </w:tcPr>
-          <w:p>
-            <w:r/>
-            <w:r>
-              <w:rPr>
-                <w:sz w:val="18"/>
-              </w:rPr>
-              <w:t>Wed 9</w:t>
-            </w:r>
-          </w:p>
-        </w:tc>
-        <w:tc>
-          <w:tcPr>
-            <w:tcW w:type="dxa" w:w="7654"/>
-          </w:tcPr>
-          <w:p>
-            <w:r/>
-            <w:r>
-              <w:rPr>
-                <w:sz w:val="18"/>
-              </w:rPr>
-              <w:t>Decisions: Suzuki cases I and II plus the EDBO+ C–H arylation are the study's reactions; the chemist may also stop a campaign (third answer at a checkpoint); no more Suzuki-only work.</w:t>
+              <w:t>Trigger candidates measured; nine more reaction grids screened overnight; the three reactions chosen.</w:t>
             </w:r>
           </w:p>
         </w:tc>
@@ -384,7 +337,7 @@
               <w:rPr>
                 <w:sz w:val="18"/>
               </w:rPr>
-              <w:t>Provenance of every grid re-established and verified by script. Trigger frozen: P*, W = 5, threshold 0.30, cooldown 5. Three-arm design agreed. Root cause of non-reproducibility found and fixed in REACTO.</w:t>
+              <w:t>Provenance verified by script; trigger frozen; three-arm design; non-reproducibility found and fixed.</w:t>
             </w:r>
           </w:p>
         </w:tc>
@@ -400,7 +353,7 @@
               <w:rPr>
                 <w:sz w:val="18"/>
               </w:rPr>
-              <w:t>Thu 10 → Fri 11</w:t>
+              <w:t>Thu 10 – Fri 11</w:t>
             </w:r>
           </w:p>
         </w:tc>
@@ -414,37 +367,7 @@
               <w:rPr>
                 <w:sz w:val="18"/>
               </w:rPr>
-              <w:t>Overnight: reproducibility verified to twelve decimals; control arm and random-intervention arm computed (arylation complete, Suzuki II controls); figures for the article and the SI.</w:t>
-            </w:r>
-          </w:p>
-        </w:tc>
-      </w:tr>
-      <w:tr>
-        <w:tc>
-          <w:tcPr>
-            <w:tcW w:type="dxa" w:w="1701"/>
-          </w:tcPr>
-          <w:p>
-            <w:r/>
-            <w:r>
-              <w:rPr>
-                <w:sz w:val="18"/>
-              </w:rPr>
-              <w:t>Fri 11</w:t>
-            </w:r>
-          </w:p>
-        </w:tc>
-        <w:tc>
-          <w:tcPr>
-            <w:tcW w:type="dxa" w:w="7654"/>
-          </w:tcPr>
-          <w:p>
-            <w:r/>
-            <w:r>
-              <w:rPr>
-                <w:sz w:val="18"/>
-              </w:rPr>
-              <w:t>Night report. The live HITL page built as a tested state machine (hitl_bench/live.py) with a thin Dash skin.</w:t>
+              <w:t>Reproducibility verified; control and random arms computed; figures; live page built.</w:t>
             </w:r>
           </w:p>
         </w:tc>
@@ -474,7 +397,7 @@
               <w:rPr>
                 <w:sz w:val="18"/>
               </w:rPr>
-              <w:t>Shown that the initial design alone decides a trapped campaign. Seeds chosen for the chemists from 20 controls per benchmark. Page verified in the browser; several fixes; English; chemistry cards with the source figures; the owner's own trial of the three campaigns.</w:t>
+              <w:t>Initial design shown to decide the outcome; seeds assigned; page verified in the browser, put in English, chemistry added; owner's trial run.</w:t>
             </w:r>
           </w:p>
         </w:tc>
@@ -482,7 +405,7 @@
     </w:tbl>
     <w:p>
       <w:pPr>
-        <w:spacing w:after="40"/>
+        <w:spacing w:after="0"/>
       </w:pPr>
     </w:p>
     <w:p>
@@ -490,7 +413,7 @@
         <w:pStyle w:val="Heading1"/>
       </w:pPr>
       <w:r>
-        <w:t>0 · One repository, one optimiser: the move into REACTO</w:t>
+        <w:t>1 · One repository, one optimiser</w:t>
       </w:r>
     </w:p>
     <w:p>
@@ -498,10 +421,44 @@
         <w:spacing w:after="120"/>
       </w:pPr>
       <w:r>
+        <w:t>The benchmark used to live in a standalone folder with its own copy of the optimisation code, a patched Olympus and a broken Python environment. On Monday it moved into REACTO itself (</w:t>
+      </w:r>
+      <w:r>
         <w:rPr>
-          <w:i w:val="0"/>
+          <w:rFonts w:ascii="Consolas" w:hAnsi="Consolas"/>
+          <w:sz w:val="19"/>
         </w:rPr>
-        <w:t>Until Monday the benchmark lived in a standalone folder (Documents/Thèse/BO/hitl-bench) with its own copy of the optimisation code, an Olympus installation that needed three patches to run (a circular import, sixteen Windows path fixes, a protobuf/TensorFlow 1.15 work-around) and a separate Python environment that turned out to be broken (the interpreter died on any BLAS call). None of that could be handed to a successor.</w:t>
+        <w:t>hitl_bench/</w:t>
+      </w:r>
+      <w:r>
+        <w:t xml:space="preserve">, branch </w:t>
+      </w:r>
+      <w:r>
+        <w:rPr>
+          <w:rFonts w:ascii="Consolas" w:hAnsi="Consolas"/>
+          <w:sz w:val="19"/>
+        </w:rPr>
+        <w:t>hitl-bench</w:t>
+      </w:r>
+      <w:r>
+        <w:t xml:space="preserve"> of github.com/Mathildec25/dash-chem) and now </w:t>
+      </w:r>
+      <w:r>
+        <w:rPr>
+          <w:b/>
+        </w:rPr>
+        <w:t>imports REACTO's own `bayesian_optimization()`</w:t>
+      </w:r>
+      <w:r>
+        <w:t>: the in-silico study tests the tool that will run the real campaigns. Olympus is out — the Minerva grids already carry the objectives — so one venv reproduces everything. Input grids are versioned, results and chemists' files are ignored. The old folder was emptied; every commit is pushed the day it is made.</w:t>
+      </w:r>
+    </w:p>
+    <w:p>
+      <w:pPr>
+        <w:pStyle w:val="Heading1"/>
+      </w:pPr>
+      <w:r>
+        <w:t>2 · Benchmarks</w:t>
       </w:r>
     </w:p>
     <w:p>
@@ -509,104 +466,34 @@
         <w:spacing w:after="120"/>
       </w:pPr>
       <w:r>
-        <w:rPr>
-          <w:i w:val="0"/>
-        </w:rPr>
-        <w:t>What changed on 7 September, and why:</w:t>
+        <w:t xml:space="preserve">A usable benchmark is a </w:t>
       </w:r>
-    </w:p>
-    <w:p>
-      <w:pPr>
-        <w:pStyle w:val="ListBullet"/>
-        <w:spacing w:after="60"/>
-      </w:pPr>
       <w:r>
         <w:rPr>
           <w:b/>
         </w:rPr>
-        <w:t>The study now lives inside REACTO</w:t>
+        <w:t>complete grid</w:t>
       </w:r>
       <w:r>
-        <w:t>, in hitl_bench/ on the branch hitl-bench of github.com/Mathildec25/dash-chem, and imports REACTO's own bayesian_optimization() instead of keeping a copy. There is a single Bayesian optimiser in the project, so the in-silico study tests literally the tool that will run the real campaigns.</w:t>
+        <w:t xml:space="preserve"> (exact front, decimal-level reproducibility) with </w:t>
       </w:r>
-    </w:p>
-    <w:p>
-      <w:pPr>
-        <w:pStyle w:val="ListBullet"/>
-        <w:spacing w:after="60"/>
-      </w:pPr>
       <w:r>
         <w:rPr>
           <w:b/>
         </w:rPr>
-        <w:t>Olympus is out.</w:t>
+        <w:t>named reagents</w:t>
       </w:r>
       <w:r>
-        <w:t xml:space="preserve"> The Minerva grids already carry yield and turnover, so no emulator, no TensorFlow 1.15 and no Python 3.7 are needed to reproduce any result. One environment, REACTO's venv, is enough.</w:t>
+        <w:t xml:space="preserve"> and </w:t>
       </w:r>
-    </w:p>
-    <w:p>
-      <w:pPr>
-        <w:pStyle w:val="ListBullet"/>
-        <w:spacing w:after="60"/>
-      </w:pPr>
       <w:r>
         <w:rPr>
           <w:b/>
         </w:rPr>
-        <w:t>Input data are versioned, outputs are not.</w:t>
+        <w:t>room for a chemist to change the outcome</w:t>
       </w:r>
       <w:r>
-        <w:t xml:space="preserve"> REACTO's .gitignore excluded every CSV; an exception now versions the benchmark grids (they are inputs, not exports), while results/, the chemists' files and the checkpoints are ignored.</w:t>
-      </w:r>
-    </w:p>
-    <w:p>
-      <w:pPr>
-        <w:pStyle w:val="ListBullet"/>
-        <w:spacing w:after="60"/>
-      </w:pPr>
-      <w:r>
-        <w:rPr>
-          <w:b/>
-        </w:rPr>
-        <w:t>The old folder was emptied</w:t>
-      </w:r>
-      <w:r>
-        <w:t xml:space="preserve"> (eleven items, including the earlier results and exact fronts), a deletion confirmed as deliberate; the project restarted from zero in REACTO with the grids re-verified against a repaired Olympus (r ≥ 0.997, mean absolute gap ≤ 1 point).</w:t>
-      </w:r>
-    </w:p>
-    <w:p>
-      <w:pPr>
-        <w:pStyle w:val="ListBullet"/>
-        <w:spacing w:after="60"/>
-      </w:pPr>
-      <w:r>
-        <w:rPr>
-          <w:b/>
-        </w:rPr>
-        <w:t>One scare on Tuesday morning:</w:t>
-      </w:r>
-      <w:r>
-        <w:t xml:space="preserve"> the working tree had been switched to main from the editor, so hitl_bench/ vanished from the disk. Nothing was lost — a branch is a drawer, not the desk — and since then every commit is pushed the day it is made; nothing exists only locally.</w:t>
-      </w:r>
-    </w:p>
-    <w:p>
-      <w:pPr>
-        <w:pStyle w:val="Heading1"/>
-      </w:pPr>
-      <w:r>
-        <w:t>1 · Benchmarks: where they come from and why these three</w:t>
-      </w:r>
-    </w:p>
-    <w:p>
-      <w:pPr>
-        <w:spacing w:after="120"/>
-      </w:pPr>
-      <w:r>
-        <w:rPr>
-          <w:i w:val="0"/>
-        </w:rPr>
-        <w:t>A benchmark for this study must be a complete factorial grid (so the Pareto front is exact and a campaign is reproducible to the decimal), with named reagents (a chemist cannot argue with “L4”), and with room for a chemist to change the outcome — a reaction where plain BO always reaches the front measures nothing. The third criterion is read from the spread between seeds.</w:t>
+        <w:t>, read as the spread between seeds. Twelve grids were screened; three are kept.</w:t>
       </w:r>
     </w:p>
     <w:p>
@@ -650,21 +537,14 @@
     </w:p>
     <w:p>
       <w:pPr>
-        <w:spacing w:after="200"/>
+        <w:spacing w:after="160"/>
       </w:pPr>
-      <w:r>
-        <w:rPr>
-          <w:b/>
-          <w:sz w:val="18"/>
-        </w:rPr>
-        <w:t xml:space="preserve">Spread between the worst and the best plain-BO campaign, </w:t>
-      </w:r>
       <w:r>
         <w:rPr>
           <w:color w:val="5A6876"/>
           <w:sz w:val="18"/>
         </w:rPr>
-        <w:t>in points of the global Pareto front (3–5 seeds, night of 8–9 September). Orange: kept as selection benchmarks; blue: kept, measured data; grey: rejected or blind validation.</w:t>
+        <w:t>Spread between the worst and best plain-BO campaign, points of the global front (3–5 seeds).</w:t>
       </w:r>
     </w:p>
     <w:tbl>
@@ -699,7 +579,7 @@
         </w:tc>
         <w:tc>
           <w:tcPr>
-            <w:tcW w:type="dxa" w:w="4082"/>
+            <w:tcW w:type="dxa" w:w="3742"/>
           </w:tcPr>
           <w:p>
             <w:r/>
@@ -708,7 +588,7 @@
                 <w:b/>
                 <w:sz w:val="18"/>
               </w:rPr>
-              <w:t>Origin of the numbers</w:t>
+              <w:t>Source</w:t>
             </w:r>
           </w:p>
         </w:tc>
@@ -729,7 +609,7 @@
         </w:tc>
         <w:tc>
           <w:tcPr>
-            <w:tcW w:type="dxa" w:w="1247"/>
+            <w:tcW w:type="dxa" w:w="1474"/>
           </w:tcPr>
           <w:p>
             <w:r/>
@@ -744,7 +624,7 @@
         </w:tc>
         <w:tc>
           <w:tcPr>
-            <w:tcW w:type="dxa" w:w="1587"/>
+            <w:tcW w:type="dxa" w:w="1417"/>
           </w:tcPr>
           <w:p>
             <w:r/>
@@ -753,7 +633,7 @@
                 <w:b/>
                 <w:sz w:val="18"/>
               </w:rPr>
-              <w:t>Status</w:t>
+              <w:t>Nature</w:t>
             </w:r>
           </w:p>
         </w:tc>
@@ -769,13 +649,13 @@
               <w:rPr>
                 <w:sz w:val="18"/>
               </w:rPr>
-              <w:t>Suzuki–Miyaura, cases I–IV</w:t>
+              <w:t>Suzuki I, II (III, IV blind)</w:t>
             </w:r>
           </w:p>
         </w:tc>
         <w:tc>
           <w:tcPr>
-            <w:tcW w:type="dxa" w:w="4082"/>
+            <w:tcW w:type="dxa" w:w="3742"/>
           </w:tcPr>
           <w:p>
             <w:r/>
@@ -783,7 +663,7 @@
               <w:rPr>
                 <w:sz w:val="18"/>
               </w:rPr>
-              <w:t>Reizman, Wang, Buchwald &amp; Jensen, React. Chem. Eng. 2016 (droplet-flow campaigns, ~90 experiments per case) → Olympus Bayesian-neural-network emulators → complete grids published with Minerva (Sin et al., Nat. Commun. 2025), used verbatim</w:t>
+              <w:t>Reizman et al. 2016 → Olympus emulators → Minerva grids, verbatim</w:t>
             </w:r>
           </w:p>
         </w:tc>
@@ -792,9 +672,6 @@
             <w:tcW w:type="dxa" w:w="907"/>
           </w:tcPr>
           <w:p>
-            <w:pPr>
-              <w:jc w:val="right"/>
-            </w:pPr>
             <w:r/>
             <w:r>
               <w:rPr>
@@ -806,7 +683,7 @@
         </w:tc>
         <w:tc>
           <w:tcPr>
-            <w:tcW w:type="dxa" w:w="1247"/>
+            <w:tcW w:type="dxa" w:w="1474"/>
           </w:tcPr>
           <w:p>
             <w:r/>
@@ -820,7 +697,7 @@
         </w:tc>
         <w:tc>
           <w:tcPr>
-            <w:tcW w:type="dxa" w:w="1587"/>
+            <w:tcW w:type="dxa" w:w="1417"/>
           </w:tcPr>
           <w:p>
             <w:r/>
@@ -828,7 +705,7 @@
               <w:rPr>
                 <w:sz w:val="18"/>
               </w:rPr>
-              <w:t>emulated, noiseless; I and II selection, III and IV blind validation</w:t>
+              <w:t>emulated, noiseless</w:t>
             </w:r>
           </w:p>
         </w:tc>
@@ -850,7 +727,7 @@
         </w:tc>
         <w:tc>
           <w:tcPr>
-            <w:tcW w:type="dxa" w:w="4082"/>
+            <w:tcW w:type="dxa" w:w="3742"/>
           </w:tcPr>
           <w:p>
             <w:r/>
@@ -858,7 +735,7 @@
               <w:rPr>
                 <w:sz w:val="18"/>
               </w:rPr>
-              <w:t>Shields et al., Nature 2021, reaction 3 — 1-methyl-1H-imidazole-4-carbonitrile + 1-bromo-2-fluorobenzene, all 1,728 conditions run at Bristol Myers Squibb; reagent cost added by Torres et al., JACS 2022 (EDBO+). Our file equals theirs row for row</w:t>
+              <w:t>Shields et al. 2021 (reaction 3) + cost from Torres et al. 2022 (EDBO+); identical row for row</w:t>
             </w:r>
           </w:p>
         </w:tc>
@@ -867,9 +744,6 @@
             <w:tcW w:type="dxa" w:w="907"/>
           </w:tcPr>
           <w:p>
-            <w:pPr>
-              <w:jc w:val="right"/>
-            </w:pPr>
             <w:r/>
             <w:r>
               <w:rPr>
@@ -881,7 +755,7 @@
         </w:tc>
         <w:tc>
           <w:tcPr>
-            <w:tcW w:type="dxa" w:w="1247"/>
+            <w:tcW w:type="dxa" w:w="1474"/>
           </w:tcPr>
           <w:p>
             <w:r/>
@@ -895,231 +769,6 @@
         </w:tc>
         <w:tc>
           <w:tcPr>
-            <w:tcW w:type="dxa" w:w="1587"/>
-          </w:tcPr>
-          <w:p>
-            <w:r/>
-            <w:r>
-              <w:rPr>
-                <w:sz w:val="18"/>
-              </w:rPr>
-              <w:t>measured, single run per condition</w:t>
-            </w:r>
-          </w:p>
-        </w:tc>
-      </w:tr>
-      <w:tr>
-        <w:tc>
-          <w:tcPr>
-            <w:tcW w:type="dxa" w:w="1814"/>
-          </w:tcPr>
-          <w:p>
-            <w:r/>
-            <w:r>
-              <w:rPr>
-                <w:sz w:val="18"/>
-              </w:rPr>
-              <w:t>SNAr, Buchwald a–e, LNP, dye lasers</w:t>
-            </w:r>
-          </w:p>
-        </w:tc>
-        <w:tc>
-          <w:tcPr>
-            <w:tcW w:type="dxa" w:w="4082"/>
-          </w:tcPr>
-          <w:p>
-            <w:r/>
-            <w:r>
-              <w:rPr>
-                <w:sz w:val="18"/>
-              </w:rPr>
-              <w:t>Summit kinetic model; Olympus datasets, identical to the repository</w:t>
-            </w:r>
-          </w:p>
-        </w:tc>
-        <w:tc>
-          <w:tcPr>
-            <w:tcW w:type="dxa" w:w="907"/>
-          </w:tcPr>
-          <w:p>
-            <w:pPr>
-              <w:jc w:val="right"/>
-            </w:pPr>
-            <w:r/>
-            <w:r>
-              <w:rPr>
-                <w:sz w:val="18"/>
-              </w:rPr>
-              <w:t>768–3,458</w:t>
-            </w:r>
-          </w:p>
-        </w:tc>
-        <w:tc>
-          <w:tcPr>
-            <w:tcW w:type="dxa" w:w="1247"/>
-          </w:tcPr>
-          <w:p>
-            <w:r/>
-            <w:r>
-              <w:rPr>
-                <w:sz w:val="18"/>
-              </w:rPr>
-              <w:t>various</w:t>
-            </w:r>
-          </w:p>
-        </w:tc>
-        <w:tc>
-          <w:tcPr>
-            <w:tcW w:type="dxa" w:w="1587"/>
-          </w:tcPr>
-          <w:p>
-            <w:r/>
-            <w:r>
-              <w:rPr>
-                <w:sz w:val="18"/>
-              </w:rPr>
-              <w:t>rejected; SNAr kept as a control</w:t>
-            </w:r>
-          </w:p>
-        </w:tc>
-      </w:tr>
-    </w:tbl>
-    <w:p>
-      <w:pPr>
-        <w:spacing w:after="40"/>
-      </w:pPr>
-    </w:p>
-    <w:p>
-      <w:pPr>
-        <w:spacing w:after="120"/>
-      </w:pPr>
-      <w:r>
-        <w:rPr>
-          <w:i w:val="0"/>
-        </w:rPr>
-        <w:t xml:space="preserve">Two facts from the week that change how a result reads. </w:t>
-      </w:r>
-    </w:p>
-    <w:p>
-      <w:pPr>
-        <w:spacing w:after="120"/>
-      </w:pPr>
-      <w:r>
-        <w:rPr>
-          <w:b/>
-        </w:rPr>
-        <w:t xml:space="preserve">The two Suzuki surrogates agree on the winning catalyst. </w:t>
-      </w:r>
-      <w:r>
-        <w:t xml:space="preserve">Summit's own MLP emulators, evaluated on the same 5,670-point grid, disagree with Olympus by 8.8 yield points on average (up to 34.6, always at low temperature) but put the front on the same catalyst in all four cases — PCy3 for case II as in the paper. The trap is chemistry, not an artefact of one surrogate. </w:t>
-      </w:r>
-      <w:r>
-        <w:rPr>
-          <w:b/>
-        </w:rPr>
-        <w:t xml:space="preserve">The arylation has tied acquisition values. </w:t>
-      </w:r>
-      <w:r>
-        <w:t>At experiment 30, 175 of the 1,698 remaining candidates share the acquisition maximum to the last digit (192 categorical cells, 17 visited), so the tail of an unaided campaign is an alphabetical sweep. Suzuki has no ties. The tie fraction is computable during a live campaign and says whether the optimiser is still choosing or merely enumerating.</w:t>
-      </w:r>
-    </w:p>
-    <w:p>
-      <w:pPr>
-        <w:pStyle w:val="Heading1"/>
-      </w:pPr>
-      <w:r>
-        <w:t>2 · Plain BO on the three benchmarks: how often it fails</w:t>
-      </w:r>
-    </w:p>
-    <w:p>
-      <w:pPr>
-        <w:spacing w:after="120"/>
-      </w:pPr>
-      <w:r>
-        <w:rPr>
-          <w:i w:val="0"/>
-        </w:rPr>
-        <w:t>Twenty control campaigns per benchmark (10 Latin-hypercube points, then 30 sequential qLogNEHVI proposals, one experiment at a time), all replayable since Thursday. “Failure” is ending below 90 % of the global front.</w:t>
-      </w:r>
-    </w:p>
-    <w:tbl>
-      <w:tblPr>
-        <w:tblStyle w:val="LightGrid-Accent1"/>
-        <w:tblW w:type="auto" w:w="0"/>
-        <w:jc w:val="center"/>
-        <w:tblLook w:firstColumn="1" w:firstRow="1" w:lastColumn="0" w:lastRow="0" w:noHBand="0" w:noVBand="1" w:val="04A0"/>
-      </w:tblPr>
-      <w:tblGrid>
-        <w:gridCol w:w="2436"/>
-        <w:gridCol w:w="2436"/>
-        <w:gridCol w:w="2436"/>
-        <w:gridCol w:w="2436"/>
-      </w:tblGrid>
-      <w:tr>
-        <w:tc>
-          <w:tcPr>
-            <w:tcW w:type="dxa" w:w="1417"/>
-          </w:tcPr>
-          <w:p>
-            <w:r/>
-            <w:r>
-              <w:rPr>
-                <w:b/>
-                <w:sz w:val="18"/>
-              </w:rPr>
-              <w:t>Benchmark</w:t>
-            </w:r>
-          </w:p>
-        </w:tc>
-        <w:tc>
-          <w:tcPr>
-            <w:tcW w:type="dxa" w:w="1247"/>
-          </w:tcPr>
-          <w:p>
-            <w:r/>
-            <w:r>
-              <w:rPr>
-                <w:b/>
-                <w:sz w:val="18"/>
-              </w:rPr>
-              <w:t>Trapped / 20</w:t>
-            </w:r>
-          </w:p>
-        </w:tc>
-        <w:tc>
-          <w:tcPr>
-            <w:tcW w:type="dxa" w:w="5386"/>
-          </w:tcPr>
-          <w:p>
-            <w:r/>
-            <w:r>
-              <w:rPr>
-                <w:b/>
-                <w:sz w:val="18"/>
-              </w:rPr>
-              <w:t>What a trapped campaign looks like</w:t>
-            </w:r>
-          </w:p>
-        </w:tc>
-        <w:tc>
-          <w:tcPr>
-            <w:tcW w:type="dxa" w:w="1417"/>
-          </w:tcPr>
-          <w:p>
-            <w:r/>
-            <w:r>
-              <w:rPr>
-                <w:b/>
-                <w:sz w:val="18"/>
-              </w:rPr>
-              <w:t>First alert (median)</w:t>
-            </w:r>
-          </w:p>
-        </w:tc>
-      </w:tr>
-      <w:tr>
-        <w:tc>
-          <w:tcPr>
             <w:tcW w:type="dxa" w:w="1417"/>
           </w:tcPr>
           <w:p>
@@ -1128,189 +777,7 @@
               <w:rPr>
                 <w:sz w:val="18"/>
               </w:rPr>
-              <w:t>Suzuki II</w:t>
-            </w:r>
-          </w:p>
-        </w:tc>
-        <w:tc>
-          <w:tcPr>
-            <w:tcW w:type="dxa" w:w="1247"/>
-          </w:tcPr>
-          <w:p>
-            <w:pPr>
-              <w:jc w:val="right"/>
-            </w:pPr>
-            <w:r/>
-            <w:r>
-              <w:rPr>
-                <w:b/>
-                <w:color w:val="E0672F"/>
-                <w:sz w:val="18"/>
-              </w:rPr>
-              <w:t>13</w:t>
-            </w:r>
-          </w:p>
-        </w:tc>
-        <w:tc>
-          <w:tcPr>
-            <w:tcW w:type="dxa" w:w="5386"/>
-          </w:tcPr>
-          <w:p>
-            <w:r/>
-            <w:r>
-              <w:rPr>
-                <w:sz w:val="18"/>
-              </w:rPr>
-              <w:t>PCy3 was drawn in the initial design at 0 % yield (low T) in every trapped campaign; the optimiser never returns to it and settles on XPhos or RuPhos</w:t>
-            </w:r>
-          </w:p>
-        </w:tc>
-        <w:tc>
-          <w:tcPr>
-            <w:tcW w:type="dxa" w:w="1417"/>
-          </w:tcPr>
-          <w:p>
-            <w:pPr>
-              <w:jc w:val="right"/>
-            </w:pPr>
-            <w:r/>
-            <w:r>
-              <w:rPr>
-                <w:sz w:val="18"/>
-              </w:rPr>
-              <w:t>22</w:t>
-            </w:r>
-          </w:p>
-        </w:tc>
-      </w:tr>
-      <w:tr>
-        <w:tc>
-          <w:tcPr>
-            <w:tcW w:type="dxa" w:w="1417"/>
-          </w:tcPr>
-          <w:p>
-            <w:r/>
-            <w:r>
-              <w:rPr>
-                <w:sz w:val="18"/>
-              </w:rPr>
-              <w:t>Suzuki I</w:t>
-            </w:r>
-          </w:p>
-        </w:tc>
-        <w:tc>
-          <w:tcPr>
-            <w:tcW w:type="dxa" w:w="1247"/>
-          </w:tcPr>
-          <w:p>
-            <w:pPr>
-              <w:jc w:val="right"/>
-            </w:pPr>
-            <w:r/>
-            <w:r>
-              <w:rPr>
-                <w:b/>
-                <w:color w:val="E0672F"/>
-                <w:sz w:val="18"/>
-              </w:rPr>
-              <w:t>5</w:t>
-            </w:r>
-          </w:p>
-        </w:tc>
-        <w:tc>
-          <w:tcPr>
-            <w:tcW w:type="dxa" w:w="5386"/>
-          </w:tcPr>
-          <w:p>
-            <w:r/>
-            <w:r>
-              <w:rPr>
-                <w:sz w:val="18"/>
-              </w:rPr>
-              <w:t>Xantphos dismissed for the same reason, but usually rediscovered late (experiment 27–35): a good catalyst found too late, not a wrong one</w:t>
-            </w:r>
-          </w:p>
-        </w:tc>
-        <w:tc>
-          <w:tcPr>
-            <w:tcW w:type="dxa" w:w="1417"/>
-          </w:tcPr>
-          <w:p>
-            <w:pPr>
-              <w:jc w:val="right"/>
-            </w:pPr>
-            <w:r/>
-            <w:r>
-              <w:rPr>
-                <w:sz w:val="18"/>
-              </w:rPr>
-              <w:t>23</w:t>
-            </w:r>
-          </w:p>
-        </w:tc>
-      </w:tr>
-      <w:tr>
-        <w:tc>
-          <w:tcPr>
-            <w:tcW w:type="dxa" w:w="1417"/>
-          </w:tcPr>
-          <w:p>
-            <w:r/>
-            <w:r>
-              <w:rPr>
-                <w:sz w:val="18"/>
-              </w:rPr>
-              <w:t>Arylation</w:t>
-            </w:r>
-          </w:p>
-        </w:tc>
-        <w:tc>
-          <w:tcPr>
-            <w:tcW w:type="dxa" w:w="1247"/>
-          </w:tcPr>
-          <w:p>
-            <w:pPr>
-              <w:jc w:val="right"/>
-            </w:pPr>
-            <w:r/>
-            <w:r>
-              <w:rPr>
-                <w:b/>
-                <w:color w:val="E0672F"/>
-                <w:sz w:val="18"/>
-              </w:rPr>
-              <w:t>10</w:t>
-            </w:r>
-          </w:p>
-        </w:tc>
-        <w:tc>
-          <w:tcPr>
-            <w:tcW w:type="dxa" w:w="5386"/>
-          </w:tcPr>
-          <w:p>
-            <w:r/>
-            <w:r>
-              <w:rPr>
-                <w:sz w:val="18"/>
-              </w:rPr>
-              <w:t>a good yield in the initial design (e.g. 77 % on CgMe-PPh) then a flat plateau while the optimiser sweeps tied candidates; most “failures” sit at 86–89 %</w:t>
-            </w:r>
-          </w:p>
-        </w:tc>
-        <w:tc>
-          <w:tcPr>
-            <w:tcW w:type="dxa" w:w="1417"/>
-          </w:tcPr>
-          <w:p>
-            <w:pPr>
-              <w:jc w:val="right"/>
-            </w:pPr>
-            <w:r/>
-            <w:r>
-              <w:rPr>
-                <w:sz w:val="18"/>
-              </w:rPr>
-              <w:t>18</w:t>
+              <w:t>measured, single runs</w:t>
             </w:r>
           </w:p>
         </w:tc>
@@ -1318,8 +785,77 @@
     </w:tbl>
     <w:p>
       <w:pPr>
-        <w:spacing w:after="40"/>
+        <w:spacing w:after="0"/>
       </w:pPr>
+    </w:p>
+    <w:p>
+      <w:pPr>
+        <w:spacing w:after="120"/>
+      </w:pPr>
+      <w:r>
+        <w:t xml:space="preserve">Two facts that shape the reading: Summit's independent emulators put the Suzuki front on the </w:t>
+      </w:r>
+      <w:r>
+        <w:rPr>
+          <w:b/>
+        </w:rPr>
+        <w:t>same catalyst</w:t>
+      </w:r>
+      <w:r>
+        <w:t xml:space="preserve"> as Olympus in all four cases (PCy3 for case II, as in the paper); and the arylation has </w:t>
+      </w:r>
+      <w:r>
+        <w:rPr>
+          <w:b/>
+        </w:rPr>
+        <w:t>tied acquisition values</w:t>
+      </w:r>
+      <w:r>
+        <w:t xml:space="preserve"> (175 of 1,698 candidates at experiment 30), so an unaided campaign ends as an alphabetical sweep. Suzuki has no ties.</w:t>
+      </w:r>
+    </w:p>
+    <w:p>
+      <w:pPr>
+        <w:pStyle w:val="Heading1"/>
+      </w:pPr>
+      <w:r>
+        <w:t>3 · Plain BO fails often enough to study</w:t>
+      </w:r>
+    </w:p>
+    <w:p>
+      <w:pPr>
+        <w:spacing w:after="120"/>
+      </w:pPr>
+      <w:r>
+        <w:t xml:space="preserve">Twenty replayable controls per benchmark (10 LHS + 30 qLogNEHVI steps). Trapped, i.e. below 90 % of the front: </w:t>
+      </w:r>
+      <w:r>
+        <w:rPr>
+          <w:b/>
+        </w:rPr>
+        <w:t>13/20 on Suzuki II</w:t>
+      </w:r>
+      <w:r>
+        <w:t xml:space="preserve"> (PCy3 drawn at 0 % yield in the initial design, never revisited), </w:t>
+      </w:r>
+      <w:r>
+        <w:rPr>
+          <w:b/>
+        </w:rPr>
+        <w:t>5/20 on Suzuki I</w:t>
+      </w:r>
+      <w:r>
+        <w:t xml:space="preserve"> (Xantphos dismissed the same way, usually rediscovered too late), </w:t>
+      </w:r>
+      <w:r>
+        <w:rPr>
+          <w:b/>
+        </w:rPr>
+        <w:t>10/20 on the arylation</w:t>
+      </w:r>
+      <w:r>
+        <w:t xml:space="preserve"> (an early good yield, then a plateau).</w:t>
+      </w:r>
     </w:p>
     <w:p>
       <w:pPr>
@@ -1362,79 +898,14 @@
     </w:p>
     <w:p>
       <w:pPr>
-        <w:spacing w:after="200"/>
+        <w:spacing w:after="160"/>
       </w:pPr>
-      <w:r>
-        <w:rPr>
-          <w:b/>
-          <w:sz w:val="18"/>
-        </w:rPr>
-        <w:t xml:space="preserve">Suzuki case II, the 20 controls. </w:t>
-      </w:r>
       <w:r>
         <w:rPr>
           <w:color w:val="5A6876"/>
           <w:sz w:val="18"/>
         </w:rPr>
-        <w:t>Hypervolume as a fraction of the global front; orange campaigns end below 90 %; the grey band is the initial design; red dashes are the alerts of the frozen trigger. Thirteen campaigns trap on a catalyst that is not PCy3. Seed 12 (alert at 16, ends at 44 %) is the one assigned to the chemists.</w:t>
-      </w:r>
-    </w:p>
-    <w:p>
-      <w:pPr>
-        <w:jc w:val="center"/>
-      </w:pPr>
-      <w:r>
-        <w:drawing>
-          <wp:inline xmlns:a="http://schemas.openxmlformats.org/drawingml/2006/main" xmlns:pic="http://schemas.openxmlformats.org/drawingml/2006/picture">
-            <wp:extent cx="5940000" cy="3768828"/>
-            <wp:docPr id="3" name="Picture 3"/>
-            <wp:cNvGraphicFramePr>
-              <a:graphicFrameLocks noChangeAspect="1"/>
-            </wp:cNvGraphicFramePr>
-            <a:graphic>
-              <a:graphicData uri="http://schemas.openxmlformats.org/drawingml/2006/picture">
-                <pic:pic>
-                  <pic:nvPicPr>
-                    <pic:cNvPr id="0" name="seed_choice_i.png"/>
-                    <pic:cNvPicPr/>
-                  </pic:nvPicPr>
-                  <pic:blipFill>
-                    <a:blip r:embed="rId11"/>
-                    <a:stretch>
-                      <a:fillRect/>
-                    </a:stretch>
-                  </pic:blipFill>
-                  <pic:spPr>
-                    <a:xfrm>
-                      <a:off x="0" y="0"/>
-                      <a:ext cx="5940000" cy="3768828"/>
-                    </a:xfrm>
-                    <a:prstGeom prst="rect"/>
-                  </pic:spPr>
-                </pic:pic>
-              </a:graphicData>
-            </a:graphic>
-          </wp:inline>
-        </w:drawing>
-      </w:r>
-    </w:p>
-    <w:p>
-      <w:pPr>
-        <w:spacing w:after="200"/>
-      </w:pPr>
-      <w:r>
-        <w:rPr>
-          <w:b/>
-          <w:sz w:val="18"/>
-        </w:rPr>
-        <w:t xml:space="preserve">Suzuki case I, the 20 controls. </w:t>
-      </w:r>
-      <w:r>
-        <w:rPr>
-          <w:color w:val="5A6876"/>
-          <w:sz w:val="18"/>
-        </w:rPr>
-        <w:t>Five trapped. Seed 8 (assigned) drew Xantphos once, at 40 °C, for 0 % yield; the optimiser only came back to it at experiment 27 and ran out of budget while climbing to 87 % yield. Its alert fires at 20, seven experiments before that rediscovery.</w:t>
+        <w:t>Suzuki II, 20 controls: fraction of the front (orange &lt; 90 %), initial design in grey, trigger alerts in red. Seed 12 is assigned to the chemists.</w:t>
       </w:r>
     </w:p>
     <w:p>
@@ -1442,7 +913,7 @@
         <w:pStyle w:val="Heading1"/>
       </w:pPr>
       <w:r>
-        <w:t>3 · The trigger, frozen</w:t>
+        <w:t>4 · The trigger, frozen</w:t>
       </w:r>
     </w:p>
     <w:p>
@@ -1451,9 +922,47 @@
       </w:pPr>
       <w:r>
         <w:rPr>
-          <w:i w:val="0"/>
+          <w:b/>
         </w:rPr>
-        <w:t>The alert is the owner's original signal with its denominator corrected — recent pace against the campaign's own average pace, both per experiment:</w:t>
+        <w:t>P\* = recent pace / average pace</w:t>
+      </w:r>
+      <w:r>
+        <w:t xml:space="preserve"> (both per experiment), </w:t>
+      </w:r>
+      <w:r>
+        <w:rPr>
+          <w:b/>
+        </w:rPr>
+        <w:t>W = 5, threshold 0.30, cooldown 5, first alert at experiment 15</w:t>
+      </w:r>
+      <w:r>
+        <w:t>, no deadline. P</w:t>
+      </w:r>
+      <w:r>
+        <w:rPr>
+          <w:i/>
+        </w:rPr>
+        <w:t xml:space="preserve"> replaces the original ratio because its threshold does not depend on the budget: P</w:t>
+      </w:r>
+      <w:r>
+        <w:t xml:space="preserve"> is 1 under steady progress at any budget. On 18 case II campaigns it alerts 13 of 13 failures, first alert at 22.6 with 26 % of the final gain still to come, 2.5 solicitations each; the only campaign never interrupted reaches 100 %. It also fires on healthy campaigns: it books an appointment, the chemist diagnoses — hence the three answers </w:t>
+      </w:r>
+      <w:r>
+        <w:rPr>
+          <w:i/>
+        </w:rPr>
+        <w:t>continue / propose / stop</w:t>
+      </w:r>
+      <w:r>
+        <w:t>.</w:t>
+      </w:r>
+    </w:p>
+    <w:p>
+      <w:pPr>
+        <w:pStyle w:val="Heading1"/>
+      </w:pPr>
+      <w:r>
+        <w:t>5 · Reproducibility</w:t>
       </w:r>
     </w:p>
     <w:p>
@@ -1461,206 +970,26 @@
         <w:spacing w:after="120"/>
       </w:pPr>
       <w:r>
-        <w:rPr>
-          <w:rFonts w:ascii="Consolas" w:hAnsi="Consolas"/>
-          <w:sz w:val="19"/>
-        </w:rPr>
-        <w:t>P* = (gain over the last W experiments / W) / (gain since the initial design / experiments since)</w:t>
-        <w:br/>
-        <w:t>W = 5   threshold 0.30   cooldown 5   earliest alert: experiment 15 (= 10 + max(5 BO experiments, W))   no deadline</w:t>
+        <w:t xml:space="preserve">Identical runs diverged from experiment 26: REACTO built the BoFire strategy </w:t>
       </w:r>
-    </w:p>
-    <w:p>
-      <w:pPr>
-        <w:spacing w:after="120"/>
-      </w:pPr>
-      <w:r>
-        <w:rPr>
-          <w:i w:val="0"/>
-        </w:rPr>
-        <w:t>Why P* rather than P: under perfectly steady progress the original ratio decays like W/(t − n_init) whatever the campaign does, so its threshold silently encodes a firing time (0.10 fires at experiment 40 of a flawless campaign at budget 40, from experiment 40 onwards at budget 100). P* equals 1 under steady progress at any budget, so “0.30” means what it says. On the campaigns we hold the two are indistinguishable in detection; the threshold's portability decided it.</w:t>
-      </w:r>
-    </w:p>
-    <w:p>
-      <w:pPr>
-        <w:spacing w:after="120"/>
-      </w:pPr>
-      <w:r>
-        <w:rPr>
-          <w:i w:val="0"/>
-        </w:rPr>
-        <w:t>The pair (W, threshold) was chosen together, by measurement: at W = 5 a threshold of 0.10 leaves four campaigns silent, two of them failures; 0.30 alerts 13 of 13 failed case II campaigns at 2.5 solicitations each, first alert at 22.6 with 26 % of the final gain still to come — and the one campaign never interrupted is the one that reaches 100 %. W = 3 / 0.10 detects three experiments earlier (35 % of the gain left) at 3.1 solicitations; W = 5 was adopted for the load on five chemists. Cooldown 3 or 5 changes nothing to the first alert, only how often the chemist is disturbed afterwards.</w:t>
-      </w:r>
-    </w:p>
-    <w:p>
-      <w:pPr>
-        <w:jc w:val="center"/>
-      </w:pPr>
-      <w:r>
-        <w:drawing>
-          <wp:inline xmlns:a="http://schemas.openxmlformats.org/drawingml/2006/main" xmlns:pic="http://schemas.openxmlformats.org/drawingml/2006/picture">
-            <wp:extent cx="5940000" cy="3443834"/>
-            <wp:docPr id="4" name="Picture 4"/>
-            <wp:cNvGraphicFramePr>
-              <a:graphicFrameLocks noChangeAspect="1"/>
-            </wp:cNvGraphicFramePr>
-            <a:graphic>
-              <a:graphicData uri="http://schemas.openxmlformats.org/drawingml/2006/picture">
-                <pic:pic>
-                  <pic:nvPicPr>
-                    <pic:cNvPr id="0" name="firings_ii_pace_ratio_W5_cd5_s030.png"/>
-                    <pic:cNvPicPr/>
-                  </pic:nvPicPr>
-                  <pic:blipFill>
-                    <a:blip r:embed="rId12"/>
-                    <a:stretch>
-                      <a:fillRect/>
-                    </a:stretch>
-                  </pic:blipFill>
-                  <pic:spPr>
-                    <a:xfrm>
-                      <a:off x="0" y="0"/>
-                      <a:ext cx="5940000" cy="3443834"/>
-                    </a:xfrm>
-                    <a:prstGeom prst="rect"/>
-                  </pic:spPr>
-                </pic:pic>
-              </a:graphicData>
-            </a:graphic>
-          </wp:inline>
-        </w:drawing>
-      </w:r>
-    </w:p>
-    <w:p>
-      <w:pPr>
-        <w:spacing w:after="200"/>
-      </w:pPr>
       <w:r>
         <w:rPr>
           <w:b/>
-          <w:sz w:val="18"/>
         </w:rPr>
-        <w:t xml:space="preserve">P* on 18 case II campaigns </w:t>
+        <w:t>without a seed</w:t>
       </w:r>
       <w:r>
-        <w:rPr>
-          <w:color w:val="5A6876"/>
-          <w:sz w:val="18"/>
-        </w:rPr>
-        <w:t>(the pre-fix set, used for tuning). Top rows: fraction of the front, blue ≥ 90 %, orange below. Bottom rows: P* against the 0.30 threshold, red where below; ▼ marks an alert, the first one enlarged. The trigger also fires on healthy campaigns (seed 06 at 94 %): it books an appointment, it does not diagnose — that is the chemist's job, and the reason the third answer “stop” exists.</w:t>
-      </w:r>
-    </w:p>
-    <w:tbl>
-      <w:tblPr>
-        <w:tblW w:type="auto" w:w="0"/>
-        <w:jc w:val="center"/>
-        <w:tblLook w:firstColumn="1" w:firstRow="1" w:lastColumn="0" w:lastRow="0" w:noHBand="0" w:noVBand="1" w:val="04A0"/>
-      </w:tblPr>
-      <w:tblGrid>
-        <w:gridCol w:w="9746"/>
-      </w:tblGrid>
-      <w:tr>
-        <w:tc>
-          <w:tcPr>
-            <w:tcW w:type="dxa" w:w="9746"/>
-            <w:shd w:val="clear" w:color="auto" w:fill="E9F3F7"/>
-          </w:tcPr>
-          <w:p>
-            <w:r/>
-            <w:r>
-              <w:rPr>
-                <w:b/>
-                <w:sz w:val="20"/>
-              </w:rPr>
-              <w:t xml:space="preserve">What the chemist sees at an alert. </w:t>
-            </w:r>
-            <w:r>
-              <w:rPr>
-                <w:sz w:val="20"/>
-              </w:rPr>
-              <w:t>The campaign pauses. Three answers: let the optimiser continue (its next proposal is shown), propose the next experiment yourself, or stop the campaign. Each answer is recorded with its moment, P*, the optimiser's proposal, and a free-text justification.</w:t>
-            </w:r>
-          </w:p>
-        </w:tc>
-      </w:tr>
-    </w:tbl>
-    <w:p>
-      <w:pPr>
-        <w:spacing w:after="40"/>
-      </w:pPr>
-    </w:p>
-    <w:p>
-      <w:pPr>
-        <w:pStyle w:val="Heading1"/>
-      </w:pPr>
-      <w:r>
-        <w:t>4 · Reproducibility, which blocked everything</w:t>
-      </w:r>
-    </w:p>
-    <w:p>
-      <w:pPr>
-        <w:spacing w:after="120"/>
-      </w:pPr>
-      <w:r>
-        <w:t xml:space="preserve">Two identical runs of one campaign diverged from experiment 26. Cause: REACTO built the BoFire </w:t>
+        <w:t xml:space="preserve">, and BoFire then draws one from OS entropy at every acquisition step. </w:t>
       </w:r>
       <w:r>
         <w:rPr>
           <w:rFonts w:ascii="Consolas" w:hAnsi="Consolas"/>
           <w:sz w:val="19"/>
         </w:rPr>
-        <w:t>MoboStrategy</w:t>
+        <w:t>bayesian_optimization(..., seed=)</w:t>
       </w:r>
       <w:r>
-        <w:t xml:space="preserve"> without a seed, and BoFire then draws one from </w:t>
-      </w:r>
-      <w:r>
-        <w:rPr>
-          <w:rFonts w:ascii="Consolas" w:hAnsi="Consolas"/>
-          <w:sz w:val="19"/>
-        </w:rPr>
-        <w:t>np.random.SeedSequence()</w:t>
-      </w:r>
-      <w:r>
-        <w:t xml:space="preserve"> — operating-system entropy, unreachable by </w:t>
-      </w:r>
-      <w:r>
-        <w:rPr>
-          <w:rFonts w:ascii="Consolas" w:hAnsi="Consolas"/>
-          <w:sz w:val="19"/>
-        </w:rPr>
-        <w:t>torch.manual_seed</w:t>
-      </w:r>
-      <w:r>
-        <w:t xml:space="preserve"> or </w:t>
-      </w:r>
-      <w:r>
-        <w:rPr>
-          <w:rFonts w:ascii="Consolas" w:hAnsi="Consolas"/>
-          <w:sz w:val="19"/>
-        </w:rPr>
-        <w:t>np.random.seed</w:t>
-      </w:r>
-      <w:r>
-        <w:t xml:space="preserve"> — at every one of the thirty acquisition steps. Where two candidates were nearly tied, the argmax flipped.</w:t>
-      </w:r>
-    </w:p>
-    <w:p>
-      <w:pPr>
-        <w:spacing w:after="120"/>
-      </w:pPr>
-      <w:r>
-        <w:t xml:space="preserve">Fix: </w:t>
-      </w:r>
-      <w:r>
-        <w:rPr>
-          <w:rFonts w:ascii="Consolas" w:hAnsi="Consolas"/>
-          <w:sz w:val="19"/>
-        </w:rPr>
-        <w:t>bayesian_optimization(..., seed=None)</w:t>
-      </w:r>
-      <w:r>
-        <w:t xml:space="preserve"> now passes a seed to the strategy when given (the application is unchanged bit for bit when it is not). The bench derives it arithmetically from the campaign seed and the iteration, </w:t>
+        <w:t xml:space="preserve"> now passes one (the application is unchanged when it is not given); the bench uses </w:t>
       </w:r>
       <w:r>
         <w:rPr>
@@ -1670,7 +999,7 @@
         <w:t>100000 + 1000·seed + iteration</w:t>
       </w:r>
       <w:r>
-        <w:t>, so it can be recovered by hand from a log. Verified: two runs coincide on all 40 experiments and to the twelfth decimal on the area under the curve; a fork without intervention reproduces its parent exactly at branch points 15, 22 and 30. The 51 earlier campaigns stay valid as independent samples but cannot serve as controls; everything below was recomputed.</w:t>
+        <w:t>. Verified to twelve decimals; a fork without intervention reproduces its parent exactly. Everything was recomputed.</w:t>
       </w:r>
     </w:p>
     <w:p>
@@ -1678,7 +1007,7 @@
         <w:pStyle w:val="Heading1"/>
       </w:pPr>
       <w:r>
-        <w:t>5 · The random-intervention arm: the null model, measured</w:t>
+        <w:t>6 · The random arm: the null model</w:t>
       </w:r>
     </w:p>
     <w:p>
@@ -1686,289 +1015,25 @@
         <w:spacing w:after="120"/>
       </w:pPr>
       <w:r>
-        <w:rPr>
-          <w:i w:val="0"/>
-        </w:rPr>
-        <w:t>Design, as agreed: three arms sharing their history up to the alert — plain BO (control), a random untested grid point injected at every alert (the null), a chemist's point at every alert (the human study). The injected point replaces the optimiser's proposal, so every arm spends exactly 40 experiments; alerts are recomputed on the branch after each injection; each control is branched several times with different draws.</w:t>
+        <w:t xml:space="preserve">Three arms share their history up to the alert: plain BO, a </w:t>
       </w:r>
-    </w:p>
-    <w:tbl>
-      <w:tblPr>
-        <w:tblStyle w:val="LightGrid-Accent1"/>
-        <w:tblW w:type="auto" w:w="0"/>
-        <w:jc w:val="center"/>
-        <w:tblLook w:firstColumn="1" w:firstRow="1" w:lastColumn="0" w:lastRow="0" w:noHBand="0" w:noVBand="1" w:val="04A0"/>
-      </w:tblPr>
-      <w:tblGrid>
-        <w:gridCol w:w="1949"/>
-        <w:gridCol w:w="1949"/>
-        <w:gridCol w:w="1949"/>
-        <w:gridCol w:w="1949"/>
-        <w:gridCol w:w="1949"/>
-      </w:tblGrid>
-      <w:tr>
-        <w:tc>
-          <w:tcPr>
-            <w:tcW w:type="dxa" w:w="2551"/>
-          </w:tcPr>
-          <w:p>
-            <w:r/>
-            <w:r>
-              <w:rPr>
-                <w:b/>
-                <w:sz w:val="18"/>
-              </w:rPr>
-              <w:t>C–H arylation</w:t>
-            </w:r>
-          </w:p>
-        </w:tc>
-        <w:tc>
-          <w:tcPr>
-            <w:tcW w:type="dxa" w:w="2268"/>
-          </w:tcPr>
-          <w:p>
-            <w:r/>
-            <w:r>
-              <w:rPr>
-                <w:b/>
-                <w:sz w:val="18"/>
-              </w:rPr>
-              <w:t>Campaigns</w:t>
-            </w:r>
-          </w:p>
-        </w:tc>
-        <w:tc>
-          <w:tcPr>
-            <w:tcW w:type="dxa" w:w="1701"/>
-          </w:tcPr>
-          <w:p>
-            <w:r/>
-            <w:r>
-              <w:rPr>
-                <w:b/>
-                <w:sz w:val="18"/>
-              </w:rPr>
-              <w:t>Mean fraction of the front</w:t>
-            </w:r>
-          </w:p>
-        </w:tc>
-        <w:tc>
-          <w:tcPr>
-            <w:tcW w:type="dxa" w:w="1417"/>
-          </w:tcPr>
-          <w:p>
-            <w:r/>
-            <w:r>
-              <w:rPr>
-                <w:b/>
-                <w:sz w:val="18"/>
-              </w:rPr>
-              <w:t>Reach 90 %</w:t>
-            </w:r>
-          </w:p>
-        </w:tc>
-        <w:tc>
-          <w:tcPr>
-            <w:tcW w:type="dxa" w:w="1701"/>
-          </w:tcPr>
-          <w:p>
-            <w:r/>
-            <w:r>
-              <w:rPr>
-                <w:b/>
-                <w:sz w:val="18"/>
-              </w:rPr>
-              <w:t>Experiments to 90 % (reachers)</w:t>
-            </w:r>
-          </w:p>
-        </w:tc>
-      </w:tr>
-      <w:tr>
-        <w:tc>
-          <w:tcPr>
-            <w:tcW w:type="dxa" w:w="2551"/>
-          </w:tcPr>
-          <w:p>
-            <w:r/>
-            <w:r>
-              <w:rPr>
-                <w:sz w:val="18"/>
-              </w:rPr>
-              <w:t>Plain BO</w:t>
-            </w:r>
-          </w:p>
-        </w:tc>
-        <w:tc>
-          <w:tcPr>
-            <w:tcW w:type="dxa" w:w="2268"/>
-          </w:tcPr>
-          <w:p>
-            <w:pPr>
-              <w:jc w:val="right"/>
-            </w:pPr>
-            <w:r/>
-            <w:r>
-              <w:rPr>
-                <w:sz w:val="18"/>
-              </w:rPr>
-              <w:t>20</w:t>
-            </w:r>
-          </w:p>
-        </w:tc>
-        <w:tc>
-          <w:tcPr>
-            <w:tcW w:type="dxa" w:w="1701"/>
-          </w:tcPr>
-          <w:p>
-            <w:pPr>
-              <w:jc w:val="right"/>
-            </w:pPr>
-            <w:r/>
-            <w:r>
-              <w:rPr>
-                <w:sz w:val="18"/>
-              </w:rPr>
-              <w:t>0.888</w:t>
-            </w:r>
-          </w:p>
-        </w:tc>
-        <w:tc>
-          <w:tcPr>
-            <w:tcW w:type="dxa" w:w="1417"/>
-          </w:tcPr>
-          <w:p>
-            <w:pPr>
-              <w:jc w:val="right"/>
-            </w:pPr>
-            <w:r/>
-            <w:r>
-              <w:rPr>
-                <w:sz w:val="18"/>
-              </w:rPr>
-              <w:t>10 (50 %)</w:t>
-            </w:r>
-          </w:p>
-        </w:tc>
-        <w:tc>
-          <w:tcPr>
-            <w:tcW w:type="dxa" w:w="1701"/>
-          </w:tcPr>
-          <w:p>
-            <w:pPr>
-              <w:jc w:val="right"/>
-            </w:pPr>
-            <w:r/>
-            <w:r>
-              <w:rPr>
-                <w:sz w:val="18"/>
-              </w:rPr>
-              <w:t>26.2</w:t>
-            </w:r>
-          </w:p>
-        </w:tc>
-      </w:tr>
-      <w:tr>
-        <w:tc>
-          <w:tcPr>
-            <w:tcW w:type="dxa" w:w="2551"/>
-          </w:tcPr>
-          <w:p>
-            <w:r/>
-            <w:r>
-              <w:rPr>
-                <w:sz w:val="18"/>
-              </w:rPr>
-              <w:t>+ random point at every alert</w:t>
-            </w:r>
-          </w:p>
-        </w:tc>
-        <w:tc>
-          <w:tcPr>
-            <w:tcW w:type="dxa" w:w="2268"/>
-          </w:tcPr>
-          <w:p>
-            <w:pPr>
-              <w:jc w:val="right"/>
-            </w:pPr>
-            <w:r/>
-            <w:r>
-              <w:rPr>
-                <w:sz w:val="18"/>
-              </w:rPr>
-              <w:t>40 branches, 130 interventions</w:t>
-            </w:r>
-          </w:p>
-        </w:tc>
-        <w:tc>
-          <w:tcPr>
-            <w:tcW w:type="dxa" w:w="1701"/>
-          </w:tcPr>
-          <w:p>
-            <w:pPr>
-              <w:jc w:val="right"/>
-            </w:pPr>
-            <w:r/>
-            <w:r>
-              <w:rPr>
-                <w:sz w:val="18"/>
-              </w:rPr>
-              <w:t>0.901</w:t>
-            </w:r>
-          </w:p>
-        </w:tc>
-        <w:tc>
-          <w:tcPr>
-            <w:tcW w:type="dxa" w:w="1417"/>
-          </w:tcPr>
-          <w:p>
-            <w:pPr>
-              <w:jc w:val="right"/>
-            </w:pPr>
-            <w:r/>
-            <w:r>
-              <w:rPr>
-                <w:sz w:val="18"/>
-              </w:rPr>
-              <w:t>26 (65 %)</w:t>
-            </w:r>
-          </w:p>
-        </w:tc>
-        <w:tc>
-          <w:tcPr>
-            <w:tcW w:type="dxa" w:w="1701"/>
-          </w:tcPr>
-          <w:p>
-            <w:pPr>
-              <w:jc w:val="right"/>
-            </w:pPr>
-            <w:r/>
-            <w:r>
-              <w:rPr>
-                <w:sz w:val="18"/>
-              </w:rPr>
-              <w:t>26.4</w:t>
-            </w:r>
-          </w:p>
-        </w:tc>
-      </w:tr>
-    </w:tbl>
-    <w:p>
-      <w:pPr>
-        <w:spacing w:after="40"/>
-      </w:pPr>
-    </w:p>
-    <w:p>
-      <w:pPr>
-        <w:spacing w:after="120"/>
-      </w:pPr>
       <w:r>
         <w:rPr>
           <w:b/>
         </w:rPr>
-        <w:t xml:space="preserve">Paired gain +1.3 points of the front; 18 of 40 branches improve, Wilson 95 % [31 %, 60 %]; range −26.7 to +23.1. </w:t>
+        <w:t>random</w:t>
       </w:r>
       <w:r>
-        <w:t>A random point at the alerts moves a campaign a lot, in both directions, and on average almost not at all. That is the good outcome for the study: if the chemists beat this, it is expertise, not the effect of an exploratory shake. The little gain there is comes from luck on the catalyst: 25 of the 130 injected points carried a front ligand (19 %) and those gained +3.2 versus +0.9 — the quantity a chemist, who does not pick a ligand at random, has to beat.</w:t>
+        <w:t xml:space="preserve"> grid point at every alert, a chemist's point. The injected point replaces the proposal (40 experiments in every arm). On the arylation, 20 controls and 40 branches (130 interventions): </w:t>
+      </w:r>
+      <w:r>
+        <w:rPr>
+          <w:b/>
+        </w:rPr>
+        <w:t>paired gain +1.3 points; 18/40 branches improve, Wilson 95 % [31 %, 60 %]; range −27 to +23; no effect on time to 90 %</w:t>
+      </w:r>
+      <w:r>
+        <w:t xml:space="preserve"> (26.2 vs 26.4). The little gain comes from luck on the ligand: 19 % of injected points hit a front ligand and gained +3.2 vs +0.9.</w:t>
       </w:r>
     </w:p>
     <w:p>
@@ -1979,7 +1044,7 @@
         <w:drawing>
           <wp:inline xmlns:a="http://schemas.openxmlformats.org/drawingml/2006/main" xmlns:pic="http://schemas.openxmlformats.org/drawingml/2006/picture">
             <wp:extent cx="5940000" cy="1408360"/>
-            <wp:docPr id="5" name="Picture 5"/>
+            <wp:docPr id="3" name="Picture 3"/>
             <wp:cNvGraphicFramePr>
               <a:graphicFrameLocks noChangeAspect="1"/>
             </wp:cNvGraphicFramePr>
@@ -1991,7 +1056,7 @@
                     <pic:cNvPicPr/>
                   </pic:nvPicPr>
                   <pic:blipFill>
-                    <a:blip r:embed="rId13"/>
+                    <a:blip r:embed="rId11"/>
                     <a:stretch>
                       <a:fillRect/>
                     </a:stretch>
@@ -2012,22 +1077,8 @@
     </w:p>
     <w:p>
       <w:pPr>
-        <w:spacing w:after="200"/>
+        <w:spacing w:after="160"/>
       </w:pPr>
-      <w:r>
-        <w:rPr>
-          <w:b/>
-          <w:sz w:val="18"/>
-        </w:rPr>
-        <w:t xml:space="preserve">Five arylation campaigns at outcome quantiles. </w:t>
-      </w:r>
-      <w:r>
-        <w:rPr>
-          <w:color w:val="5A6876"/>
-          <w:sz w:val="18"/>
-        </w:rPr>
-        <w:t>Blue: plain BO; red: the same campaign with a random point at each alert (▼). Campaign 11 is the exception that shows what an intervention can do; the other four show what it usually does.</w:t>
-      </w:r>
     </w:p>
     <w:p>
       <w:pPr>
@@ -2036,8 +1087,8 @@
       <w:r>
         <w:drawing>
           <wp:inline xmlns:a="http://schemas.openxmlformats.org/drawingml/2006/main" xmlns:pic="http://schemas.openxmlformats.org/drawingml/2006/picture">
-            <wp:extent cx="5040000" cy="1904000"/>
-            <wp:docPr id="6" name="Picture 6"/>
+            <wp:extent cx="4320000" cy="1632000"/>
+            <wp:docPr id="4" name="Picture 4"/>
             <wp:cNvGraphicFramePr>
               <a:graphicFrameLocks noChangeAspect="1"/>
             </wp:cNvGraphicFramePr>
@@ -2049,7 +1100,7 @@
                     <pic:cNvPicPr/>
                   </pic:nvPicPr>
                   <pic:blipFill>
-                    <a:blip r:embed="rId14"/>
+                    <a:blip r:embed="rId12"/>
                     <a:stretch>
                       <a:fillRect/>
                     </a:stretch>
@@ -2057,7 +1108,7 @@
                   <pic:spPr>
                     <a:xfrm>
                       <a:off x="0" y="0"/>
-                      <a:ext cx="5040000" cy="1904000"/>
+                      <a:ext cx="4320000" cy="1632000"/>
                     </a:xfrm>
                     <a:prstGeom prst="rect"/>
                   </pic:spPr>
@@ -2070,27 +1121,19 @@
     </w:p>
     <w:p>
       <w:pPr>
-        <w:spacing w:after="200"/>
+        <w:spacing w:after="160"/>
       </w:pPr>
-      <w:r>
-        <w:rPr>
-          <w:b/>
-          <w:sz w:val="18"/>
-        </w:rPr>
-        <w:t xml:space="preserve">Distribution of the paired gain </w:t>
-      </w:r>
       <w:r>
         <w:rPr>
           <w:color w:val="5A6876"/>
           <w:sz w:val="18"/>
         </w:rPr>
-        <w:t>over the 40 branches, and the count improved / unchanged / degraded.</w:t>
+        <w:t>Left: five arylation campaigns, plain BO (blue) and with a random point at each alert (red). Right: distribution of the paired gain over 40 branches.</w:t>
       </w:r>
     </w:p>
     <w:tbl>
       <w:tblPr>
         <w:tblW w:type="auto" w:w="0"/>
-        <w:jc w:val="center"/>
         <w:tblLook w:firstColumn="1" w:firstRow="1" w:lastColumn="0" w:lastRow="0" w:noHBand="0" w:noVBand="1" w:val="04A0"/>
       </w:tblPr>
       <w:tblGrid>
@@ -2109,13 +1152,13 @@
                 <w:b/>
                 <w:sz w:val="20"/>
               </w:rPr>
-              <w:t xml:space="preserve">The most important warning of the week. </w:t>
+              <w:t xml:space="preserve">Warning. </w:t>
             </w:r>
             <w:r>
               <w:rPr>
                 <w:sz w:val="20"/>
               </w:rPr>
-              <w:t>The estimate of the random arm's gain collapsed as the sample grew: +4.0 points on 11 branches, +2.7 on 19, +1.3 on 40. This is small-sample optimism in its plainest form, and exactly the regime of a human arm with five chemists and a few answers each. Do not conclude on a mean over a dozen answers; compare paired, on the same checkpoints, against the random arm.</w:t>
+              <w:t>The estimate fell from +4.0 (11 branches) to +2.7 (19) to +1.3 (40). A human arm with five chemists is in that regime: compare paired, on the same checkpoints, never on a mean over a dozen answers.</w:t>
             </w:r>
           </w:p>
         </w:tc>
@@ -2123,7 +1166,7 @@
     </w:tbl>
     <w:p>
       <w:pPr>
-        <w:spacing w:after="40"/>
+        <w:spacing w:after="0"/>
       </w:pPr>
     </w:p>
     <w:p>
@@ -2131,7 +1174,7 @@
         <w:pStyle w:val="Heading1"/>
       </w:pPr>
       <w:r>
-        <w:t>6 · The initial design decides — and that frames the human study</w:t>
+        <w:t>7 · The initial design decides</w:t>
       </w:r>
     </w:p>
     <w:p>
@@ -2139,230 +1182,30 @@
         <w:spacing w:after="120"/>
       </w:pPr>
       <w:r>
-        <w:rPr>
-          <w:i w:val="0"/>
-        </w:rPr>
-        <w:t>Every campaign is seeded by one integer that fixes both the Latin hypercube and the acquisition's Monte-Carlo samples, so “seed 2 is trapped” did not say which of the two was responsible. With the acquisition now seedable, the test was run: same initial design, four acquisition seeds.</w:t>
+        <w:t xml:space="preserve">With the acquisition seedable, one initial design was rerun with four acquisition seeds: arylation seed 2 ends at </w:t>
       </w:r>
-    </w:p>
-    <w:tbl>
-      <w:tblPr>
-        <w:tblStyle w:val="LightGrid-Accent1"/>
-        <w:tblW w:type="auto" w:w="0"/>
-        <w:jc w:val="center"/>
-        <w:tblLook w:firstColumn="1" w:firstRow="1" w:lastColumn="0" w:lastRow="0" w:noHBand="0" w:noVBand="1" w:val="04A0"/>
-      </w:tblPr>
-      <w:tblGrid>
-        <w:gridCol w:w="2436"/>
-        <w:gridCol w:w="2436"/>
-        <w:gridCol w:w="2436"/>
-        <w:gridCol w:w="2436"/>
-      </w:tblGrid>
-      <w:tr>
-        <w:tc>
-          <w:tcPr>
-            <w:tcW w:type="dxa" w:w="1984"/>
-          </w:tcPr>
-          <w:p>
-            <w:r/>
-            <w:r>
-              <w:rPr>
-                <w:b/>
-                <w:sz w:val="18"/>
-              </w:rPr>
-              <w:t>Campaign</w:t>
-            </w:r>
-          </w:p>
-        </w:tc>
-        <w:tc>
-          <w:tcPr>
-            <w:tcW w:type="dxa" w:w="2268"/>
-          </w:tcPr>
-          <w:p>
-            <w:r/>
-            <w:r>
-              <w:rPr>
-                <w:b/>
-                <w:sz w:val="18"/>
-              </w:rPr>
-              <w:t>Initial design held</w:t>
-            </w:r>
-          </w:p>
-        </w:tc>
-        <w:tc>
-          <w:tcPr>
-            <w:tcW w:type="dxa" w:w="1417"/>
-          </w:tcPr>
-          <w:p>
-            <w:r/>
-            <w:r>
-              <w:rPr>
-                <w:b/>
-                <w:sz w:val="18"/>
-              </w:rPr>
-              <w:t>BO seeds tried</w:t>
-            </w:r>
-          </w:p>
-        </w:tc>
-        <w:tc>
-          <w:tcPr>
-            <w:tcW w:type="dxa" w:w="3969"/>
-          </w:tcPr>
-          <w:p>
-            <w:r/>
-            <w:r>
-              <w:rPr>
-                <w:b/>
-                <w:sz w:val="18"/>
-              </w:rPr>
-              <w:t>Outcome</w:t>
-            </w:r>
-          </w:p>
-        </w:tc>
-      </w:tr>
-      <w:tr>
-        <w:tc>
-          <w:tcPr>
-            <w:tcW w:type="dxa" w:w="1984"/>
-          </w:tcPr>
-          <w:p>
-            <w:r/>
-            <w:r>
-              <w:rPr>
-                <w:sz w:val="18"/>
-              </w:rPr>
-              <w:t>Arylation, seed 2</w:t>
-            </w:r>
-          </w:p>
-        </w:tc>
-        <w:tc>
-          <w:tcPr>
-            <w:tcW w:type="dxa" w:w="2268"/>
-          </w:tcPr>
-          <w:p>
-            <w:r/>
-            <w:r>
-              <w:rPr>
-                <w:sz w:val="18"/>
-              </w:rPr>
-              <w:t>seed 2</w:t>
-            </w:r>
-          </w:p>
-        </w:tc>
-        <w:tc>
-          <w:tcPr>
-            <w:tcW w:type="dxa" w:w="1417"/>
-          </w:tcPr>
-          <w:p>
-            <w:pPr>
-              <w:jc w:val="right"/>
-            </w:pPr>
-            <w:r/>
-            <w:r>
-              <w:rPr>
-                <w:sz w:val="18"/>
-              </w:rPr>
-              <w:t>4</w:t>
-            </w:r>
-          </w:p>
-        </w:tc>
-        <w:tc>
-          <w:tcPr>
-            <w:tcW w:type="dxa" w:w="3969"/>
-          </w:tcPr>
-          <w:p>
-            <w:r/>
-            <w:r>
-              <w:rPr>
-                <w:sz w:val="18"/>
-              </w:rPr>
-              <w:t>72.5 % of the front, all four (only the tie-sweep tail differs)</w:t>
-            </w:r>
-          </w:p>
-        </w:tc>
-      </w:tr>
-      <w:tr>
-        <w:tc>
-          <w:tcPr>
-            <w:tcW w:type="dxa" w:w="1984"/>
-          </w:tcPr>
-          <w:p>
-            <w:r/>
-            <w:r>
-              <w:rPr>
-                <w:sz w:val="18"/>
-              </w:rPr>
-              <w:t>Suzuki II, seed 3</w:t>
-            </w:r>
-          </w:p>
-        </w:tc>
-        <w:tc>
-          <w:tcPr>
-            <w:tcW w:type="dxa" w:w="2268"/>
-          </w:tcPr>
-          <w:p>
-            <w:r/>
-            <w:r>
-              <w:rPr>
-                <w:sz w:val="18"/>
-              </w:rPr>
-              <w:t>seed 3 (PCy3 drawn twice)</w:t>
-            </w:r>
-          </w:p>
-        </w:tc>
-        <w:tc>
-          <w:tcPr>
-            <w:tcW w:type="dxa" w:w="1417"/>
-          </w:tcPr>
-          <w:p>
-            <w:pPr>
-              <w:jc w:val="right"/>
-            </w:pPr>
-            <w:r/>
-            <w:r>
-              <w:rPr>
-                <w:sz w:val="18"/>
-              </w:rPr>
-              <w:t>4</w:t>
-            </w:r>
-          </w:p>
-        </w:tc>
-        <w:tc>
-          <w:tcPr>
-            <w:tcW w:type="dxa" w:w="3969"/>
-          </w:tcPr>
-          <w:p>
-            <w:r/>
-            <w:r>
-              <w:rPr>
-                <w:sz w:val="18"/>
-              </w:rPr>
-              <w:t>37.3 %, all four; one visit to PCy3 in thirty experiments every time</w:t>
-            </w:r>
-          </w:p>
-        </w:tc>
-      </w:tr>
-    </w:tbl>
-    <w:p>
-      <w:pPr>
-        <w:spacing w:after="40"/>
-      </w:pPr>
-    </w:p>
-    <w:p>
-      <w:pPr>
-        <w:spacing w:after="120"/>
-      </w:pPr>
       <w:r>
         <w:rPr>
-          <w:i w:val="0"/>
+          <w:b/>
         </w:rPr>
-        <w:t>Given this optimiser, the outcome is a function of the ten starting points; the acquisition's own randomness contributes nothing. It does not say another optimiser would be trapped by the same design.</w:t>
+        <w:t>72.5 % all four times</w:t>
+      </w:r>
+      <w:r>
+        <w:t xml:space="preserve">, Suzuki II seed 3 at </w:t>
+      </w:r>
+      <w:r>
+        <w:rPr>
+          <w:b/>
+        </w:rPr>
+        <w:t>37.3 % all four times</w:t>
+      </w:r>
+      <w:r>
+        <w:t>. Given this optimiser, the outcome is a function of the ten starting points.</w:t>
       </w:r>
     </w:p>
     <w:tbl>
       <w:tblPr>
         <w:tblW w:type="auto" w:w="0"/>
-        <w:jc w:val="center"/>
         <w:tblLook w:firstColumn="1" w:firstRow="1" w:lastColumn="0" w:lastRow="0" w:noHBand="0" w:noVBand="1" w:val="04A0"/>
       </w:tblPr>
       <w:tblGrid>
@@ -2381,13 +1224,13 @@
                 <w:b/>
                 <w:sz w:val="20"/>
               </w:rPr>
-              <w:t xml:space="preserve">Frame for the article (the owner's decision of 12 September). </w:t>
+              <w:t xml:space="preserve">Frame for the article. </w:t>
             </w:r>
             <w:r>
               <w:rPr>
                 <w:sz w:val="20"/>
               </w:rPr>
-              <w:t>The human study is a case study on trapped initial designs: the base rate comes from the twenty seeds (13/20, 5/20, 10/20); on one trapped design per reaction, three paired branches share the history up to the alert — plain BO (deterministic given the design), a random point, a chemist. The question is precise: does a chemist called between experiments 15 and 22 get the campaign out of a trap that neither the optimiser nor chance leaves? Not “does HITL help on average”, which the sample size cannot carry.</w:t>
+              <w:t>A case study on trapped initial designs: base rate from the twenty seeds; on one trapped design per reaction, three paired branches. Question: does a chemist called between experiments 15 and 22 get the campaign out of a trap that neither the optimiser nor chance leaves?</w:t>
             </w:r>
           </w:p>
         </w:tc>
@@ -2395,16 +1238,8 @@
     </w:tbl>
     <w:p>
       <w:pPr>
-        <w:spacing w:after="40"/>
+        <w:spacing w:after="0"/>
       </w:pPr>
-    </w:p>
-    <w:p>
-      <w:pPr>
-        <w:pStyle w:val="Heading2"/>
-      </w:pPr>
-      <w:r>
-        <w:t>The campaigns assigned to the chemists</w:t>
-      </w:r>
     </w:p>
     <w:tbl>
       <w:tblPr>
@@ -2423,7 +1258,7 @@
       <w:tr>
         <w:tc>
           <w:tcPr>
-            <w:tcW w:type="dxa" w:w="1587"/>
+            <w:tcW w:type="dxa" w:w="1474"/>
           </w:tcPr>
           <w:p>
             <w:r/>
@@ -2438,7 +1273,7 @@
         </w:tc>
         <w:tc>
           <w:tcPr>
-            <w:tcW w:type="dxa" w:w="794"/>
+            <w:tcW w:type="dxa" w:w="737"/>
           </w:tcPr>
           <w:p>
             <w:r/>
@@ -2453,7 +1288,7 @@
         </w:tc>
         <w:tc>
           <w:tcPr>
-            <w:tcW w:type="dxa" w:w="1474"/>
+            <w:tcW w:type="dxa" w:w="1134"/>
           </w:tcPr>
           <w:p>
             <w:r/>
@@ -2462,7 +1297,7 @@
                 <w:b/>
                 <w:sz w:val="18"/>
               </w:rPr>
-              <w:t>Plain BO ends at</w:t>
+              <w:t>Plain BO</w:t>
             </w:r>
           </w:p>
         </w:tc>
@@ -2483,7 +1318,7 @@
         </w:tc>
         <w:tc>
           <w:tcPr>
-            <w:tcW w:type="dxa" w:w="4535"/>
+            <w:tcW w:type="dxa" w:w="4876"/>
           </w:tcPr>
           <w:p>
             <w:r/>
@@ -2492,7 +1327,7 @@
                 <w:b/>
                 <w:sz w:val="18"/>
               </w:rPr>
-              <w:t>The trap, readable in the data</w:t>
+              <w:t>The trap</w:t>
             </w:r>
           </w:p>
         </w:tc>
@@ -2500,7 +1335,7 @@
       <w:tr>
         <w:tc>
           <w:tcPr>
-            <w:tcW w:type="dxa" w:w="1587"/>
+            <w:tcW w:type="dxa" w:w="1474"/>
           </w:tcPr>
           <w:p>
             <w:r/>
@@ -2514,12 +1349,9 @@
         </w:tc>
         <w:tc>
           <w:tcPr>
-            <w:tcW w:type="dxa" w:w="794"/>
+            <w:tcW w:type="dxa" w:w="737"/>
           </w:tcPr>
           <w:p>
-            <w:pPr>
-              <w:jc w:val="right"/>
-            </w:pPr>
             <w:r/>
             <w:r>
               <w:rPr>
@@ -2531,12 +1363,9 @@
         </w:tc>
         <w:tc>
           <w:tcPr>
-            <w:tcW w:type="dxa" w:w="1474"/>
+            <w:tcW w:type="dxa" w:w="1134"/>
           </w:tcPr>
           <w:p>
-            <w:pPr>
-              <w:jc w:val="right"/>
-            </w:pPr>
             <w:r/>
             <w:r>
               <w:rPr>
@@ -2551,9 +1380,6 @@
             <w:tcW w:type="dxa" w:w="1134"/>
           </w:tcPr>
           <w:p>
-            <w:pPr>
-              <w:jc w:val="right"/>
-            </w:pPr>
             <w:r/>
             <w:r>
               <w:rPr>
@@ -2565,7 +1391,7 @@
         </w:tc>
         <w:tc>
           <w:tcPr>
-            <w:tcW w:type="dxa" w:w="4535"/>
+            <w:tcW w:type="dxa" w:w="4876"/>
           </w:tcPr>
           <w:p>
             <w:r/>
@@ -2573,7 +1399,7 @@
               <w:rPr>
                 <w:sz w:val="18"/>
               </w:rPr>
-              <w:t>Xantphos seen once at 40 °C → 0 %; rediscovered at 27, too late</w:t>
+              <w:t>Xantphos seen at 40 °C → 0 %; rediscovered at 27, too late</w:t>
             </w:r>
           </w:p>
         </w:tc>
@@ -2581,7 +1407,7 @@
       <w:tr>
         <w:tc>
           <w:tcPr>
-            <w:tcW w:type="dxa" w:w="1587"/>
+            <w:tcW w:type="dxa" w:w="1474"/>
           </w:tcPr>
           <w:p>
             <w:r/>
@@ -2595,12 +1421,9 @@
         </w:tc>
         <w:tc>
           <w:tcPr>
-            <w:tcW w:type="dxa" w:w="794"/>
+            <w:tcW w:type="dxa" w:w="737"/>
           </w:tcPr>
           <w:p>
-            <w:pPr>
-              <w:jc w:val="right"/>
-            </w:pPr>
             <w:r/>
             <w:r>
               <w:rPr>
@@ -2612,12 +1435,9 @@
         </w:tc>
         <w:tc>
           <w:tcPr>
-            <w:tcW w:type="dxa" w:w="1474"/>
+            <w:tcW w:type="dxa" w:w="1134"/>
           </w:tcPr>
           <w:p>
-            <w:pPr>
-              <w:jc w:val="right"/>
-            </w:pPr>
             <w:r/>
             <w:r>
               <w:rPr>
@@ -2632,9 +1452,6 @@
             <w:tcW w:type="dxa" w:w="1134"/>
           </w:tcPr>
           <w:p>
-            <w:pPr>
-              <w:jc w:val="right"/>
-            </w:pPr>
             <w:r/>
             <w:r>
               <w:rPr>
@@ -2646,7 +1463,7 @@
         </w:tc>
         <w:tc>
           <w:tcPr>
-            <w:tcW w:type="dxa" w:w="4535"/>
+            <w:tcW w:type="dxa" w:w="4876"/>
           </w:tcPr>
           <w:p>
             <w:r/>
@@ -2654,7 +1471,7 @@
               <w:rPr>
                 <w:sz w:val="18"/>
               </w:rPr>
-              <w:t>PCy3 seen once at 0 %; campaign ends on XPhos and never returns</w:t>
+              <w:t>PCy3 seen once at 0 %; ends on XPhos</w:t>
             </w:r>
           </w:p>
         </w:tc>
@@ -2662,7 +1479,7 @@
       <w:tr>
         <w:tc>
           <w:tcPr>
-            <w:tcW w:type="dxa" w:w="1587"/>
+            <w:tcW w:type="dxa" w:w="1474"/>
           </w:tcPr>
           <w:p>
             <w:r/>
@@ -2676,12 +1493,9 @@
         </w:tc>
         <w:tc>
           <w:tcPr>
-            <w:tcW w:type="dxa" w:w="794"/>
+            <w:tcW w:type="dxa" w:w="737"/>
           </w:tcPr>
           <w:p>
-            <w:pPr>
-              <w:jc w:val="right"/>
-            </w:pPr>
             <w:r/>
             <w:r>
               <w:rPr>
@@ -2693,12 +1507,9 @@
         </w:tc>
         <w:tc>
           <w:tcPr>
-            <w:tcW w:type="dxa" w:w="1474"/>
+            <w:tcW w:type="dxa" w:w="1134"/>
           </w:tcPr>
           <w:p>
-            <w:pPr>
-              <w:jc w:val="right"/>
-            </w:pPr>
             <w:r/>
             <w:r>
               <w:rPr>
@@ -2713,9 +1524,6 @@
             <w:tcW w:type="dxa" w:w="1134"/>
           </w:tcPr>
           <w:p>
-            <w:pPr>
-              <w:jc w:val="right"/>
-            </w:pPr>
             <w:r/>
             <w:r>
               <w:rPr>
@@ -2727,7 +1535,7 @@
         </w:tc>
         <w:tc>
           <w:tcPr>
-            <w:tcW w:type="dxa" w:w="4535"/>
+            <w:tcW w:type="dxa" w:w="4876"/>
           </w:tcPr>
           <w:p>
             <w:r/>
@@ -2735,7 +1543,7 @@
               <w:rPr>
                 <w:sz w:val="18"/>
               </w:rPr>
-              <w:t>77 % on CgMe-PPh in the initial design, then nothing for 28 experiments</w:t>
+              <w:t>77 % on CgMe-PPh at the start, then flat for 28 experiments</w:t>
             </w:r>
           </w:p>
         </w:tc>
@@ -2743,26 +1551,15 @@
     </w:tbl>
     <w:p>
       <w:pPr>
-        <w:spacing w:after="40"/>
+        <w:spacing w:after="0"/>
       </w:pPr>
-    </w:p>
-    <w:p>
-      <w:pPr>
-        <w:spacing w:after="120"/>
-      </w:pPr>
-      <w:r>
-        <w:rPr>
-          <w:i w:val="0"/>
-        </w:rPr>
-        <w:t>Three different failure modes: a wrong catalyst for good, a good catalyst found too late, a plateau on a good ligand from the start.</w:t>
-      </w:r>
     </w:p>
     <w:p>
       <w:pPr>
         <w:pStyle w:val="Heading1"/>
       </w:pPr>
       <w:r>
-        <w:t>7 · The live page in REACTO</w:t>
+        <w:t>8 · The live page</w:t>
       </w:r>
     </w:p>
     <w:p>
@@ -2777,140 +1574,26 @@
         <w:t>/hitl-live</w:t>
       </w:r>
       <w:r>
-        <w:t xml:space="preserve"> replaces both the notebook and the static checkpoint page. The campaign is a state machine in </w:t>
+        <w:t xml:space="preserve"> in REACTO: a chemist replays the assigned control experiment by experiment — identical for everyone until they act — and at each alert chooses </w:t>
+      </w:r>
+      <w:r>
+        <w:rPr>
+          <w:i/>
+        </w:rPr>
+        <w:t>continue / propose / stop</w:t>
+      </w:r>
+      <w:r>
+        <w:t xml:space="preserve">, with a justification. An imposed point switches the optimiser to live mode, seeded as the control. Everything is saved as a REACTO project and as JSON; a returning chemist resumes from a list, as on the Optimization page. The chemistry comes first (source scheme, conditions, prices per gram behind the cost objective), the sortable table next, plots last; no hypervolume or optimum is shown. Browser testing exposed and fixed three faults (a callback the renderer refused, a race between ticks, catalyst codes in the menus). L6 and L7 are now named PPh3 and P(t-Bu)3. </w:t>
       </w:r>
       <w:r>
         <w:rPr>
           <w:rFonts w:ascii="Consolas" w:hAnsi="Consolas"/>
           <w:sz w:val="19"/>
         </w:rPr>
-        <w:t>hitl_bench/live.py</w:t>
+        <w:t>collect_live.py</w:t>
       </w:r>
       <w:r>
-        <w:t>, tested without any interface; the Dash page only draws it.</w:t>
-      </w:r>
-    </w:p>
-    <w:p>
-      <w:pPr>
-        <w:pStyle w:val="ListBullet"/>
-        <w:spacing w:after="60"/>
-      </w:pPr>
-      <w:r>
-        <w:rPr>
-          <w:b/>
-        </w:rPr>
-        <w:t xml:space="preserve">Identical for everyone until they act. </w:t>
-      </w:r>
-      <w:r>
-        <w:t>A chemist's campaign replays the assigned control — same initial design, same proposals in the same order — at one experiment per second. The moment they impose a point, the optimiser runs for real from there, seeded as the control was, so even the diverged part is replayable.</w:t>
-      </w:r>
-    </w:p>
-    <w:p>
-      <w:pPr>
-        <w:pStyle w:val="ListBullet"/>
-        <w:spacing w:after="60"/>
-      </w:pPr>
-      <w:r>
-        <w:rPr>
-          <w:b/>
-        </w:rPr>
-        <w:t>The alert is the frozen trigger</w:t>
-      </w:r>
-      <w:r>
-        <w:t>, evaluated on the live history exactly as on the random arm. The campaign pauses; the three answers are recorded with P*, the optimiser's proposal, timing and justification. A missing condition is refused, a blank choice is refused.</w:t>
-      </w:r>
-    </w:p>
-    <w:p>
-      <w:pPr>
-        <w:pStyle w:val="ListBullet"/>
-        <w:spacing w:after="60"/>
-      </w:pPr>
-      <w:r>
-        <w:rPr>
-          <w:b/>
-        </w:rPr>
-        <w:t>Saved after every experiment</w:t>
-      </w:r>
-      <w:r>
-        <w:t>, as a REACTO project (opens in Results like any other) and as a JSON carrying what Excel cannot.</w:t>
-      </w:r>
-    </w:p>
-    <w:p>
-      <w:pPr>
-        <w:pStyle w:val="ListBullet"/>
-        <w:spacing w:after="60"/>
-      </w:pPr>
-      <w:r>
-        <w:rPr>
-          <w:b/>
-        </w:rPr>
-        <w:t xml:space="preserve">Chemistry first. </w:t>
-      </w:r>
-      <w:r>
-        <w:t>A collapsible card shows the source figure — the four-case scheme for Suzuki, Fig. 4a of Shields et al. for the arylation — one sentence, conditions, what is controlled and measured, catalogue prices per gram behind the cost objective, sources. The experiments table (sortable, as in Results) comes right after; plots last. No hypervolume, no acquisition, no front, no published optimum.</w:t>
-      </w:r>
-    </w:p>
-    <w:p>
-      <w:pPr>
-        <w:pStyle w:val="ListBullet"/>
-        <w:spacing w:after="60"/>
-      </w:pPr>
-      <w:r>
-        <w:rPr>
-          <w:b/>
-        </w:rPr>
-        <w:t xml:space="preserve">Resume as on the Optimization page: </w:t>
-      </w:r>
-      <w:r>
-        <w:t>a returning chemist picks their name in a list; each campaign shows not started / in progress n/40 / paused at experiment k — waiting for you / finished. Names are case-insensitive.</w:t>
-      </w:r>
-    </w:p>
-    <w:p>
-      <w:pPr>
-        <w:pStyle w:val="ListBullet"/>
-        <w:spacing w:after="60"/>
-      </w:pPr>
-      <w:r>
-        <w:rPr>
-          <w:b/>
-        </w:rPr>
-        <w:t xml:space="preserve">What the browser taught us. </w:t>
-      </w:r>
-      <w:r>
-        <w:t>The whole callback chain passed over HTTP, and “Open” still did nothing in Chrome: the Dash renderer refuses a callback whose plain-id input is absent from the page. Fixed with pattern ids. A per-campaign lock keeps two ticks from stepping the same campaign during a 10-second live experiment. The Suzuki catalyst menus showed codes while the table showed names; both now go through one label, and the round trip is checked.</w:t>
-      </w:r>
-    </w:p>
-    <w:p>
-      <w:pPr>
-        <w:pStyle w:val="ListBullet"/>
-        <w:spacing w:after="60"/>
-      </w:pPr>
-      <w:r>
-        <w:rPr>
-          <w:b/>
-        </w:rPr>
-        <w:t xml:space="preserve">L6 and L7 have names. </w:t>
-      </w:r>
-      <w:r>
-        <w:t>The owner's scheme names them: PPh3 and P(t-Bu)3; the text of the article names only L1–L5. Chemists no longer see “P1-L7”.</w:t>
-      </w:r>
-    </w:p>
-    <w:p>
-      <w:pPr>
-        <w:spacing w:after="120"/>
-      </w:pPr>
-      <w:r>
-        <w:t xml:space="preserve">The owner's own trial of the three campaigns (as “mc”) exercised every path: continue at four alerts on Suzuki II and on the arylation, an imposed point at 23 and a stop at 29 on Suzuki I (43.5 % against 48.0 % for plain BO at the same experiment). </w:t>
-      </w:r>
-      <w:r>
-        <w:rPr>
-          <w:rFonts w:ascii="Consolas" w:hAnsi="Consolas"/>
-          <w:sz w:val="19"/>
-        </w:rPr>
-        <w:t>scripts/collect_live.py</w:t>
-      </w:r>
-      <w:r>
-        <w:t xml:space="preserve"> turns every chemist's files into two tables, one row per campaign (paired against the control at the same experiment and at the full budget) and one per decision.</w:t>
+        <w:t xml:space="preserve"> turns the chemists' files into two tables.</w:t>
       </w:r>
     </w:p>
     <w:p>
@@ -2918,97 +1601,43 @@
         <w:pStyle w:val="Heading1"/>
       </w:pPr>
       <w:r>
-        <w:t>8 · Open before the chemists start</w:t>
+        <w:t>9 · Open</w:t>
       </w:r>
     </w:p>
     <w:p>
       <w:pPr>
         <w:pStyle w:val="ListBullet"/>
-        <w:spacing w:after="60"/>
+        <w:spacing w:after="40"/>
       </w:pPr>
       <w:r>
-        <w:rPr>
-          <w:b/>
-        </w:rPr>
-        <w:t xml:space="preserve">Justification. </w:t>
-      </w:r>
-      <w:r>
-        <w:t>All 13 of the trial decisions carry no “why”; the field is optional. Making it mandatory (at least for “propose” and “stop”) is one line — the reasoning is half the result.</w:t>
+        <w:t>Make the justification mandatory (13 of 13 trial decisions carry none).</w:t>
       </w:r>
     </w:p>
     <w:p>
       <w:pPr>
         <w:pStyle w:val="ListBullet"/>
-        <w:spacing w:after="60"/>
+        <w:spacing w:after="40"/>
       </w:pPr>
       <w:r>
-        <w:rPr>
-          <w:b/>
-        </w:rPr>
-        <w:t xml:space="preserve">Comparing a stopped campaign </w:t>
-      </w:r>
-      <w:r>
-        <w:t>to a control that spent 40 experiments: report hypervolume and experiments separately, per experiment, or hold the stopped value flat to 40 (penalises early stops, rewards justified ones). collect_live.py currently reports both paired readings and settles nothing.</w:t>
+        <w:t>How to compare a stopped campaign with a 40-experiment control.</w:t>
       </w:r>
     </w:p>
     <w:p>
       <w:pPr>
         <w:pStyle w:val="ListBullet"/>
-        <w:spacing w:after="60"/>
+        <w:spacing w:after="40"/>
       </w:pPr>
       <w:r>
-        <w:rPr>
-          <w:b/>
-        </w:rPr>
-        <w:t xml:space="preserve">Percentiles for a chemist's answer </w:t>
-      </w:r>
-      <w:r>
-        <w:t>need many random draws at the same first alert (about 20 per assigned campaign); the random arm so far gives the mean effect of chance, not the distribution at an instant.</w:t>
+        <w:t>Random branches on Suzuki, and enough draws at the first alert for percentiles.</w:t>
       </w:r>
     </w:p>
     <w:p>
       <w:pPr>
         <w:pStyle w:val="ListBullet"/>
-        <w:spacing w:after="60"/>
+        <w:spacing w:after="40"/>
       </w:pPr>
       <w:r>
-        <w:rPr>
-          <w:b/>
-        </w:rPr>
-        <w:t xml:space="preserve">Suzuki random branches </w:t>
-      </w:r>
-      <w:r>
-        <w:t>have not been computed (arylation only); Suzuki I and II controls are complete.</w:t>
-      </w:r>
-    </w:p>
-    <w:p>
-      <w:pPr>
-        <w:pStyle w:val="ListBullet"/>
-        <w:spacing w:after="60"/>
-      </w:pPr>
-      <w:r>
-        <w:rPr>
-          <w:b/>
-        </w:rPr>
-        <w:t xml:space="preserve">Figures and rights. </w:t>
-      </w:r>
-      <w:r>
-        <w:t>The Reizman scheme is CC BY 3.0; Fig. 4a of Shields et al. is © Springer Nature — fine for the participants' page, permission or the redrawn scheme (kept in the repository) for the article. The source of the “Scheme 10” figure is still to be credited.</w:t>
-      </w:r>
-    </w:p>
-    <w:p>
-      <w:pPr>
-        <w:pStyle w:val="ListBullet"/>
-        <w:spacing w:after="60"/>
-      </w:pPr>
-      <w:r>
-        <w:rPr>
-          <w:b/>
-        </w:rPr>
-        <w:t xml:space="preserve">Noise. </w:t>
-      </w:r>
-      <w:r>
-        <w:t>The Suzuki grids are noiseless emulator output; any detector built on the GP's calibration is untestable there. The arylation is measured, single runs.</w:t>
+        <w:t>Rights: the Nature figure needs permission for the article (a redrawn scheme is kept); the four-case scheme still needs its source credited.</w:t>
       </w:r>
     </w:p>
     <w:p>
@@ -3017,21 +1646,10 @@
       </w:pPr>
       <w:r>
         <w:rPr>
-          <w:i w:val="0"/>
-        </w:rPr>
-      </w:r>
-    </w:p>
-    <w:p>
-      <w:pPr>
-        <w:spacing w:after="120"/>
-      </w:pPr>
-      <w:r>
-        <w:rPr>
-          <w:i w:val="0"/>
           <w:color w:val="5A6876"/>
           <w:sz w:val="18"/>
         </w:rPr>
-        <w:t>Everything above is in the repository: decisions and frozen settings in hitl_bench/CLAUDE.md; provenance in hitl_bench/data/README.md and data/other/README.md; per-benchmark reports regenerated by analyse_arms.py; the night report in docs/nuit_du_10_septembre.md; the chemists' protocol in docs/protocole_chimistes.md; figures in hitl_bench/figures/.</w:t>
+        <w:t>Details, numbers and decisions: hitl_bench/CLAUDE.md, data/README.md, results/arms_report_*.md, docs/nuit_du_10_septembre.md.</w:t>
       </w:r>
     </w:p>
     <w:sectPr>
@@ -3471,11 +2089,11 @@
       <w:outlineLvl w:val="0"/>
     </w:pPr>
     <w:rPr>
-      <w:rFonts w:asciiTheme="majorHAnsi" w:eastAsiaTheme="majorEastAsia" w:hAnsiTheme="majorHAnsi" w:cstheme="majorBidi" w:ascii="Calibri" w:hAnsi="Calibri" w:eastAsia="Calibri"/>
+      <w:rFonts w:asciiTheme="majorHAnsi" w:eastAsiaTheme="majorEastAsia" w:hAnsiTheme="majorHAnsi" w:cstheme="majorBidi" w:ascii="Calibri" w:hAnsi="Calibri"/>
       <w:b/>
       <w:bCs/>
       <w:color w:val="176F8B"/>
-      <w:sz w:val="32"/>
+      <w:sz w:val="28"/>
       <w:szCs w:val="28"/>
     </w:rPr>
   </w:style>
@@ -3495,11 +2113,11 @@
       <w:outlineLvl w:val="1"/>
     </w:pPr>
     <w:rPr>
-      <w:rFonts w:asciiTheme="majorHAnsi" w:eastAsiaTheme="majorEastAsia" w:hAnsiTheme="majorHAnsi" w:cstheme="majorBidi" w:ascii="Calibri" w:hAnsi="Calibri" w:eastAsia="Calibri"/>
+      <w:rFonts w:asciiTheme="majorHAnsi" w:eastAsiaTheme="majorEastAsia" w:hAnsiTheme="majorHAnsi" w:cstheme="majorBidi" w:ascii="Calibri" w:hAnsi="Calibri"/>
       <w:b/>
       <w:bCs/>
       <w:color w:val="176F8B"/>
-      <w:sz w:val="26"/>
+      <w:sz w:val="24"/>
       <w:szCs w:val="26"/>
     </w:rPr>
   </w:style>
@@ -3519,11 +2137,10 @@
       <w:outlineLvl w:val="2"/>
     </w:pPr>
     <w:rPr>
-      <w:rFonts w:asciiTheme="majorHAnsi" w:eastAsiaTheme="majorEastAsia" w:hAnsiTheme="majorHAnsi" w:cstheme="majorBidi" w:ascii="Calibri" w:hAnsi="Calibri" w:eastAsia="Calibri"/>
+      <w:rFonts w:asciiTheme="majorHAnsi" w:eastAsiaTheme="majorEastAsia" w:hAnsiTheme="majorHAnsi" w:cstheme="majorBidi"/>
       <w:b/>
       <w:bCs/>
-      <w:color w:val="5A6876"/>
-      <w:sz w:val="23"/>
+      <w:color w:val="4F81BD" w:themeColor="accent1"/>
     </w:rPr>
   </w:style>
   <w:style w:type="paragraph" w:styleId="Heading4">

</xml_diff>

<commit_message>
Weekly report as a narrative: the questions in order, and what each answer changed
Co-Authored-By: Claude Opus 5 <noreply@anthropic.com>
Claude-Session: https://claude.ai/code/session_018JAoc1BQgQ82dR8t2BxgrR
</commit_message>
<xml_diff>
--- a/hitl_bench/docs/report_week_2026-09-07.docx
+++ b/hitl_bench/docs/report_week_2026-09-07.docx
@@ -24,7 +24,19 @@
     </w:p>
     <w:p>
       <w:pPr>
-        <w:spacing w:after="160"/>
+        <w:spacing w:after="80"/>
+      </w:pPr>
+      <w:r>
+        <w:rPr>
+          <w:color w:val="5A6876"/>
+          <w:sz w:val="22"/>
+        </w:rPr>
+        <w:t>I started the week with an emulator that did not run, a trigger I could not justify and no way to show any of it to a chemist. I ended it with three reactions, a trigger whose threshold means the same thing at any budget, a null model measured on forty branches, and a REACTO page on which my colleagues can be handed a campaign that Bayesian optimisation gets wrong. This is how one led to the next.</w:t>
+      </w:r>
+    </w:p>
+    <w:p>
+      <w:pPr>
+        <w:spacing w:after="200"/>
       </w:pPr>
       <w:r>
         <w:rPr>
@@ -34,164 +46,102 @@
         <w:t>CiTOS, ULiège · REACTO branch hitl-bench · M. Croissant · 14 September 2026</w:t>
       </w:r>
     </w:p>
+    <w:p>
+      <w:pPr>
+        <w:pStyle w:val="Heading1"/>
+      </w:pPr>
+      <w:r>
+        <w:t>Monday 7 — where to build, and on what</w:t>
+      </w:r>
+    </w:p>
+    <w:p>
+      <w:pPr>
+        <w:spacing w:after="60"/>
+      </w:pPr>
+      <w:r>
+        <w:rPr>
+          <w:b/>
+          <w:color w:val="176F8B"/>
+          <w:sz w:val="22"/>
+        </w:rPr>
+        <w:t>Can I trust the benchmark I already have, and where should the study live?</w:t>
+      </w:r>
+    </w:p>
+    <w:p>
+      <w:pPr>
+        <w:spacing w:after="120"/>
+      </w:pPr>
+      <w:r>
+        <w:t xml:space="preserve">My earlier bench ran on Olympus emulators of the Reizman Suzuki campaigns, in its own folder, with its own copy of the optimisation code and a Python environment that turned out to be dead. Repairing Olympus took three patches before it ran at all. The question that settled things was simpler than repairing anything: </w:t>
+      </w:r>
+      <w:r>
+        <w:rPr>
+          <w:b/>
+        </w:rPr>
+        <w:t>Minerva already publishes the emulators evaluated on a complete grid</w:t>
+      </w:r>
+      <w:r>
+        <w:t xml:space="preserve"> (5,670 conditions per case, yields included). A grid needs no emulator, gives an exact Pareto front, and makes a campaign reproducible to the decimal. We checked the four grids against the repaired Olympus (r ≥ 0.997) and kept them.</w:t>
+      </w:r>
+    </w:p>
+    <w:p>
+      <w:pPr>
+        <w:spacing w:after="120"/>
+      </w:pPr>
+      <w:r>
+        <w:t xml:space="preserve">The second decision followed from the first. If the study is about what </w:t>
+      </w:r>
+      <w:r>
+        <w:rPr>
+          <w:i/>
+        </w:rPr>
+        <w:t>my</w:t>
+      </w:r>
+      <w:r>
+        <w:t xml:space="preserve"> optimiser does, the bench must call it, not a copy. So the work moved into REACTO's own repository and imports its </w:t>
+      </w:r>
+      <w:r>
+        <w:rPr>
+          <w:rFonts w:ascii="Consolas" w:hAnsi="Consolas"/>
+          <w:sz w:val="19"/>
+        </w:rPr>
+        <w:t>bayesian_optimization()</w:t>
+      </w:r>
+      <w:r>
+        <w:t>; Olympus, TensorFlow 1.15 and the extra environment left with the old folder. By the evening, five case II campaigns had reproduced the bimodality I knew from my notebook — 37–56 % of the front when the optimiser settles on XPhos, 97–100 % when it finds PCy3 — on the real tool this time.</w:t>
+      </w:r>
+    </w:p>
     <w:tbl>
       <w:tblPr>
-        <w:tblStyle w:val="LightGrid-Accent1"/>
         <w:tblW w:type="auto" w:w="0"/>
-        <w:jc w:val="center"/>
         <w:tblLook w:firstColumn="1" w:firstRow="1" w:lastColumn="0" w:lastRow="0" w:noHBand="0" w:noVBand="1" w:val="04A0"/>
       </w:tblPr>
       <w:tblGrid>
-        <w:gridCol w:w="4873"/>
-        <w:gridCol w:w="4873"/>
+        <w:gridCol w:w="9632"/>
       </w:tblGrid>
       <w:tr>
         <w:tc>
           <w:tcPr>
-            <w:tcW w:type="dxa" w:w="2268"/>
+            <w:tcW w:type="dxa" w:w="9632"/>
+            <w:shd w:val="clear" w:color="auto" w:fill="FBE9DF"/>
           </w:tcPr>
           <w:p>
             <w:r/>
             <w:r>
               <w:rPr>
                 <w:b/>
-                <w:sz w:val="18"/>
+                <w:i/>
+                <w:color w:val="E0672F"/>
+                <w:sz w:val="20"/>
               </w:rPr>
-              <w:t>Key number</w:t>
+              <w:t xml:space="preserve">What changed · </w:t>
             </w:r>
-          </w:p>
-        </w:tc>
-        <w:tc>
-          <w:tcPr>
-            <w:tcW w:type="dxa" w:w="7087"/>
-          </w:tcPr>
-          <w:p>
-            <w:r/>
             <w:r>
               <w:rPr>
-                <w:b/>
-                <w:sz w:val="18"/>
+                <w:i/>
+                <w:sz w:val="20"/>
               </w:rPr>
-            </w:r>
-          </w:p>
-        </w:tc>
-      </w:tr>
-      <w:tr>
-        <w:tc>
-          <w:tcPr>
-            <w:tcW w:type="dxa" w:w="2268"/>
-          </w:tcPr>
-          <w:p>
-            <w:r/>
-            <w:r>
-              <w:rPr>
-                <w:sz w:val="18"/>
-              </w:rPr>
-              <w:t>3</w:t>
-            </w:r>
-          </w:p>
-        </w:tc>
-        <w:tc>
-          <w:tcPr>
-            <w:tcW w:type="dxa" w:w="7087"/>
-          </w:tcPr>
-          <w:p>
-            <w:r/>
-            <w:r>
-              <w:rPr>
-                <w:sz w:val="18"/>
-              </w:rPr>
-              <w:t>benchmarks kept out of 12 grids</w:t>
-            </w:r>
-          </w:p>
-        </w:tc>
-      </w:tr>
-      <w:tr>
-        <w:tc>
-          <w:tcPr>
-            <w:tcW w:type="dxa" w:w="2268"/>
-          </w:tcPr>
-          <w:p>
-            <w:r/>
-            <w:r>
-              <w:rPr>
-                <w:sz w:val="18"/>
-              </w:rPr>
-              <w:t>65 · 25 · 50 %</w:t>
-            </w:r>
-          </w:p>
-        </w:tc>
-        <w:tc>
-          <w:tcPr>
-            <w:tcW w:type="dxa" w:w="7087"/>
-          </w:tcPr>
-          <w:p>
-            <w:r/>
-            <w:r>
-              <w:rPr>
-                <w:sz w:val="18"/>
-              </w:rPr>
-              <w:t>plain-BO failure rate, 20 seeds (Suzuki II · I · arylation)</w:t>
-            </w:r>
-          </w:p>
-        </w:tc>
-      </w:tr>
-      <w:tr>
-        <w:tc>
-          <w:tcPr>
-            <w:tcW w:type="dxa" w:w="2268"/>
-          </w:tcPr>
-          <w:p>
-            <w:r/>
-            <w:r>
-              <w:rPr>
-                <w:sz w:val="18"/>
-              </w:rPr>
-              <w:t>+1.3 pt</w:t>
-            </w:r>
-          </w:p>
-        </w:tc>
-        <w:tc>
-          <w:tcPr>
-            <w:tcW w:type="dxa" w:w="7087"/>
-          </w:tcPr>
-          <w:p>
-            <w:r/>
-            <w:r>
-              <w:rPr>
-                <w:sz w:val="18"/>
-              </w:rPr>
-              <w:t>gain of a random point at the alerts — the null model</w:t>
-            </w:r>
-          </w:p>
-        </w:tc>
-      </w:tr>
-      <w:tr>
-        <w:tc>
-          <w:tcPr>
-            <w:tcW w:type="dxa" w:w="2268"/>
-          </w:tcPr>
-          <w:p>
-            <w:r/>
-            <w:r>
-              <w:rPr>
-                <w:sz w:val="18"/>
-              </w:rPr>
-              <w:t>1 page</w:t>
-            </w:r>
-          </w:p>
-        </w:tc>
-        <w:tc>
-          <w:tcPr>
-            <w:tcW w:type="dxa" w:w="7087"/>
-          </w:tcPr>
-          <w:p>
-            <w:r/>
-            <w:r>
-              <w:rPr>
-                <w:sz w:val="18"/>
-              </w:rPr>
-              <w:t>REACTO /hitl-live, ready for the chemists</w:t>
+              <w:t>One optimiser, one repository, exact fronts. Everything measured after this point is measured on the thing the chemists will use.</w:t>
             </w:r>
           </w:p>
         </w:tc>
@@ -207,197 +157,87 @@
         <w:pStyle w:val="Heading1"/>
       </w:pPr>
       <w:r>
-        <w:t>The week at a glance</w:t>
+        <w:t>Tuesday 8 — can a signal tell a trapped campaign from a good one?</w:t>
+      </w:r>
+    </w:p>
+    <w:p>
+      <w:pPr>
+        <w:spacing w:after="60"/>
+      </w:pPr>
+      <w:r>
+        <w:rPr>
+          <w:b/>
+          <w:color w:val="176F8B"/>
+          <w:sz w:val="22"/>
+        </w:rPr>
+        <w:t>My trigger fired on a cadence; was it reading anything?</w:t>
+      </w:r>
+    </w:p>
+    <w:p>
+      <w:pPr>
+        <w:spacing w:after="120"/>
+      </w:pPr>
+      <w:r>
+        <w:t xml:space="preserve">I had brought a trigger — recent gain over total gain, a threshold, a cooldown — and a family of alternatives (plateau length, the surrogate's over-optimism, collapsed uncertainty, the acquisition value). We measured all of them on the campaigns. </w:t>
+      </w:r>
+      <w:r>
+        <w:rPr>
+          <w:b/>
+        </w:rPr>
+        <w:t>None separates a campaign converging on the right catalyst from one converging on the wrong one.</w:t>
+      </w:r>
+      <w:r>
+        <w:t xml:space="preserve"> Progress, ligand coverage, concentration: identical in both; only the identity of the ligand differs, and that is what the campaign cannot know. Worse, my trigger's condition held in 46 % of experiments, so the cooldown, not the signal, set when it fired.</w:t>
+      </w:r>
+    </w:p>
+    <w:p>
+      <w:pPr>
+        <w:spacing w:after="120"/>
+      </w:pPr>
+      <w:r>
+        <w:t xml:space="preserve">That result changed what I could ask of a trigger. If nothing diagnoses, the trigger cannot decide; it can only </w:t>
+      </w:r>
+      <w:r>
+        <w:rPr>
+          <w:b/>
+        </w:rPr>
+        <w:t>book an appointment</w:t>
+      </w:r>
+      <w:r>
+        <w:t xml:space="preserve"> with someone who can. The asymmetry makes that acceptable: interrupting a healthy campaign costs one experiment in thirty, missing a trapped one costs fifty points of front. We kept my signal's shape but corrected its denominator — recent pace over the campaign's own average pace, P* — because the original ratio decays on its own under steady progress and its threshold silently encodes a firing time.</w:t>
       </w:r>
     </w:p>
     <w:tbl>
       <w:tblPr>
-        <w:tblStyle w:val="LightGrid-Accent1"/>
         <w:tblW w:type="auto" w:w="0"/>
-        <w:jc w:val="center"/>
         <w:tblLook w:firstColumn="1" w:firstRow="1" w:lastColumn="0" w:lastRow="0" w:noHBand="0" w:noVBand="1" w:val="04A0"/>
       </w:tblPr>
       <w:tblGrid>
-        <w:gridCol w:w="4873"/>
-        <w:gridCol w:w="4873"/>
+        <w:gridCol w:w="9632"/>
       </w:tblGrid>
       <w:tr>
         <w:tc>
           <w:tcPr>
-            <w:tcW w:type="dxa" w:w="1701"/>
+            <w:tcW w:type="dxa" w:w="9632"/>
+            <w:shd w:val="clear" w:color="auto" w:fill="FBE9DF"/>
           </w:tcPr>
           <w:p>
             <w:r/>
             <w:r>
               <w:rPr>
                 <w:b/>
-                <w:sz w:val="18"/>
+                <w:i/>
+                <w:color w:val="E0672F"/>
+                <w:sz w:val="20"/>
               </w:rPr>
-              <w:t>Day</w:t>
+              <w:t xml:space="preserve">What changed · </w:t>
             </w:r>
-          </w:p>
-        </w:tc>
-        <w:tc>
-          <w:tcPr>
-            <w:tcW w:type="dxa" w:w="7654"/>
-          </w:tcPr>
-          <w:p>
-            <w:r/>
             <w:r>
               <w:rPr>
-                <w:b/>
-                <w:sz w:val="18"/>
+                <w:i/>
+                <w:sz w:val="20"/>
               </w:rPr>
-            </w:r>
-          </w:p>
-        </w:tc>
-      </w:tr>
-      <w:tr>
-        <w:tc>
-          <w:tcPr>
-            <w:tcW w:type="dxa" w:w="1701"/>
-          </w:tcPr>
-          <w:p>
-            <w:r/>
-            <w:r>
-              <w:rPr>
-                <w:sz w:val="18"/>
-              </w:rPr>
-              <w:t>Mon 7</w:t>
-            </w:r>
-          </w:p>
-        </w:tc>
-        <w:tc>
-          <w:tcPr>
-            <w:tcW w:type="dxa" w:w="7654"/>
-          </w:tcPr>
-          <w:p>
-            <w:r/>
-            <w:r>
-              <w:rPr>
-                <w:sz w:val="18"/>
-              </w:rPr>
-              <w:t>Study moved into the REACTO repository; Olympus dropped; grids verified; campaign core written.</w:t>
-            </w:r>
-          </w:p>
-        </w:tc>
-      </w:tr>
-      <w:tr>
-        <w:tc>
-          <w:tcPr>
-            <w:tcW w:type="dxa" w:w="1701"/>
-          </w:tcPr>
-          <w:p>
-            <w:r/>
-            <w:r>
-              <w:rPr>
-                <w:sz w:val="18"/>
-              </w:rPr>
-              <w:t>Tue 8 – Wed 9</w:t>
-            </w:r>
-          </w:p>
-        </w:tc>
-        <w:tc>
-          <w:tcPr>
-            <w:tcW w:type="dxa" w:w="7654"/>
-          </w:tcPr>
-          <w:p>
-            <w:r/>
-            <w:r>
-              <w:rPr>
-                <w:sz w:val="18"/>
-              </w:rPr>
-              <w:t>Trigger candidates measured; nine more reaction grids screened overnight; the three reactions chosen.</w:t>
-            </w:r>
-          </w:p>
-        </w:tc>
-      </w:tr>
-      <w:tr>
-        <w:tc>
-          <w:tcPr>
-            <w:tcW w:type="dxa" w:w="1701"/>
-          </w:tcPr>
-          <w:p>
-            <w:r/>
-            <w:r>
-              <w:rPr>
-                <w:sz w:val="18"/>
-              </w:rPr>
-              <w:t>Thu 10</w:t>
-            </w:r>
-          </w:p>
-        </w:tc>
-        <w:tc>
-          <w:tcPr>
-            <w:tcW w:type="dxa" w:w="7654"/>
-          </w:tcPr>
-          <w:p>
-            <w:r/>
-            <w:r>
-              <w:rPr>
-                <w:sz w:val="18"/>
-              </w:rPr>
-              <w:t>Provenance verified by script; trigger frozen; three-arm design; non-reproducibility found and fixed.</w:t>
-            </w:r>
-          </w:p>
-        </w:tc>
-      </w:tr>
-      <w:tr>
-        <w:tc>
-          <w:tcPr>
-            <w:tcW w:type="dxa" w:w="1701"/>
-          </w:tcPr>
-          <w:p>
-            <w:r/>
-            <w:r>
-              <w:rPr>
-                <w:sz w:val="18"/>
-              </w:rPr>
-              <w:t>Thu 10 – Fri 11</w:t>
-            </w:r>
-          </w:p>
-        </w:tc>
-        <w:tc>
-          <w:tcPr>
-            <w:tcW w:type="dxa" w:w="7654"/>
-          </w:tcPr>
-          <w:p>
-            <w:r/>
-            <w:r>
-              <w:rPr>
-                <w:sz w:val="18"/>
-              </w:rPr>
-              <w:t>Reproducibility verified; control and random arms computed; figures; live page built.</w:t>
-            </w:r>
-          </w:p>
-        </w:tc>
-      </w:tr>
-      <w:tr>
-        <w:tc>
-          <w:tcPr>
-            <w:tcW w:type="dxa" w:w="1701"/>
-          </w:tcPr>
-          <w:p>
-            <w:r/>
-            <w:r>
-              <w:rPr>
-                <w:sz w:val="18"/>
-              </w:rPr>
-              <w:t>Sat 12</w:t>
-            </w:r>
-          </w:p>
-        </w:tc>
-        <w:tc>
-          <w:tcPr>
-            <w:tcW w:type="dxa" w:w="7654"/>
-          </w:tcPr>
-          <w:p>
-            <w:r/>
-            <w:r>
-              <w:rPr>
-                <w:sz w:val="18"/>
-              </w:rPr>
-              <w:t>Initial design shown to decide the outcome; seeds assigned; page verified in the browser, put in English, chemistry added; owner's trial run.</w:t>
+              <w:t>The trigger books, the chemist diagnoses. The study's question moved from “can we detect a trap?” to “what does a chemist do when called?”</w:t>
             </w:r>
           </w:p>
         </w:tc>
@@ -413,7 +253,20 @@
         <w:pStyle w:val="Heading1"/>
       </w:pPr>
       <w:r>
-        <w:t>1 · One repository, one optimiser</w:t>
+        <w:t>Wednesday 9 — which reactions, and what the chemist may answer</w:t>
+      </w:r>
+    </w:p>
+    <w:p>
+      <w:pPr>
+        <w:spacing w:after="60"/>
+      </w:pPr>
+      <w:r>
+        <w:rPr>
+          <w:b/>
+          <w:color w:val="176F8B"/>
+          <w:sz w:val="22"/>
+        </w:rPr>
+        <w:t>Suzuki case II was the only trap I knew. Was it the only one worth showing?</w:t>
       </w:r>
     </w:p>
     <w:p>
@@ -421,79 +274,16 @@
         <w:spacing w:after="120"/>
       </w:pPr>
       <w:r>
-        <w:t>The benchmark used to live in a standalone folder with its own copy of the optimisation code, a patched Olympus and a broken Python environment. On Monday it moved into REACTO itself (</w:t>
-      </w:r>
-      <w:r>
-        <w:rPr>
-          <w:rFonts w:ascii="Consolas" w:hAnsi="Consolas"/>
-          <w:sz w:val="19"/>
-        </w:rPr>
-        <w:t>hitl_bench/</w:t>
-      </w:r>
-      <w:r>
-        <w:t xml:space="preserve">, branch </w:t>
-      </w:r>
-      <w:r>
-        <w:rPr>
-          <w:rFonts w:ascii="Consolas" w:hAnsi="Consolas"/>
-          <w:sz w:val="19"/>
-        </w:rPr>
-        <w:t>hitl-bench</w:t>
-      </w:r>
-      <w:r>
-        <w:t xml:space="preserve"> of github.com/Mathildec25/dash-chem) and now </w:t>
+        <w:t xml:space="preserve">Overnight, nine more complete grids were screened with the same optimiser. I did not want the reaction where BO does best on average; I wanted the one where </w:t>
       </w:r>
       <w:r>
         <w:rPr>
           <w:b/>
         </w:rPr>
-        <w:t>imports REACTO's own `bayesian_optimization()`</w:t>
+        <w:t>the outcome depends on the initial draw</w:t>
       </w:r>
       <w:r>
-        <w:t>: the in-silico study tests the tool that will run the real campaigns. Olympus is out — the Minerva grids already carry the objectives — so one venv reproduces everything. Input grids are versioned, results and chemists' files are ignored. The old folder was emptied; every commit is pushed the day it is made.</w:t>
-      </w:r>
-    </w:p>
-    <w:p>
-      <w:pPr>
-        <w:pStyle w:val="Heading1"/>
-      </w:pPr>
-      <w:r>
-        <w:t>2 · Benchmarks</w:t>
-      </w:r>
-    </w:p>
-    <w:p>
-      <w:pPr>
-        <w:spacing w:after="120"/>
-      </w:pPr>
-      <w:r>
-        <w:t xml:space="preserve">A usable benchmark is a </w:t>
-      </w:r>
-      <w:r>
-        <w:rPr>
-          <w:b/>
-        </w:rPr>
-        <w:t>complete grid</w:t>
-      </w:r>
-      <w:r>
-        <w:t xml:space="preserve"> (exact front, decimal-level reproducibility) with </w:t>
-      </w:r>
-      <w:r>
-        <w:rPr>
-          <w:b/>
-        </w:rPr>
-        <w:t>named reagents</w:t>
-      </w:r>
-      <w:r>
-        <w:t xml:space="preserve"> and </w:t>
-      </w:r>
-      <w:r>
-        <w:rPr>
-          <w:b/>
-        </w:rPr>
-        <w:t>room for a chemist to change the outcome</w:t>
-      </w:r>
-      <w:r>
-        <w:t>, read as the spread between seeds. Twelve grids were screened; three are kept.</w:t>
+        <w:t>, because that is the only place a chemist can change something. The spread between the worst and the best seed became the selection criterion, with two hard constraints: a complete grid, and reagents with names a chemist can argue about.</w:t>
       </w:r>
     </w:p>
     <w:p>
@@ -503,7 +293,7 @@
       <w:r>
         <w:drawing>
           <wp:inline xmlns:a="http://schemas.openxmlformats.org/drawingml/2006/main" xmlns:pic="http://schemas.openxmlformats.org/drawingml/2006/picture">
-            <wp:extent cx="5940000" cy="2772000"/>
+            <wp:extent cx="5760000" cy="2688000"/>
             <wp:docPr id="1" name="Picture 1"/>
             <wp:cNvGraphicFramePr>
               <a:graphicFrameLocks noChangeAspect="1"/>
@@ -524,7 +314,7 @@
                   <pic:spPr>
                     <a:xfrm>
                       <a:off x="0" y="0"/>
-                      <a:ext cx="5940000" cy="2772000"/>
+                      <a:ext cx="5760000" cy="2688000"/>
                     </a:xfrm>
                     <a:prstGeom prst="rect"/>
                   </pic:spPr>
@@ -544,240 +334,74 @@
           <w:color w:val="5A6876"/>
           <w:sz w:val="18"/>
         </w:rPr>
-        <w:t>Spread between the worst and best plain-BO campaign, points of the global front (3–5 seeds).</w:t>
+        <w:t>Spread between the worst and best plain-BO campaign, in points of the global front (3–5 seeds). Suzuki II and I, and the EDBO+ C–H arylation, were kept.</w:t>
+      </w:r>
+    </w:p>
+    <w:p>
+      <w:pPr>
+        <w:spacing w:after="120"/>
+      </w:pPr>
+      <w:r>
+        <w:t xml:space="preserve">Three survived: Suzuki II (63 points of spread, a categorical trap), Suzuki I (45), and the C–H arylation of EDBO+ — 1,728 conditions all </w:t>
+      </w:r>
+      <w:r>
+        <w:rPr>
+          <w:i/>
+        </w:rPr>
+        <w:t>measured</w:t>
+      </w:r>
+      <w:r>
+        <w:t xml:space="preserve"> at Bristol Myers Squibb, with two independent objectives, yield and reagent cost, where the Suzuki pair is redundant. I decided to stop working on Suzuki alone: it had given what it could.</w:t>
+      </w:r>
+    </w:p>
+    <w:p>
+      <w:pPr>
+        <w:spacing w:after="120"/>
+      </w:pPr>
+      <w:r>
+        <w:t xml:space="preserve">The same day I refused a fixed intervention schedule (“imagine it falls exactly when the optimiser is progressing well”), and added the answer that had been missing: at an alert the chemist may propose a point, let the optimiser continue, or </w:t>
+      </w:r>
+      <w:r>
+        <w:rPr>
+          <w:b/>
+        </w:rPr>
+        <w:t>stop the campaign</w:t>
+      </w:r>
+      <w:r>
+        <w:t>. Stopping is a decision only a human can take — we measured that stopping at the first alert saves twenty experiments and loses a third of the hypervolume — and the distribution of the three answers is itself a result.</w:t>
       </w:r>
     </w:p>
     <w:tbl>
       <w:tblPr>
-        <w:tblStyle w:val="LightGrid-Accent1"/>
         <w:tblW w:type="auto" w:w="0"/>
-        <w:jc w:val="center"/>
         <w:tblLook w:firstColumn="1" w:firstRow="1" w:lastColumn="0" w:lastRow="0" w:noHBand="0" w:noVBand="1" w:val="04A0"/>
       </w:tblPr>
       <w:tblGrid>
-        <w:gridCol w:w="1949"/>
-        <w:gridCol w:w="1949"/>
-        <w:gridCol w:w="1949"/>
-        <w:gridCol w:w="1949"/>
-        <w:gridCol w:w="1949"/>
+        <w:gridCol w:w="9632"/>
       </w:tblGrid>
       <w:tr>
         <w:tc>
           <w:tcPr>
-            <w:tcW w:type="dxa" w:w="1814"/>
+            <w:tcW w:type="dxa" w:w="9632"/>
+            <w:shd w:val="clear" w:color="auto" w:fill="FBE9DF"/>
           </w:tcPr>
           <w:p>
             <w:r/>
             <w:r>
               <w:rPr>
                 <w:b/>
-                <w:sz w:val="18"/>
+                <w:i/>
+                <w:color w:val="E0672F"/>
+                <w:sz w:val="20"/>
               </w:rPr>
-              <w:t>Benchmark</w:t>
+              <w:t xml:space="preserve">What changed · </w:t>
             </w:r>
-          </w:p>
-        </w:tc>
-        <w:tc>
-          <w:tcPr>
-            <w:tcW w:type="dxa" w:w="3742"/>
-          </w:tcPr>
-          <w:p>
-            <w:r/>
             <w:r>
               <w:rPr>
-                <w:b/>
-                <w:sz w:val="18"/>
+                <w:i/>
+                <w:sz w:val="20"/>
               </w:rPr>
-              <w:t>Source</w:t>
-            </w:r>
-          </w:p>
-        </w:tc>
-        <w:tc>
-          <w:tcPr>
-            <w:tcW w:type="dxa" w:w="907"/>
-          </w:tcPr>
-          <w:p>
-            <w:r/>
-            <w:r>
-              <w:rPr>
-                <w:b/>
-                <w:sz w:val="18"/>
-              </w:rPr>
-              <w:t>Points</w:t>
-            </w:r>
-          </w:p>
-        </w:tc>
-        <w:tc>
-          <w:tcPr>
-            <w:tcW w:type="dxa" w:w="1474"/>
-          </w:tcPr>
-          <w:p>
-            <w:r/>
-            <w:r>
-              <w:rPr>
-                <w:b/>
-                <w:sz w:val="18"/>
-              </w:rPr>
-              <w:t>Objectives</w:t>
-            </w:r>
-          </w:p>
-        </w:tc>
-        <w:tc>
-          <w:tcPr>
-            <w:tcW w:type="dxa" w:w="1417"/>
-          </w:tcPr>
-          <w:p>
-            <w:r/>
-            <w:r>
-              <w:rPr>
-                <w:b/>
-                <w:sz w:val="18"/>
-              </w:rPr>
-              <w:t>Nature</w:t>
-            </w:r>
-          </w:p>
-        </w:tc>
-      </w:tr>
-      <w:tr>
-        <w:tc>
-          <w:tcPr>
-            <w:tcW w:type="dxa" w:w="1814"/>
-          </w:tcPr>
-          <w:p>
-            <w:r/>
-            <w:r>
-              <w:rPr>
-                <w:sz w:val="18"/>
-              </w:rPr>
-              <w:t>Suzuki I, II (III, IV blind)</w:t>
-            </w:r>
-          </w:p>
-        </w:tc>
-        <w:tc>
-          <w:tcPr>
-            <w:tcW w:type="dxa" w:w="3742"/>
-          </w:tcPr>
-          <w:p>
-            <w:r/>
-            <w:r>
-              <w:rPr>
-                <w:sz w:val="18"/>
-              </w:rPr>
-              <w:t>Reizman et al. 2016 → Olympus emulators → Minerva grids, verbatim</w:t>
-            </w:r>
-          </w:p>
-        </w:tc>
-        <w:tc>
-          <w:tcPr>
-            <w:tcW w:type="dxa" w:w="907"/>
-          </w:tcPr>
-          <w:p>
-            <w:r/>
-            <w:r>
-              <w:rPr>
-                <w:sz w:val="18"/>
-              </w:rPr>
-              <w:t>5,670</w:t>
-            </w:r>
-          </w:p>
-        </w:tc>
-        <w:tc>
-          <w:tcPr>
-            <w:tcW w:type="dxa" w:w="1474"/>
-          </w:tcPr>
-          <w:p>
-            <w:r/>
-            <w:r>
-              <w:rPr>
-                <w:sz w:val="18"/>
-              </w:rPr>
-              <w:t>yield, TON</w:t>
-            </w:r>
-          </w:p>
-        </w:tc>
-        <w:tc>
-          <w:tcPr>
-            <w:tcW w:type="dxa" w:w="1417"/>
-          </w:tcPr>
-          <w:p>
-            <w:r/>
-            <w:r>
-              <w:rPr>
-                <w:sz w:val="18"/>
-              </w:rPr>
-              <w:t>emulated, noiseless</w:t>
-            </w:r>
-          </w:p>
-        </w:tc>
-      </w:tr>
-      <w:tr>
-        <w:tc>
-          <w:tcPr>
-            <w:tcW w:type="dxa" w:w="1814"/>
-          </w:tcPr>
-          <w:p>
-            <w:r/>
-            <w:r>
-              <w:rPr>
-                <w:sz w:val="18"/>
-              </w:rPr>
-              <w:t>C–H arylation</w:t>
-            </w:r>
-          </w:p>
-        </w:tc>
-        <w:tc>
-          <w:tcPr>
-            <w:tcW w:type="dxa" w:w="3742"/>
-          </w:tcPr>
-          <w:p>
-            <w:r/>
-            <w:r>
-              <w:rPr>
-                <w:sz w:val="18"/>
-              </w:rPr>
-              <w:t>Shields et al. 2021 (reaction 3) + cost from Torres et al. 2022 (EDBO+); identical row for row</w:t>
-            </w:r>
-          </w:p>
-        </w:tc>
-        <w:tc>
-          <w:tcPr>
-            <w:tcW w:type="dxa" w:w="907"/>
-          </w:tcPr>
-          <w:p>
-            <w:r/>
-            <w:r>
-              <w:rPr>
-                <w:sz w:val="18"/>
-              </w:rPr>
-              <w:t>1,728</w:t>
-            </w:r>
-          </w:p>
-        </w:tc>
-        <w:tc>
-          <w:tcPr>
-            <w:tcW w:type="dxa" w:w="1474"/>
-          </w:tcPr>
-          <w:p>
-            <w:r/>
-            <w:r>
-              <w:rPr>
-                <w:sz w:val="18"/>
-              </w:rPr>
-              <w:t>yield, reagent cost</w:t>
-            </w:r>
-          </w:p>
-        </w:tc>
-        <w:tc>
-          <w:tcPr>
-            <w:tcW w:type="dxa" w:w="1417"/>
-          </w:tcPr>
-          <w:p>
-            <w:r/>
-            <w:r>
-              <w:rPr>
-                <w:sz w:val="18"/>
-              </w:rPr>
-              <w:t>measured, single runs</w:t>
+              <w:t>Three reactions, three answers. The human study now has a shape.</w:t>
             </w:r>
           </w:p>
         </w:tc>
@@ -790,36 +414,23 @@
     </w:p>
     <w:p>
       <w:pPr>
-        <w:spacing w:after="120"/>
+        <w:pStyle w:val="Heading1"/>
       </w:pPr>
       <w:r>
-        <w:t xml:space="preserve">Two facts that shape the reading: Summit's independent emulators put the Suzuki front on the </w:t>
-      </w:r>
-      <w:r>
-        <w:rPr>
-          <w:b/>
-        </w:rPr>
-        <w:t>same catalyst</w:t>
-      </w:r>
-      <w:r>
-        <w:t xml:space="preserve"> as Olympus in all four cases (PCy3 for case II, as in the paper); and the arylation has </w:t>
-      </w:r>
-      <w:r>
-        <w:rPr>
-          <w:b/>
-        </w:rPr>
-        <w:t>tied acquisition values</w:t>
-      </w:r>
-      <w:r>
-        <w:t xml:space="preserve"> (175 of 1,698 candidates at experiment 30), so an unaided campaign ends as an alphabetical sweep. Suzuki has no ties.</w:t>
+        <w:t>Thursday 10 — freezing the trigger, and a bug that would have voided the design</w:t>
       </w:r>
     </w:p>
     <w:p>
       <w:pPr>
-        <w:pStyle w:val="Heading1"/>
+        <w:spacing w:after="60"/>
       </w:pPr>
       <w:r>
-        <w:t>3 · Plain BO fails often enough to study</w:t>
+        <w:rPr>
+          <w:b/>
+          <w:color w:val="176F8B"/>
+          <w:sz w:val="22"/>
+        </w:rPr>
+        <w:t>With the trigger's form settled, what window, what threshold, and is any of this reproducible?</w:t>
       </w:r>
     </w:p>
     <w:p>
@@ -827,34 +438,16 @@
         <w:spacing w:after="120"/>
       </w:pPr>
       <w:r>
-        <w:t xml:space="preserve">Twenty replayable controls per benchmark (10 LHS + 30 qLogNEHVI steps). Trapped, i.e. below 90 % of the front: </w:t>
+        <w:t>We plotted where P</w:t>
       </w:r>
       <w:r>
         <w:rPr>
-          <w:b/>
+          <w:i/>
         </w:rPr>
-        <w:t>13/20 on Suzuki II</w:t>
+        <w:t xml:space="preserve"> fires on every campaign for each candidate setting, and I read the plots against a rule I had not written down before: **after the ten initial points there must be five optimiser proposals before the trigger may speak** — a chemist is not asked to judge three experiments. Then window and threshold together: at W = 5, a threshold of 0.10 left four campaigns silent, two of them failures; 0.30 alerted 13 of 13 failed case II campaigns at 2.5 solicitations each, first alert at 22.6 with a quarter of the gain still to come, and the one campaign never interrupted was the one that reached 100 %. I hesitated between my original ratio and P</w:t>
       </w:r>
       <w:r>
-        <w:t xml:space="preserve"> (PCy3 drawn at 0 % yield in the initial design, never revisited), </w:t>
-      </w:r>
-      <w:r>
-        <w:rPr>
-          <w:b/>
-        </w:rPr>
-        <w:t>5/20 on Suzuki I</w:t>
-      </w:r>
-      <w:r>
-        <w:t xml:space="preserve"> (Xantphos dismissed the same way, usually rediscovered too late), </w:t>
-      </w:r>
-      <w:r>
-        <w:rPr>
-          <w:b/>
-        </w:rPr>
-        <w:t>10/20 on the arylation</w:t>
-      </w:r>
-      <w:r>
-        <w:t xml:space="preserve"> (an early good yield, then a plateau).</w:t>
+        <w:t xml:space="preserve"> — they detect the same campaigns — and kept P* because its threshold does not change meaning with the budget. W = 5, 0.30, cooldown 5.</w:t>
       </w:r>
     </w:p>
     <w:p>
@@ -864,7 +457,7 @@
       <w:r>
         <w:drawing>
           <wp:inline xmlns:a="http://schemas.openxmlformats.org/drawingml/2006/main" xmlns:pic="http://schemas.openxmlformats.org/drawingml/2006/picture">
-            <wp:extent cx="5940000" cy="3768828"/>
+            <wp:extent cx="5760000" cy="3339475"/>
             <wp:docPr id="2" name="Picture 2"/>
             <wp:cNvGraphicFramePr>
               <a:graphicFrameLocks noChangeAspect="1"/>
@@ -873,7 +466,7 @@
               <a:graphicData uri="http://schemas.openxmlformats.org/drawingml/2006/picture">
                 <pic:pic>
                   <pic:nvPicPr>
-                    <pic:cNvPr id="0" name="seed_choice_ii.png"/>
+                    <pic:cNvPr id="0" name="firings_ii_pace_ratio_W5_cd5_s030.png"/>
                     <pic:cNvPicPr/>
                   </pic:nvPicPr>
                   <pic:blipFill>
@@ -885,7 +478,7 @@
                   <pic:spPr>
                     <a:xfrm>
                       <a:off x="0" y="0"/>
-                      <a:ext cx="5940000" cy="3768828"/>
+                      <a:ext cx="5760000" cy="3339475"/>
                     </a:xfrm>
                     <a:prstGeom prst="rect"/>
                   </pic:spPr>
@@ -905,15 +498,7 @@
           <w:color w:val="5A6876"/>
           <w:sz w:val="18"/>
         </w:rPr>
-        <w:t>Suzuki II, 20 controls: fraction of the front (orange &lt; 90 %), initial design in grey, trigger alerts in red. Seed 12 is assigned to the chemists.</w:t>
-      </w:r>
-    </w:p>
-    <w:p>
-      <w:pPr>
-        <w:pStyle w:val="Heading1"/>
-      </w:pPr>
-      <w:r>
-        <w:t>4 · The trigger, frozen</w:t>
+        <w:t>P* with the frozen settings on 18 case II campaigns: fraction of the front above, the signal against its threshold below, ▼ an alert. It fires on failures, and on some successes: it books, it does not diagnose.</w:t>
       </w:r>
     </w:p>
     <w:p>
@@ -921,101 +506,16 @@
         <w:spacing w:after="120"/>
       </w:pPr>
       <w:r>
-        <w:rPr>
-          <w:b/>
-        </w:rPr>
-        <w:t>P\* = recent pace / average pace</w:t>
-      </w:r>
-      <w:r>
-        <w:t xml:space="preserve"> (both per experiment), </w:t>
-      </w:r>
-      <w:r>
-        <w:rPr>
-          <w:b/>
-        </w:rPr>
-        <w:t>W = 5, threshold 0.30, cooldown 5, first alert at experiment 15</w:t>
-      </w:r>
-      <w:r>
-        <w:t>, no deadline. P</w:t>
+        <w:t xml:space="preserve">I also stated the research question as I wanted it answered — </w:t>
       </w:r>
       <w:r>
         <w:rPr>
           <w:i/>
         </w:rPr>
-        <w:t xml:space="preserve"> replaces the original ratio because its threshold does not depend on the budget: P</w:t>
+        <w:t>does intervening when the trigger says so improve a campaign, in time and in quality?</w:t>
       </w:r>
       <w:r>
-        <w:t xml:space="preserve"> is 1 under steady progress at any budget. On 18 case II campaigns it alerts 13 of 13 failures, first alert at 22.6 with 26 % of the final gain still to come, 2.5 solicitations each; the only campaign never interrupted reaches 100 %. It also fires on healthy campaigns: it books an appointment, the chemist diagnoses — hence the three answers </w:t>
-      </w:r>
-      <w:r>
-        <w:rPr>
-          <w:i/>
-        </w:rPr>
-        <w:t>continue / propose / stop</w:t>
-      </w:r>
-      <w:r>
-        <w:t>.</w:t>
-      </w:r>
-    </w:p>
-    <w:p>
-      <w:pPr>
-        <w:pStyle w:val="Heading1"/>
-      </w:pPr>
-      <w:r>
-        <w:t>5 · Reproducibility</w:t>
-      </w:r>
-    </w:p>
-    <w:p>
-      <w:pPr>
-        <w:spacing w:after="120"/>
-      </w:pPr>
-      <w:r>
-        <w:t xml:space="preserve">Identical runs diverged from experiment 26: REACTO built the BoFire strategy </w:t>
-      </w:r>
-      <w:r>
-        <w:rPr>
-          <w:b/>
-        </w:rPr>
-        <w:t>without a seed</w:t>
-      </w:r>
-      <w:r>
-        <w:t xml:space="preserve">, and BoFire then draws one from OS entropy at every acquisition step. </w:t>
-      </w:r>
-      <w:r>
-        <w:rPr>
-          <w:rFonts w:ascii="Consolas" w:hAnsi="Consolas"/>
-          <w:sz w:val="19"/>
-        </w:rPr>
-        <w:t>bayesian_optimization(..., seed=)</w:t>
-      </w:r>
-      <w:r>
-        <w:t xml:space="preserve"> now passes one (the application is unchanged when it is not given); the bench uses </w:t>
-      </w:r>
-      <w:r>
-        <w:rPr>
-          <w:rFonts w:ascii="Consolas" w:hAnsi="Consolas"/>
-          <w:sz w:val="19"/>
-        </w:rPr>
-        <w:t>100000 + 1000·seed + iteration</w:t>
-      </w:r>
-      <w:r>
-        <w:t>. Verified to twelve decimals; a fork without intervention reproduces its parent exactly. Everything was recomputed.</w:t>
-      </w:r>
-    </w:p>
-    <w:p>
-      <w:pPr>
-        <w:pStyle w:val="Heading1"/>
-      </w:pPr>
-      <w:r>
-        <w:t>6 · The random arm: the null model</w:t>
-      </w:r>
-    </w:p>
-    <w:p>
-      <w:pPr>
-        <w:spacing w:after="120"/>
-      </w:pPr>
-      <w:r>
-        <w:t xml:space="preserve">Three arms share their history up to the alert: plain BO, a </w:t>
+        <w:t xml:space="preserve"> — which fixed the design: three arms sharing the same history up to the alert, plain BO, a </w:t>
       </w:r>
       <w:r>
         <w:rPr>
@@ -1024,16 +524,86 @@
         <w:t>random</w:t>
       </w:r>
       <w:r>
-        <w:t xml:space="preserve"> grid point at every alert, a chemist's point. The injected point replaces the proposal (40 experiments in every arm). On the arylation, 20 controls and 40 branches (130 interventions): </w:t>
+        <w:t xml:space="preserve"> point at every alert (the null model), a chemist's point at every alert. A paired design like that only works if a fork without intervention reproduces its parent. It did not. I asked why, since one can seed BO. The cause was in REACTO: the BoFire strategy was built without a seed and drew one from operating-system entropy at every step. Fixed that afternoon, with a seed derived from the campaign and the iteration.</w:t>
+      </w:r>
+    </w:p>
+    <w:tbl>
+      <w:tblPr>
+        <w:tblW w:type="auto" w:w="0"/>
+        <w:tblLook w:firstColumn="1" w:firstRow="1" w:lastColumn="0" w:lastRow="0" w:noHBand="0" w:noVBand="1" w:val="04A0"/>
+      </w:tblPr>
+      <w:tblGrid>
+        <w:gridCol w:w="9632"/>
+      </w:tblGrid>
+      <w:tr>
+        <w:tc>
+          <w:tcPr>
+            <w:tcW w:type="dxa" w:w="9632"/>
+            <w:shd w:val="clear" w:color="auto" w:fill="FBE9DF"/>
+          </w:tcPr>
+          <w:p>
+            <w:r/>
+            <w:r>
+              <w:rPr>
+                <w:b/>
+                <w:i/>
+                <w:color w:val="E0672F"/>
+                <w:sz w:val="20"/>
+              </w:rPr>
+              <w:t xml:space="preserve">What changed · </w:t>
+            </w:r>
+            <w:r>
+              <w:rPr>
+                <w:i/>
+                <w:sz w:val="20"/>
+              </w:rPr>
+              <w:t>Frozen trigger, three-arm design, campaigns that replay to twelve decimals. The bench could finally compute the two arms that need no chemist.</w:t>
+            </w:r>
+          </w:p>
+        </w:tc>
+      </w:tr>
+    </w:tbl>
+    <w:p>
+      <w:pPr>
+        <w:spacing w:after="0"/>
+      </w:pPr>
+    </w:p>
+    <w:p>
+      <w:pPr>
+        <w:pStyle w:val="Heading1"/>
+      </w:pPr>
+      <w:r>
+        <w:t>Thursday night to Friday — what chance achieves at the alerts</w:t>
+      </w:r>
+    </w:p>
+    <w:p>
+      <w:pPr>
+        <w:spacing w:after="60"/>
+      </w:pPr>
+      <w:r>
+        <w:rPr>
+          <w:b/>
+          <w:color w:val="176F8B"/>
+          <w:sz w:val="22"/>
+        </w:rPr>
+        <w:t>Before asking chemists to beat the trigger, what does a random point at the same moments do?</w:t>
+      </w:r>
+    </w:p>
+    <w:p>
+      <w:pPr>
+        <w:spacing w:after="120"/>
+      </w:pPr>
+      <w:r>
+        <w:t xml:space="preserve">Twenty arylation controls and forty random branches, 130 interventions, each branch compared with its own parent. </w:t>
       </w:r>
       <w:r>
         <w:rPr>
           <w:b/>
         </w:rPr>
-        <w:t>paired gain +1.3 points; 18/40 branches improve, Wilson 95 % [31 %, 60 %]; range −27 to +23; no effect on time to 90 %</w:t>
+        <w:t>Paired gain +1.3 points; 18 branches of 40 improve, Wilson [31 %, 60 %]; range −27 to +23; no change in time to 90 %.</w:t>
       </w:r>
       <w:r>
-        <w:t xml:space="preserve"> (26.2 vs 26.4). The little gain comes from luck on the ligand: 19 % of injected points hit a front ligand and gained +3.2 vs +0.9.</w:t>
+        <w:t xml:space="preserve"> A random point moves a campaign a lot in both directions and on average almost not at all. That is the null I wanted: if the chemists beat it, it is expertise, not the effect of a shake. The only gain in it was luck on the ligand — one injected point in five hit a front ligand and those gained three times more.</w:t>
       </w:r>
     </w:p>
     <w:p>
@@ -1043,7 +613,7 @@
       <w:r>
         <w:drawing>
           <wp:inline xmlns:a="http://schemas.openxmlformats.org/drawingml/2006/main" xmlns:pic="http://schemas.openxmlformats.org/drawingml/2006/picture">
-            <wp:extent cx="5940000" cy="1408360"/>
+            <wp:extent cx="5760000" cy="1365682"/>
             <wp:docPr id="3" name="Picture 3"/>
             <wp:cNvGraphicFramePr>
               <a:graphicFrameLocks noChangeAspect="1"/>
@@ -1064,7 +634,7 @@
                   <pic:spPr>
                     <a:xfrm>
                       <a:off x="0" y="0"/>
-                      <a:ext cx="5940000" cy="1408360"/>
+                      <a:ext cx="5760000" cy="1365682"/>
                     </a:xfrm>
                     <a:prstGeom prst="rect"/>
                   </pic:spPr>
@@ -1074,11 +644,6 @@
           </wp:inline>
         </w:drawing>
       </w:r>
-    </w:p>
-    <w:p>
-      <w:pPr>
-        <w:spacing w:after="160"/>
-      </w:pPr>
     </w:p>
     <w:p>
       <w:pPr>
@@ -1128,7 +693,41 @@
           <w:color w:val="5A6876"/>
           <w:sz w:val="18"/>
         </w:rPr>
-        <w:t>Left: five arylation campaigns, plain BO (blue) and with a random point at each alert (red). Right: distribution of the paired gain over 40 branches.</w:t>
+        <w:t>Left: five arylation campaigns, plain BO in blue, the same with a random point at each alert in red. Right: the paired gain over forty branches.</w:t>
+      </w:r>
+    </w:p>
+    <w:p>
+      <w:pPr>
+        <w:spacing w:after="120"/>
+      </w:pPr>
+      <w:r>
+        <w:t xml:space="preserve">The number that stayed with me is not +1.3 but how it got there: +4.0 on eleven branches, +2.7 on nineteen, +1.3 on forty. A human arm with five chemists lives in that regime. </w:t>
+      </w:r>
+      <w:r>
+        <w:rPr>
+          <w:b/>
+        </w:rPr>
+        <w:t>I will not conclude on a mean over a dozen answers</w:t>
+      </w:r>
+      <w:r>
+        <w:t>; the comparison has to be paired, on the same checkpoints, against this arm.</w:t>
+      </w:r>
+    </w:p>
+    <w:p>
+      <w:pPr>
+        <w:spacing w:after="120"/>
+      </w:pPr>
+      <w:r>
+        <w:t xml:space="preserve">Friday went to the question I had been circling since Tuesday: how do chemists who do not code take part? An HTML form, an invitation page and a Colab notebook were all built and all rejected. The answer was the one I had rejected first for being more work: </w:t>
+      </w:r>
+      <w:r>
+        <w:rPr>
+          <w:b/>
+        </w:rPr>
+        <w:t>a page inside REACTO</w:t>
+      </w:r>
+      <w:r>
+        <w:t>, where a chemist types a name, watches the initial design, launches the optimiser, and is stopped by the trigger.</w:t>
       </w:r>
     </w:p>
     <w:tbl>
@@ -1137,28 +736,31 @@
         <w:tblLook w:firstColumn="1" w:firstRow="1" w:lastColumn="0" w:lastRow="0" w:noHBand="0" w:noVBand="1" w:val="04A0"/>
       </w:tblPr>
       <w:tblGrid>
-        <w:gridCol w:w="9746"/>
+        <w:gridCol w:w="9632"/>
       </w:tblGrid>
       <w:tr>
         <w:tc>
           <w:tcPr>
-            <w:tcW w:type="dxa" w:w="9746"/>
-            <w:shd w:val="clear" w:color="auto" w:fill="E9F3F7"/>
+            <w:tcW w:type="dxa" w:w="9632"/>
+            <w:shd w:val="clear" w:color="auto" w:fill="FBE9DF"/>
           </w:tcPr>
           <w:p>
             <w:r/>
             <w:r>
               <w:rPr>
                 <w:b/>
+                <w:i/>
+                <w:color w:val="E0672F"/>
                 <w:sz w:val="20"/>
               </w:rPr>
-              <w:t xml:space="preserve">Warning. </w:t>
+              <w:t xml:space="preserve">What changed · </w:t>
             </w:r>
             <w:r>
               <w:rPr>
+                <w:i/>
                 <w:sz w:val="20"/>
               </w:rPr>
-              <w:t>The estimate fell from +4.0 (11 branches) to +2.7 (19) to +1.3 (40). A human arm with five chemists is in that regime: compare paired, on the same checkpoints, never on a mean over a dozen answers.</w:t>
+              <w:t>The null is nearly zero. The chemists' page exists as a tested engine with a thin interface.</w:t>
             </w:r>
           </w:p>
         </w:tc>
@@ -1174,7 +776,20 @@
         <w:pStyle w:val="Heading1"/>
       </w:pPr>
       <w:r>
-        <w:t>7 · The initial design decides</w:t>
+        <w:t>Saturday 12 — what exactly are the chemists being asked to overturn?</w:t>
+      </w:r>
+    </w:p>
+    <w:p>
+      <w:pPr>
+        <w:spacing w:after="60"/>
+      </w:pPr>
+      <w:r>
+        <w:rPr>
+          <w:b/>
+          <w:color w:val="176F8B"/>
+          <w:sz w:val="22"/>
+        </w:rPr>
+        <w:t>When I say seed 2 is trapped — is that the initial design, or the optimiser's own randomness?</w:t>
       </w:r>
     </w:p>
     <w:p>
@@ -1182,25 +797,101 @@
         <w:spacing w:after="120"/>
       </w:pPr>
       <w:r>
-        <w:t xml:space="preserve">With the acquisition seedable, one initial design was rerun with four acquisition seeds: arylation seed 2 ends at </w:t>
+        <w:t xml:space="preserve">One integer had always seeded both. With the acquisition now seedable we held the initial design and varied the rest: arylation seed 2 ended at 72.5 % of the front four times out of four; Suzuki II seed 3 at 37.3 % four times out of four, one visit to PCy3 in thirty experiments each time. </w:t>
       </w:r>
       <w:r>
         <w:rPr>
           <w:b/>
         </w:rPr>
-        <w:t>72.5 % all four times</w:t>
+        <w:t>Given this optimiser, a campaign's fate is a function of its ten starting points.</w:t>
       </w:r>
       <w:r>
-        <w:t xml:space="preserve">, Suzuki II seed 3 at </w:t>
+        <w:t xml:space="preserve"> That made the article's frame obvious to me: not “does HITL help on average”, which five chemists cannot carry, but a </w:t>
       </w:r>
       <w:r>
         <w:rPr>
-          <w:b/>
+          <w:i/>
         </w:rPr>
-        <w:t>37.3 % all four times</w:t>
+        <w:t>case study on trapped initial designs</w:t>
       </w:r>
       <w:r>
-        <w:t>. Given this optimiser, the outcome is a function of the ten starting points.</w:t>
+        <w:t xml:space="preserve"> — base rate from the twenty seeds, then one trapped design per reaction, and three paired branches. Does a chemist called between experiments 15 and 22 get the campaign out of a trap that neither the optimiser nor chance leaves?</w:t>
+      </w:r>
+    </w:p>
+    <w:p>
+      <w:pPr>
+        <w:jc w:val="center"/>
+      </w:pPr>
+      <w:r>
+        <w:drawing>
+          <wp:inline xmlns:a="http://schemas.openxmlformats.org/drawingml/2006/main" xmlns:pic="http://schemas.openxmlformats.org/drawingml/2006/picture">
+            <wp:extent cx="5760000" cy="3654621"/>
+            <wp:docPr id="5" name="Picture 5"/>
+            <wp:cNvGraphicFramePr>
+              <a:graphicFrameLocks noChangeAspect="1"/>
+            </wp:cNvGraphicFramePr>
+            <a:graphic>
+              <a:graphicData uri="http://schemas.openxmlformats.org/drawingml/2006/picture">
+                <pic:pic>
+                  <pic:nvPicPr>
+                    <pic:cNvPr id="0" name="seed_choice_ii.png"/>
+                    <pic:cNvPicPr/>
+                  </pic:nvPicPr>
+                  <pic:blipFill>
+                    <a:blip r:embed="rId13"/>
+                    <a:stretch>
+                      <a:fillRect/>
+                    </a:stretch>
+                  </pic:blipFill>
+                  <pic:spPr>
+                    <a:xfrm>
+                      <a:off x="0" y="0"/>
+                      <a:ext cx="5760000" cy="3654621"/>
+                    </a:xfrm>
+                    <a:prstGeom prst="rect"/>
+                  </pic:spPr>
+                </pic:pic>
+              </a:graphicData>
+            </a:graphic>
+          </wp:inline>
+        </w:drawing>
+      </w:r>
+    </w:p>
+    <w:p>
+      <w:pPr>
+        <w:spacing w:after="160"/>
+      </w:pPr>
+      <w:r>
+        <w:rPr>
+          <w:color w:val="5A6876"/>
+          <w:sz w:val="18"/>
+        </w:rPr>
+        <w:t>Suzuki II, the twenty controls: orange campaigns end below 90 % of the front; red dashes are the alerts. The trapped ones all drew PCy3 at 0 % yield in the initial design. Seed 12 is the campaign the chemists receive.</w:t>
+      </w:r>
+    </w:p>
+    <w:p>
+      <w:pPr>
+        <w:spacing w:after="120"/>
+      </w:pPr>
+      <w:r>
+        <w:t>So we laid out all twenty controls per reaction, with what the initial design had shown of the winning ligand, and I chose: Suzuki II seed 12 (44 %, alert at 16, PCy3 seen once at 0 %), Suzuki I seed 8 (69 %, alert at 20, Xantphos seen at 40 °C, rediscovered too late), arylation seed 2 (72 %, alert at 16, a good ligand found at once and then nothing). Three different ways to be wrong.</w:t>
+      </w:r>
+    </w:p>
+    <w:p>
+      <w:pPr>
+        <w:spacing w:after="120"/>
+      </w:pPr>
+      <w:r>
+        <w:t xml:space="preserve">The rest of the day was spent being the first chemist. Opening the page in a browser exposed what HTTP tests could not (a callback the renderer refused, a race between ticks, catalyst codes in the menus where the table showed names); I asked for English, for the table to come first, for a resume list like the Optimization page, and for the chemistry — the reaction, the ligands drawn, the conditions, the prices per gram behind the cost objective — to be the first thing on screen, from the source figures rather than redrawn. Running the three campaigns myself showed the last gap: I never filled in </w:t>
+      </w:r>
+      <w:r>
+        <w:rPr>
+          <w:i/>
+        </w:rPr>
+        <w:t>why</w:t>
+      </w:r>
+      <w:r>
+        <w:t>. The field is optional; it should not be.</w:t>
       </w:r>
     </w:p>
     <w:tbl>
@@ -1209,341 +900,31 @@
         <w:tblLook w:firstColumn="1" w:firstRow="1" w:lastColumn="0" w:lastRow="0" w:noHBand="0" w:noVBand="1" w:val="04A0"/>
       </w:tblPr>
       <w:tblGrid>
-        <w:gridCol w:w="9746"/>
+        <w:gridCol w:w="9632"/>
       </w:tblGrid>
       <w:tr>
         <w:tc>
           <w:tcPr>
-            <w:tcW w:type="dxa" w:w="9746"/>
-            <w:shd w:val="clear" w:color="auto" w:fill="E9F3F7"/>
+            <w:tcW w:type="dxa" w:w="9632"/>
+            <w:shd w:val="clear" w:color="auto" w:fill="FBE9DF"/>
           </w:tcPr>
           <w:p>
             <w:r/>
             <w:r>
               <w:rPr>
                 <w:b/>
+                <w:i/>
+                <w:color w:val="E0672F"/>
                 <w:sz w:val="20"/>
               </w:rPr>
-              <w:t xml:space="preserve">Frame for the article. </w:t>
+              <w:t xml:space="preserve">What changed · </w:t>
             </w:r>
             <w:r>
               <w:rPr>
+                <w:i/>
                 <w:sz w:val="20"/>
               </w:rPr>
-              <w:t>A case study on trapped initial designs: base rate from the twenty seeds; on one trapped design per reaction, three paired branches. Question: does a chemist called between experiments 15 and 22 get the campaign out of a trap that neither the optimiser nor chance leaves?</w:t>
-            </w:r>
-          </w:p>
-        </w:tc>
-      </w:tr>
-    </w:tbl>
-    <w:p>
-      <w:pPr>
-        <w:spacing w:after="0"/>
-      </w:pPr>
-    </w:p>
-    <w:tbl>
-      <w:tblPr>
-        <w:tblStyle w:val="LightGrid-Accent1"/>
-        <w:tblW w:type="auto" w:w="0"/>
-        <w:jc w:val="center"/>
-        <w:tblLook w:firstColumn="1" w:firstRow="1" w:lastColumn="0" w:lastRow="0" w:noHBand="0" w:noVBand="1" w:val="04A0"/>
-      </w:tblPr>
-      <w:tblGrid>
-        <w:gridCol w:w="1949"/>
-        <w:gridCol w:w="1949"/>
-        <w:gridCol w:w="1949"/>
-        <w:gridCol w:w="1949"/>
-        <w:gridCol w:w="1949"/>
-      </w:tblGrid>
-      <w:tr>
-        <w:tc>
-          <w:tcPr>
-            <w:tcW w:type="dxa" w:w="1474"/>
-          </w:tcPr>
-          <w:p>
-            <w:r/>
-            <w:r>
-              <w:rPr>
-                <w:b/>
-                <w:sz w:val="18"/>
-              </w:rPr>
-              <w:t>Reaction</w:t>
-            </w:r>
-          </w:p>
-        </w:tc>
-        <w:tc>
-          <w:tcPr>
-            <w:tcW w:type="dxa" w:w="737"/>
-          </w:tcPr>
-          <w:p>
-            <w:r/>
-            <w:r>
-              <w:rPr>
-                <w:b/>
-                <w:sz w:val="18"/>
-              </w:rPr>
-              <w:t>Seed</w:t>
-            </w:r>
-          </w:p>
-        </w:tc>
-        <w:tc>
-          <w:tcPr>
-            <w:tcW w:type="dxa" w:w="1134"/>
-          </w:tcPr>
-          <w:p>
-            <w:r/>
-            <w:r>
-              <w:rPr>
-                <w:b/>
-                <w:sz w:val="18"/>
-              </w:rPr>
-              <w:t>Plain BO</w:t>
-            </w:r>
-          </w:p>
-        </w:tc>
-        <w:tc>
-          <w:tcPr>
-            <w:tcW w:type="dxa" w:w="1134"/>
-          </w:tcPr>
-          <w:p>
-            <w:r/>
-            <w:r>
-              <w:rPr>
-                <w:b/>
-                <w:sz w:val="18"/>
-              </w:rPr>
-              <w:t>First alert</w:t>
-            </w:r>
-          </w:p>
-        </w:tc>
-        <w:tc>
-          <w:tcPr>
-            <w:tcW w:type="dxa" w:w="4876"/>
-          </w:tcPr>
-          <w:p>
-            <w:r/>
-            <w:r>
-              <w:rPr>
-                <w:b/>
-                <w:sz w:val="18"/>
-              </w:rPr>
-              <w:t>The trap</w:t>
-            </w:r>
-          </w:p>
-        </w:tc>
-      </w:tr>
-      <w:tr>
-        <w:tc>
-          <w:tcPr>
-            <w:tcW w:type="dxa" w:w="1474"/>
-          </w:tcPr>
-          <w:p>
-            <w:r/>
-            <w:r>
-              <w:rPr>
-                <w:sz w:val="18"/>
-              </w:rPr>
-              <w:t>Suzuki I</w:t>
-            </w:r>
-          </w:p>
-        </w:tc>
-        <w:tc>
-          <w:tcPr>
-            <w:tcW w:type="dxa" w:w="737"/>
-          </w:tcPr>
-          <w:p>
-            <w:r/>
-            <w:r>
-              <w:rPr>
-                <w:sz w:val="18"/>
-              </w:rPr>
-              <w:t>8</w:t>
-            </w:r>
-          </w:p>
-        </w:tc>
-        <w:tc>
-          <w:tcPr>
-            <w:tcW w:type="dxa" w:w="1134"/>
-          </w:tcPr>
-          <w:p>
-            <w:r/>
-            <w:r>
-              <w:rPr>
-                <w:sz w:val="18"/>
-              </w:rPr>
-              <w:t>69 %</w:t>
-            </w:r>
-          </w:p>
-        </w:tc>
-        <w:tc>
-          <w:tcPr>
-            <w:tcW w:type="dxa" w:w="1134"/>
-          </w:tcPr>
-          <w:p>
-            <w:r/>
-            <w:r>
-              <w:rPr>
-                <w:sz w:val="18"/>
-              </w:rPr>
-              <w:t>20</w:t>
-            </w:r>
-          </w:p>
-        </w:tc>
-        <w:tc>
-          <w:tcPr>
-            <w:tcW w:type="dxa" w:w="4876"/>
-          </w:tcPr>
-          <w:p>
-            <w:r/>
-            <w:r>
-              <w:rPr>
-                <w:sz w:val="18"/>
-              </w:rPr>
-              <w:t>Xantphos seen at 40 °C → 0 %; rediscovered at 27, too late</w:t>
-            </w:r>
-          </w:p>
-        </w:tc>
-      </w:tr>
-      <w:tr>
-        <w:tc>
-          <w:tcPr>
-            <w:tcW w:type="dxa" w:w="1474"/>
-          </w:tcPr>
-          <w:p>
-            <w:r/>
-            <w:r>
-              <w:rPr>
-                <w:sz w:val="18"/>
-              </w:rPr>
-              <w:t>Suzuki II</w:t>
-            </w:r>
-          </w:p>
-        </w:tc>
-        <w:tc>
-          <w:tcPr>
-            <w:tcW w:type="dxa" w:w="737"/>
-          </w:tcPr>
-          <w:p>
-            <w:r/>
-            <w:r>
-              <w:rPr>
-                <w:sz w:val="18"/>
-              </w:rPr>
-              <w:t>12</w:t>
-            </w:r>
-          </w:p>
-        </w:tc>
-        <w:tc>
-          <w:tcPr>
-            <w:tcW w:type="dxa" w:w="1134"/>
-          </w:tcPr>
-          <w:p>
-            <w:r/>
-            <w:r>
-              <w:rPr>
-                <w:sz w:val="18"/>
-              </w:rPr>
-              <w:t>44 %</w:t>
-            </w:r>
-          </w:p>
-        </w:tc>
-        <w:tc>
-          <w:tcPr>
-            <w:tcW w:type="dxa" w:w="1134"/>
-          </w:tcPr>
-          <w:p>
-            <w:r/>
-            <w:r>
-              <w:rPr>
-                <w:sz w:val="18"/>
-              </w:rPr>
-              <w:t>16</w:t>
-            </w:r>
-          </w:p>
-        </w:tc>
-        <w:tc>
-          <w:tcPr>
-            <w:tcW w:type="dxa" w:w="4876"/>
-          </w:tcPr>
-          <w:p>
-            <w:r/>
-            <w:r>
-              <w:rPr>
-                <w:sz w:val="18"/>
-              </w:rPr>
-              <w:t>PCy3 seen once at 0 %; ends on XPhos</w:t>
-            </w:r>
-          </w:p>
-        </w:tc>
-      </w:tr>
-      <w:tr>
-        <w:tc>
-          <w:tcPr>
-            <w:tcW w:type="dxa" w:w="1474"/>
-          </w:tcPr>
-          <w:p>
-            <w:r/>
-            <w:r>
-              <w:rPr>
-                <w:sz w:val="18"/>
-              </w:rPr>
-              <w:t>C–H arylation</w:t>
-            </w:r>
-          </w:p>
-        </w:tc>
-        <w:tc>
-          <w:tcPr>
-            <w:tcW w:type="dxa" w:w="737"/>
-          </w:tcPr>
-          <w:p>
-            <w:r/>
-            <w:r>
-              <w:rPr>
-                <w:sz w:val="18"/>
-              </w:rPr>
-              <w:t>2</w:t>
-            </w:r>
-          </w:p>
-        </w:tc>
-        <w:tc>
-          <w:tcPr>
-            <w:tcW w:type="dxa" w:w="1134"/>
-          </w:tcPr>
-          <w:p>
-            <w:r/>
-            <w:r>
-              <w:rPr>
-                <w:sz w:val="18"/>
-              </w:rPr>
-              <w:t>72 %</w:t>
-            </w:r>
-          </w:p>
-        </w:tc>
-        <w:tc>
-          <w:tcPr>
-            <w:tcW w:type="dxa" w:w="1134"/>
-          </w:tcPr>
-          <w:p>
-            <w:r/>
-            <w:r>
-              <w:rPr>
-                <w:sz w:val="18"/>
-              </w:rPr>
-              <w:t>16</w:t>
-            </w:r>
-          </w:p>
-        </w:tc>
-        <w:tc>
-          <w:tcPr>
-            <w:tcW w:type="dxa" w:w="4876"/>
-          </w:tcPr>
-          <w:p>
-            <w:r/>
-            <w:r>
-              <w:rPr>
-                <w:sz w:val="18"/>
-              </w:rPr>
-              <w:t>77 % on CgMe-PPh at the start, then flat for 28 experiments</w:t>
+              <w:t>The study is now a question I can state in one sentence, on three campaigns I can name, on a page I have used.</w:t>
             </w:r>
           </w:p>
         </w:tc>
@@ -1559,49 +940,7 @@
         <w:pStyle w:val="Heading1"/>
       </w:pPr>
       <w:r>
-        <w:t>8 · The live page</w:t>
-      </w:r>
-    </w:p>
-    <w:p>
-      <w:pPr>
-        <w:spacing w:after="120"/>
-      </w:pPr>
-      <w:r>
-        <w:rPr>
-          <w:rFonts w:ascii="Consolas" w:hAnsi="Consolas"/>
-          <w:sz w:val="19"/>
-        </w:rPr>
-        <w:t>/hitl-live</w:t>
-      </w:r>
-      <w:r>
-        <w:t xml:space="preserve"> in REACTO: a chemist replays the assigned control experiment by experiment — identical for everyone until they act — and at each alert chooses </w:t>
-      </w:r>
-      <w:r>
-        <w:rPr>
-          <w:i/>
-        </w:rPr>
-        <w:t>continue / propose / stop</w:t>
-      </w:r>
-      <w:r>
-        <w:t xml:space="preserve">, with a justification. An imposed point switches the optimiser to live mode, seeded as the control. Everything is saved as a REACTO project and as JSON; a returning chemist resumes from a list, as on the Optimization page. The chemistry comes first (source scheme, conditions, prices per gram behind the cost objective), the sortable table next, plots last; no hypervolume or optimum is shown. Browser testing exposed and fixed three faults (a callback the renderer refused, a race between ticks, catalyst codes in the menus). L6 and L7 are now named PPh3 and P(t-Bu)3. </w:t>
-      </w:r>
-      <w:r>
-        <w:rPr>
-          <w:rFonts w:ascii="Consolas" w:hAnsi="Consolas"/>
-          <w:sz w:val="19"/>
-        </w:rPr>
-        <w:t>collect_live.py</w:t>
-      </w:r>
-      <w:r>
-        <w:t xml:space="preserve"> turns the chemists' files into two tables.</w:t>
-      </w:r>
-    </w:p>
-    <w:p>
-      <w:pPr>
-        <w:pStyle w:val="Heading1"/>
-      </w:pPr>
-      <w:r>
-        <w:t>9 · Open</w:t>
+        <w:t>Open for next week</w:t>
       </w:r>
     </w:p>
     <w:p>
@@ -1610,7 +949,7 @@
         <w:spacing w:after="40"/>
       </w:pPr>
       <w:r>
-        <w:t>Make the justification mandatory (13 of 13 trial decisions carry none).</w:t>
+        <w:t>Make the justification mandatory.</w:t>
       </w:r>
     </w:p>
     <w:p>
@@ -1619,7 +958,7 @@
         <w:spacing w:after="40"/>
       </w:pPr>
       <w:r>
-        <w:t>How to compare a stopped campaign with a 40-experiment control.</w:t>
+        <w:t>How to compare a stopped campaign with a control that spent 40 experiments.</w:t>
       </w:r>
     </w:p>
     <w:p>
@@ -1628,7 +967,7 @@
         <w:spacing w:after="40"/>
       </w:pPr>
       <w:r>
-        <w:t>Random branches on Suzuki, and enough draws at the first alert for percentiles.</w:t>
+        <w:t>Random branches on Suzuki, and enough draws at the first alert to place a chemist's answer on a percentile.</w:t>
       </w:r>
     </w:p>
     <w:p>
@@ -1637,7 +976,7 @@
         <w:spacing w:after="40"/>
       </w:pPr>
       <w:r>
-        <w:t>Rights: the Nature figure needs permission for the article (a redrawn scheme is kept); the four-case scheme still needs its source credited.</w:t>
+        <w:t>Rights for the Nature figure in the article; the source of the four-case Suzuki scheme still to be credited.</w:t>
       </w:r>
     </w:p>
     <w:p>
@@ -1649,12 +988,12 @@
           <w:color w:val="5A6876"/>
           <w:sz w:val="18"/>
         </w:rPr>
-        <w:t>Details, numbers and decisions: hitl_bench/CLAUDE.md, data/README.md, results/arms_report_*.md, docs/nuit_du_10_septembre.md.</w:t>
+        <w:t>Numbers, decisions and their dates: hitl_bench/CLAUDE.md; provenance: data/README.md; arm reports: results/arms_report_*.md; night report: docs/nuit_du_10_septembre.md.</w:t>
       </w:r>
     </w:p>
     <w:sectPr>
       <w:pgSz w:w="12240" w:h="15840"/>
-      <w:pgMar w:top="1134" w:right="1247" w:bottom="1134" w:left="1247" w:header="720" w:footer="720" w:gutter="0"/>
+      <w:pgMar w:top="1134" w:right="1304" w:bottom="1134" w:left="1304" w:header="720" w:footer="720" w:gutter="0"/>
       <w:cols w:space="720"/>
       <w:docGrid w:linePitch="360"/>
     </w:sectPr>
@@ -2093,7 +1432,7 @@
       <w:b/>
       <w:bCs/>
       <w:color w:val="176F8B"/>
-      <w:sz w:val="28"/>
+      <w:sz w:val="27"/>
       <w:szCs w:val="28"/>
     </w:rPr>
   </w:style>
@@ -2113,11 +1452,11 @@
       <w:outlineLvl w:val="1"/>
     </w:pPr>
     <w:rPr>
-      <w:rFonts w:asciiTheme="majorHAnsi" w:eastAsiaTheme="majorEastAsia" w:hAnsiTheme="majorHAnsi" w:cstheme="majorBidi" w:ascii="Calibri" w:hAnsi="Calibri"/>
+      <w:rFonts w:asciiTheme="majorHAnsi" w:eastAsiaTheme="majorEastAsia" w:hAnsiTheme="majorHAnsi" w:cstheme="majorBidi"/>
       <w:b/>
       <w:bCs/>
-      <w:color w:val="176F8B"/>
-      <w:sz w:val="24"/>
+      <w:color w:val="4F81BD" w:themeColor="accent1"/>
+      <w:sz w:val="26"/>
       <w:szCs w:val="26"/>
     </w:rPr>
   </w:style>

</xml_diff>

<commit_message>
Weekly report: follow the question step by step, in plain language, no calendar
Co-Authored-By: Claude Opus 5 <noreply@anthropic.com>
Claude-Session: https://claude.ai/code/session_018JAoc1BQgQ82dR8t2BxgrR
</commit_message>
<xml_diff>
--- a/hitl_bench/docs/report_week_2026-09-07.docx
+++ b/hitl_bench/docs/report_week_2026-09-07.docx
@@ -31,7 +31,7 @@
           <w:color w:val="5A6876"/>
           <w:sz w:val="22"/>
         </w:rPr>
-        <w:t>I started the week with an emulator that did not run, a trigger I could not justify and no way to show any of it to a chemist. I ended it with three reactions, a trigger whose threshold means the same thing at any budget, a null model measured on forty branches, and a REACTO page on which my colleagues can be handed a campaign that Bayesian optimisation gets wrong. This is how one led to the next.</w:t>
+        <w:t>The study asks a simple question: when a chemist steps into a Bayesian optimisation campaign at the moment an alarm says “this is not progressing”, does the campaign end better? This report follows that question through the week — what I needed to settle before it could be asked properly, and what each answer changed.</w:t>
       </w:r>
     </w:p>
     <w:p>
@@ -51,7 +51,7 @@
         <w:pStyle w:val="Heading1"/>
       </w:pPr>
       <w:r>
-        <w:t>Monday 7 — where to build, and on what</w:t>
+        <w:t>A benchmark I can trust</w:t>
       </w:r>
     </w:p>
     <w:p>
@@ -64,7 +64,7 @@
           <w:color w:val="176F8B"/>
           <w:sz w:val="22"/>
         </w:rPr>
-        <w:t>Can I trust the benchmark I already have, and where should the study live?</w:t>
+        <w:t>First problem: I could not measure anything reliably.</w:t>
       </w:r>
     </w:p>
     <w:p>
@@ -72,16 +72,16 @@
         <w:spacing w:after="120"/>
       </w:pPr>
       <w:r>
-        <w:t xml:space="preserve">My earlier bench ran on Olympus emulators of the Reizman Suzuki campaigns, in its own folder, with its own copy of the optimisation code and a Python environment that turned out to be dead. Repairing Olympus took three patches before it ran at all. The question that settled things was simpler than repairing anything: </w:t>
+        <w:t xml:space="preserve">To test an optimiser you need a reaction whose </w:t>
       </w:r>
       <w:r>
         <w:rPr>
-          <w:b/>
+          <w:i/>
         </w:rPr>
-        <w:t>Minerva already publishes the emulators evaluated on a complete grid</w:t>
+        <w:t>every</w:t>
       </w:r>
       <w:r>
-        <w:t xml:space="preserve"> (5,670 conditions per case, yields included). A grid needs no emulator, gives an exact Pareto front, and makes a campaign reproducible to the decimal. We checked the four grids against the repaired Olympus (r ≥ 0.997) and kept them.</w:t>
+        <w:t xml:space="preserve"> possible condition is already known, so that the best achievable result is known in advance and any campaign can be scored as “it reached X % of the best possible”. My earlier set-up predicted each condition with a model that was hard to run and lived outside REACTO, with its own copy of the optimisation code.</w:t>
       </w:r>
     </w:p>
     <w:p>
@@ -89,26 +89,25 @@
         <w:spacing w:after="120"/>
       </w:pPr>
       <w:r>
-        <w:t xml:space="preserve">The second decision followed from the first. If the study is about what </w:t>
+        <w:t xml:space="preserve">Two decisions fixed this. </w:t>
       </w:r>
       <w:r>
         <w:rPr>
-          <w:i/>
+          <w:b/>
         </w:rPr>
-        <w:t>my</w:t>
+        <w:t>Use published grids</w:t>
       </w:r>
       <w:r>
-        <w:t xml:space="preserve"> optimiser does, the bench must call it, not a copy. So the work moved into REACTO's own repository and imports its </w:t>
+        <w:t xml:space="preserve"> — the Minerva benchmark publishes the four Reizman Suzuki reactions as complete tables (5,670 conditions each, 7 catalysts × time × temperature × loading), so no model is needed. And </w:t>
       </w:r>
       <w:r>
         <w:rPr>
-          <w:rFonts w:ascii="Consolas" w:hAnsi="Consolas"/>
-          <w:sz w:val="19"/>
+          <w:b/>
         </w:rPr>
-        <w:t>bayesian_optimization()</w:t>
+        <w:t>put the bench inside REACTO</w:t>
       </w:r>
       <w:r>
-        <w:t>; Olympus, TensorFlow 1.15 and the extra environment left with the old folder. By the evening, five case II campaigns had reproduced the bimodality I knew from my notebook — 37–56 % of the front when the optimiser settles on XPhos, 97–100 % when it finds PCy3 — on the real tool this time.</w:t>
+        <w:t>, calling REACTO's own optimiser rather than a copy: whatever the study concludes is then about the tool the chemists will actually use.</w:t>
       </w:r>
     </w:p>
     <w:tbl>
@@ -141,7 +140,7 @@
                 <w:i/>
                 <w:sz w:val="20"/>
               </w:rPr>
-              <w:t>One optimiser, one repository, exact fronts. Everything measured after this point is measured on the thing the chemists will use.</w:t>
+              <w:t>Every number in this report is now the fraction of the best achievable result, on the real tool.</w:t>
             </w:r>
           </w:p>
         </w:tc>
@@ -157,7 +156,7 @@
         <w:pStyle w:val="Heading1"/>
       </w:pPr>
       <w:r>
-        <w:t>Tuesday 8 — can a signal tell a trapped campaign from a good one?</w:t>
+        <w:t>Does the optimiser really get stuck?</w:t>
       </w:r>
     </w:p>
     <w:p>
@@ -170,7 +169,7 @@
           <w:color w:val="176F8B"/>
           <w:sz w:val="22"/>
         </w:rPr>
-        <w:t>My trigger fired on a cadence; was it reading anything?</w:t>
+        <w:t>I remembered a trap on Suzuki case II. Was it real, and how often does it happen?</w:t>
       </w:r>
     </w:p>
     <w:p>
@@ -178,16 +177,67 @@
         <w:spacing w:after="120"/>
       </w:pPr>
       <w:r>
-        <w:t xml:space="preserve">I had brought a trigger — recent gain over total gain, a threshold, a cooldown — and a family of alternatives (plateau length, the surrogate's over-optimism, collapsed uncertainty, the acquisition value). We measured all of them on the campaigns. </w:t>
+        <w:t xml:space="preserve">A campaign is 40 experiments: 10 conditions drawn at random to start, then 30 chosen by the optimiser one at a time. We ran 20 such campaigns per reaction, each from a different random start. On Suzuki II, </w:t>
       </w:r>
       <w:r>
         <w:rPr>
           <w:b/>
         </w:rPr>
-        <w:t>None separates a campaign converging on the right catalyst from one converging on the wrong one.</w:t>
+        <w:t>13 campaigns out of 20 ended below 90 % of the best result</w:t>
       </w:r>
       <w:r>
-        <w:t xml:space="preserve"> Progress, ligand coverage, concentration: identical in both; only the identity of the ligand differs, and that is what the campaign cannot know. Worse, my trigger's condition held in 46 % of experiments, so the cooldown, not the signal, set when it fired.</w:t>
+        <w:t xml:space="preserve"> — every one of them because the winning catalyst (PCy3) had been tried once in the random start at a low temperature, gave 0 % yield, and was never tried again. On Suzuki I it happened 5 times out of 20; on the C–H arylation, 10 times out of 20.</w:t>
+      </w:r>
+    </w:p>
+    <w:p>
+      <w:pPr>
+        <w:jc w:val="center"/>
+      </w:pPr>
+      <w:r>
+        <w:drawing>
+          <wp:inline xmlns:a="http://schemas.openxmlformats.org/drawingml/2006/main" xmlns:pic="http://schemas.openxmlformats.org/drawingml/2006/picture">
+            <wp:extent cx="5760000" cy="3654621"/>
+            <wp:docPr id="1" name="Picture 1"/>
+            <wp:cNvGraphicFramePr>
+              <a:graphicFrameLocks noChangeAspect="1"/>
+            </wp:cNvGraphicFramePr>
+            <a:graphic>
+              <a:graphicData uri="http://schemas.openxmlformats.org/drawingml/2006/picture">
+                <pic:pic>
+                  <pic:nvPicPr>
+                    <pic:cNvPr id="0" name="seed_choice_ii.png"/>
+                    <pic:cNvPicPr/>
+                  </pic:nvPicPr>
+                  <pic:blipFill>
+                    <a:blip r:embed="rId9"/>
+                    <a:stretch>
+                      <a:fillRect/>
+                    </a:stretch>
+                  </pic:blipFill>
+                  <pic:spPr>
+                    <a:xfrm>
+                      <a:off x="0" y="0"/>
+                      <a:ext cx="5760000" cy="3654621"/>
+                    </a:xfrm>
+                    <a:prstGeom prst="rect"/>
+                  </pic:spPr>
+                </pic:pic>
+              </a:graphicData>
+            </a:graphic>
+          </wp:inline>
+        </w:drawing>
+      </w:r>
+    </w:p>
+    <w:p>
+      <w:pPr>
+        <w:spacing w:after="160"/>
+      </w:pPr>
+      <w:r>
+        <w:rPr>
+          <w:color w:val="5A6876"/>
+          <w:sz w:val="18"/>
+        </w:rPr>
+        <w:t>Suzuki II, 20 campaigns from 20 random starts. Each panel shows how close the campaign is to the best achievable result after each experiment; orange campaigns end below 90 %. The grey band is the random start; the red dashes are where the alarm fires (next section).</w:t>
       </w:r>
     </w:p>
     <w:p>
@@ -195,16 +245,7 @@
         <w:spacing w:after="120"/>
       </w:pPr>
       <w:r>
-        <w:t xml:space="preserve">That result changed what I could ask of a trigger. If nothing diagnoses, the trigger cannot decide; it can only </w:t>
-      </w:r>
-      <w:r>
-        <w:rPr>
-          <w:b/>
-        </w:rPr>
-        <w:t>book an appointment</w:t>
-      </w:r>
-      <w:r>
-        <w:t xml:space="preserve"> with someone who can. The asymmetry makes that acceptable: interrupting a healthy campaign costs one experiment in thirty, missing a trapped one costs fifty points of front. We kept my signal's shape but corrected its denominator — recent pace over the campaign's own average pace, P* — because the original ratio decays on its own under steady progress and its threshold silently encodes a firing time.</w:t>
+        <w:t>So the trap is real, frequent, and it is a chemistry trap: a good catalyst judged on one bad condition. That is exactly the kind of mistake a chemist might catch.</w:t>
       </w:r>
     </w:p>
     <w:tbl>
@@ -237,7 +278,7 @@
                 <w:i/>
                 <w:sz w:val="20"/>
               </w:rPr>
-              <w:t>The trigger books, the chemist diagnoses. The study's question moved from “can we detect a trap?” to “what does a chemist do when called?”</w:t>
+              <w:t>There is something for a chemist to fix, and often enough to measure.</w:t>
             </w:r>
           </w:p>
         </w:tc>
@@ -253,7 +294,7 @@
         <w:pStyle w:val="Heading1"/>
       </w:pPr>
       <w:r>
-        <w:t>Wednesday 9 — which reactions, and what the chemist may answer</w:t>
+        <w:t>Can we tell when a campaign is stuck?</w:t>
       </w:r>
     </w:p>
     <w:p>
@@ -266,7 +307,7 @@
           <w:color w:val="176F8B"/>
           <w:sz w:val="22"/>
         </w:rPr>
-        <w:t>Suzuki case II was the only trap I knew. Was it the only one worth showing?</w:t>
+        <w:t>I had an alarm of my own. Did it detect the trap?</w:t>
       </w:r>
     </w:p>
     <w:p>
@@ -274,67 +315,25 @@
         <w:spacing w:after="120"/>
       </w:pPr>
       <w:r>
-        <w:t xml:space="preserve">Overnight, nine more complete grids were screened with the same optimiser. I did not want the reaction where BO does best on average; I wanted the one where </w:t>
+        <w:t xml:space="preserve">We tested my alarm and several others (a flat curve, an over-confident model, the value of the next proposal…) on campaigns we knew to be trapped or not. </w:t>
       </w:r>
       <w:r>
         <w:rPr>
           <w:b/>
         </w:rPr>
-        <w:t>the outcome depends on the initial draw</w:t>
+        <w:t>None of them can tell a trapped campaign from a healthy one that is simply slowing down.</w:t>
       </w:r>
       <w:r>
-        <w:t>, because that is the only place a chemist can change something. The spread between the worst and the best seed became the selection criterion, with two hard constraints: a complete grid, and reagents with names a chemist can argue about.</w:t>
+        <w:t xml:space="preserve"> From the inside, both look the same: progress slows, all catalysts have been tried, the model is confident. Only the </w:t>
       </w:r>
-    </w:p>
-    <w:p>
-      <w:pPr>
-        <w:jc w:val="center"/>
-      </w:pPr>
-      <w:r>
-        <w:drawing>
-          <wp:inline xmlns:a="http://schemas.openxmlformats.org/drawingml/2006/main" xmlns:pic="http://schemas.openxmlformats.org/drawingml/2006/picture">
-            <wp:extent cx="5760000" cy="2688000"/>
-            <wp:docPr id="1" name="Picture 1"/>
-            <wp:cNvGraphicFramePr>
-              <a:graphicFrameLocks noChangeAspect="1"/>
-            </wp:cNvGraphicFramePr>
-            <a:graphic>
-              <a:graphicData uri="http://schemas.openxmlformats.org/drawingml/2006/picture">
-                <pic:pic>
-                  <pic:nvPicPr>
-                    <pic:cNvPr id="0" name="spread.png"/>
-                    <pic:cNvPicPr/>
-                  </pic:nvPicPr>
-                  <pic:blipFill>
-                    <a:blip r:embed="rId9"/>
-                    <a:stretch>
-                      <a:fillRect/>
-                    </a:stretch>
-                  </pic:blipFill>
-                  <pic:spPr>
-                    <a:xfrm>
-                      <a:off x="0" y="0"/>
-                      <a:ext cx="5760000" cy="2688000"/>
-                    </a:xfrm>
-                    <a:prstGeom prst="rect"/>
-                  </pic:spPr>
-                </pic:pic>
-              </a:graphicData>
-            </a:graphic>
-          </wp:inline>
-        </w:drawing>
-      </w:r>
-    </w:p>
-    <w:p>
-      <w:pPr>
-        <w:spacing w:after="160"/>
-      </w:pPr>
       <w:r>
         <w:rPr>
-          <w:color w:val="5A6876"/>
-          <w:sz w:val="18"/>
+          <w:i/>
         </w:rPr>
-        <w:t>Spread between the worst and best plain-BO campaign, in points of the global front (3–5 seeds). Suzuki II and I, and the EDBO+ C–H arylation, were kept.</w:t>
+        <w:t>name</w:t>
+      </w:r>
+      <w:r>
+        <w:t xml:space="preserve"> of the catalyst differs, and that is what no signal can read.</w:t>
       </w:r>
     </w:p>
     <w:p>
@@ -342,16 +341,16 @@
         <w:spacing w:after="120"/>
       </w:pPr>
       <w:r>
-        <w:t xml:space="preserve">Three survived: Suzuki II (63 points of spread, a categorical trap), Suzuki I (45), and the C–H arylation of EDBO+ — 1,728 conditions all </w:t>
+        <w:t xml:space="preserve">That changed what the alarm is for. It cannot decide; it can only </w:t>
       </w:r>
       <w:r>
         <w:rPr>
-          <w:i/>
+          <w:b/>
         </w:rPr>
-        <w:t>measured</w:t>
+        <w:t>call the chemist</w:t>
       </w:r>
       <w:r>
-        <w:t xml:space="preserve"> at Bristol Myers Squibb, with two independent objectives, yield and reagent cost, where the Suzuki pair is redundant. I decided to stop working on Suzuki alone: it had given what it could.</w:t>
+        <w:t>, who can. And calling is cheap: interrupting a healthy campaign costs one experiment in thirty, while a trap costs half the result. So the alarm should fire whenever progress stalls, and the chemist decides what it means.</w:t>
       </w:r>
     </w:p>
     <w:p>
@@ -359,16 +358,51 @@
         <w:spacing w:after="120"/>
       </w:pPr>
       <w:r>
-        <w:t xml:space="preserve">The same day I refused a fixed intervention schedule (“imagine it falls exactly when the optimiser is progressing well”), and added the answer that had been missing: at an alert the chemist may propose a point, let the optimiser continue, or </w:t>
+        <w:t xml:space="preserve">The alarm I kept is my original idea with one correction. It compares </w:t>
       </w:r>
       <w:r>
         <w:rPr>
           <w:b/>
         </w:rPr>
-        <w:t>stop the campaign</w:t>
+        <w:t>how fast the campaign improved over the last five experiments</w:t>
       </w:r>
       <w:r>
-        <w:t>. Stopping is a decision only a human can take — we measured that stopping at the first alert saves twenty experiments and loses a third of the hypervolume — and the distribution of the three answers is itself a result.</w:t>
+        <w:t xml:space="preserve"> with </w:t>
+      </w:r>
+      <w:r>
+        <w:rPr>
+          <w:b/>
+        </w:rPr>
+        <w:t>how fast it improved on average since the start</w:t>
+      </w:r>
+      <w:r>
+        <w:t xml:space="preserve">. If the recent pace drops below 30 % of the usual pace, the chemist is called. It cannot fire before experiment 15 (a chemist should not be asked to judge fewer than five optimiser choices) nor more than once every five experiments. The correction: my first version divided by the </w:t>
+      </w:r>
+      <w:r>
+        <w:rPr>
+          <w:i/>
+        </w:rPr>
+        <w:t>total</w:t>
+      </w:r>
+      <w:r>
+        <w:t xml:space="preserve"> gain, which shrinks by itself as a campaign goes on, so its threshold meant something different at 40 experiments and at 100. The new ratio is 1 for a campaign progressing steadily, at any budget.</w:t>
+      </w:r>
+    </w:p>
+    <w:p>
+      <w:pPr>
+        <w:spacing w:after="120"/>
+      </w:pPr>
+      <w:r>
+        <w:t xml:space="preserve">On 18 Suzuki II campaigns this alarm calls the chemist on </w:t>
+      </w:r>
+      <w:r>
+        <w:rPr>
+          <w:b/>
+        </w:rPr>
+        <w:t>every one of the 13 that fail</w:t>
+      </w:r>
+      <w:r>
+        <w:t>, on average at experiment 22 with a quarter of the final gain still ahead, two to three calls per campaign. It also calls on some campaigns that end well — that is expected, and the chemist's job is to say “no, this one is fine”.</w:t>
       </w:r>
     </w:p>
     <w:tbl>
@@ -401,7 +435,7 @@
                 <w:i/>
                 <w:sz w:val="20"/>
               </w:rPr>
-              <w:t>Three reactions, three answers. The human study now has a shape.</w:t>
+              <w:t>The alarm books an appointment; the chemist diagnoses. The question is no longer “can we detect?” but “what does the chemist do when called?”</w:t>
             </w:r>
           </w:p>
         </w:tc>
@@ -417,7 +451,7 @@
         <w:pStyle w:val="Heading1"/>
       </w:pPr>
       <w:r>
-        <w:t>Thursday 10 — freezing the trigger, and a bug that would have voided the design</w:t>
+        <w:t>What may the chemist answer?</w:t>
       </w:r>
     </w:p>
     <w:p>
@@ -430,7 +464,7 @@
           <w:color w:val="176F8B"/>
           <w:sz w:val="22"/>
         </w:rPr>
-        <w:t>With the trigger's form settled, what window, what threshold, and is any of this reproducible?</w:t>
+        <w:t>When the alarm fires, what choices should the chemist have?</w:t>
       </w:r>
     </w:p>
     <w:p>
@@ -438,67 +472,34 @@
         <w:spacing w:after="120"/>
       </w:pPr>
       <w:r>
-        <w:t>We plotted where P</w:t>
+        <w:t xml:space="preserve">Three. </w:t>
       </w:r>
       <w:r>
         <w:rPr>
-          <w:i/>
+          <w:b/>
         </w:rPr>
-        <w:t xml:space="preserve"> fires on every campaign for each candidate setting, and I read the plots against a rule I had not written down before: **after the ten initial points there must be five optimiser proposals before the trigger may speak** — a chemist is not asked to judge three experiments. Then window and threshold together: at W = 5, a threshold of 0.10 left four campaigns silent, two of them failures; 0.30 alerted 13 of 13 failed case II campaigns at 2.5 solicitations each, first alert at 22.6 with a quarter of the gain still to come, and the one campaign never interrupted was the one that reached 100 %. I hesitated between my original ratio and P</w:t>
+        <w:t>Let the optimiser continue</w:t>
       </w:r>
       <w:r>
-        <w:t xml:space="preserve"> — they detect the same campaigns — and kept P* because its threshold does not change meaning with the budget. W = 5, 0.30, cooldown 5.</w:t>
+        <w:t xml:space="preserve"> (its next proposal is shown — the alarm was a false alert). </w:t>
       </w:r>
-    </w:p>
-    <w:p>
-      <w:pPr>
-        <w:jc w:val="center"/>
-      </w:pPr>
-      <w:r>
-        <w:drawing>
-          <wp:inline xmlns:a="http://schemas.openxmlformats.org/drawingml/2006/main" xmlns:pic="http://schemas.openxmlformats.org/drawingml/2006/picture">
-            <wp:extent cx="5760000" cy="3339475"/>
-            <wp:docPr id="2" name="Picture 2"/>
-            <wp:cNvGraphicFramePr>
-              <a:graphicFrameLocks noChangeAspect="1"/>
-            </wp:cNvGraphicFramePr>
-            <a:graphic>
-              <a:graphicData uri="http://schemas.openxmlformats.org/drawingml/2006/picture">
-                <pic:pic>
-                  <pic:nvPicPr>
-                    <pic:cNvPr id="0" name="firings_ii_pace_ratio_W5_cd5_s030.png"/>
-                    <pic:cNvPicPr/>
-                  </pic:nvPicPr>
-                  <pic:blipFill>
-                    <a:blip r:embed="rId10"/>
-                    <a:stretch>
-                      <a:fillRect/>
-                    </a:stretch>
-                  </pic:blipFill>
-                  <pic:spPr>
-                    <a:xfrm>
-                      <a:off x="0" y="0"/>
-                      <a:ext cx="5760000" cy="3339475"/>
-                    </a:xfrm>
-                    <a:prstGeom prst="rect"/>
-                  </pic:spPr>
-                </pic:pic>
-              </a:graphicData>
-            </a:graphic>
-          </wp:inline>
-        </w:drawing>
-      </w:r>
-    </w:p>
-    <w:p>
-      <w:pPr>
-        <w:spacing w:after="160"/>
-      </w:pPr>
       <w:r>
         <w:rPr>
-          <w:color w:val="5A6876"/>
-          <w:sz w:val="18"/>
+          <w:b/>
         </w:rPr>
-        <w:t>P* with the frozen settings on 18 case II campaigns: fraction of the front above, the signal against its threshold below, ▼ an alert. It fires on failures, and on some successes: it books, it does not diagnose.</w:t>
+        <w:t>Propose the next experiment</w:t>
+      </w:r>
+      <w:r>
+        <w:t xml:space="preserve"> (the chemist's own conditions replace the optimiser's proposal). </w:t>
+      </w:r>
+      <w:r>
+        <w:rPr>
+          <w:b/>
+        </w:rPr>
+        <w:t>Stop the campaign</w:t>
+      </w:r>
+      <w:r>
+        <w:t xml:space="preserve"> (nothing more is expected of it). The third one matters: stopping saves experiments but no algorithm can decide it — we checked that stopping at the first alarm would lose a third of the result on average — whereas a chemist knows whether 44 % yield on this coupling is a good outcome or a failure. Which of the three answers chemists give, and when, is a result in itself.</w:t>
       </w:r>
     </w:p>
     <w:p>
@@ -506,25 +507,7 @@
         <w:spacing w:after="120"/>
       </w:pPr>
       <w:r>
-        <w:t xml:space="preserve">I also stated the research question as I wanted it answered — </w:t>
-      </w:r>
-      <w:r>
-        <w:rPr>
-          <w:i/>
-        </w:rPr>
-        <w:t>does intervening when the trigger says so improve a campaign, in time and in quality?</w:t>
-      </w:r>
-      <w:r>
-        <w:t xml:space="preserve"> — which fixed the design: three arms sharing the same history up to the alert, plain BO, a </w:t>
-      </w:r>
-      <w:r>
-        <w:rPr>
-          <w:b/>
-        </w:rPr>
-        <w:t>random</w:t>
-      </w:r>
-      <w:r>
-        <w:t xml:space="preserve"> point at every alert (the null model), a chemist's point at every alert. A paired design like that only works if a fork without intervention reproduces its parent. It did not. I asked why, since one can seed BO. The cause was in REACTO: the BoFire strategy was built without a seed and drew one from operating-system entropy at every step. Fixed that afternoon, with a seed derived from the campaign and the iteration.</w:t>
+        <w:t>I also decided against any fixed schedule (“intervene at experiment 20”): it could fall exactly when the optimiser is doing well.</w:t>
       </w:r>
     </w:p>
     <w:tbl>
@@ -557,7 +540,7 @@
                 <w:i/>
                 <w:sz w:val="20"/>
               </w:rPr>
-              <w:t>Frozen trigger, three-arm design, campaigns that replay to twelve decimals. The bench could finally compute the two arms that need no chemist.</w:t>
+              <w:t>The human study has its shape: a call, three possible answers, a recorded reason.</w:t>
             </w:r>
           </w:p>
         </w:tc>
@@ -573,7 +556,7 @@
         <w:pStyle w:val="Heading1"/>
       </w:pPr>
       <w:r>
-        <w:t>Thursday night to Friday — what chance achieves at the alerts</w:t>
+        <w:t>Which reactions?</w:t>
       </w:r>
     </w:p>
     <w:p>
@@ -586,7 +569,7 @@
           <w:color w:val="176F8B"/>
           <w:sz w:val="22"/>
         </w:rPr>
-        <w:t>Before asking chemists to beat the trigger, what does a random point at the same moments do?</w:t>
+        <w:t>Suzuki II was the only trap I knew. Are there better test cases?</w:t>
       </w:r>
     </w:p>
     <w:p>
@@ -594,16 +577,286 @@
         <w:spacing w:after="120"/>
       </w:pPr>
       <w:r>
-        <w:t xml:space="preserve">Twenty arylation controls and forty random branches, 130 interventions, each branch compared with its own parent. </w:t>
+        <w:t xml:space="preserve">Twelve reaction grids were screened with the same optimiser. The criterion was not where the optimiser does best, but </w:t>
       </w:r>
       <w:r>
         <w:rPr>
           <w:b/>
         </w:rPr>
-        <w:t>Paired gain +1.3 points; 18 branches of 40 improve, Wilson [31 %, 60 %]; range −27 to +23; no change in time to 90 %.</w:t>
+        <w:t>where the outcome depends on the random start</w:t>
       </w:r>
       <w:r>
-        <w:t xml:space="preserve"> A random point moves a campaign a lot in both directions and on average almost not at all. That is the null I wanted: if the chemists beat it, it is expertise, not the effect of a shake. The only gain in it was luck on the ligand — one injected point in five hit a front ligand and those gained three times more.</w:t>
+        <w:t xml:space="preserve"> — the only situation a chemist can change. Two more requirements: a complete grid, and reagents with real names (a chemist cannot argue about “ligand L4”).</w:t>
+      </w:r>
+    </w:p>
+    <w:p>
+      <w:pPr>
+        <w:jc w:val="center"/>
+      </w:pPr>
+      <w:r>
+        <w:drawing>
+          <wp:inline xmlns:a="http://schemas.openxmlformats.org/drawingml/2006/main" xmlns:pic="http://schemas.openxmlformats.org/drawingml/2006/picture">
+            <wp:extent cx="5760000" cy="2688000"/>
+            <wp:docPr id="2" name="Picture 2"/>
+            <wp:cNvGraphicFramePr>
+              <a:graphicFrameLocks noChangeAspect="1"/>
+            </wp:cNvGraphicFramePr>
+            <a:graphic>
+              <a:graphicData uri="http://schemas.openxmlformats.org/drawingml/2006/picture">
+                <pic:pic>
+                  <pic:nvPicPr>
+                    <pic:cNvPr id="0" name="spread.png"/>
+                    <pic:cNvPicPr/>
+                  </pic:nvPicPr>
+                  <pic:blipFill>
+                    <a:blip r:embed="rId10"/>
+                    <a:stretch>
+                      <a:fillRect/>
+                    </a:stretch>
+                  </pic:blipFill>
+                  <pic:spPr>
+                    <a:xfrm>
+                      <a:off x="0" y="0"/>
+                      <a:ext cx="5760000" cy="2688000"/>
+                    </a:xfrm>
+                    <a:prstGeom prst="rect"/>
+                  </pic:spPr>
+                </pic:pic>
+              </a:graphicData>
+            </a:graphic>
+          </wp:inline>
+        </w:drawing>
+      </w:r>
+    </w:p>
+    <w:p>
+      <w:pPr>
+        <w:spacing w:after="160"/>
+      </w:pPr>
+      <w:r>
+        <w:rPr>
+          <w:color w:val="5A6876"/>
+          <w:sz w:val="18"/>
+        </w:rPr>
+        <w:t>How much the outcome varies between random starts, per reaction, in points of the best achievable result. Only three reactions leave the chemist enough room.</w:t>
+      </w:r>
+    </w:p>
+    <w:p>
+      <w:pPr>
+        <w:spacing w:after="120"/>
+      </w:pPr>
+      <w:r>
+        <w:t xml:space="preserve">Three reactions are kept: </w:t>
+      </w:r>
+      <w:r>
+        <w:rPr>
+          <w:b/>
+        </w:rPr>
+        <w:t>Suzuki II</w:t>
+      </w:r>
+      <w:r>
+        <w:t xml:space="preserve"> (the catalyst trap), </w:t>
+      </w:r>
+      <w:r>
+        <w:rPr>
+          <w:b/>
+        </w:rPr>
+        <w:t>Suzuki I</w:t>
+      </w:r>
+      <w:r>
+        <w:t xml:space="preserve"> (same chemistry, a different trap: the right catalyst is found, but too late), and the </w:t>
+      </w:r>
+      <w:r>
+        <w:rPr>
+          <w:b/>
+        </w:rPr>
+        <w:t>C–H arylation from EDBO+</w:t>
+      </w:r>
+      <w:r>
+        <w:t xml:space="preserve"> — real measurements, 1,728 conditions, with two genuinely competing objectives, yield and reagent cost. The others were either too easy (the optimiser always wins) or nameless.</w:t>
+      </w:r>
+    </w:p>
+    <w:tbl>
+      <w:tblPr>
+        <w:tblW w:type="auto" w:w="0"/>
+        <w:tblLook w:firstColumn="1" w:firstRow="1" w:lastColumn="0" w:lastRow="0" w:noHBand="0" w:noVBand="1" w:val="04A0"/>
+      </w:tblPr>
+      <w:tblGrid>
+        <w:gridCol w:w="9632"/>
+      </w:tblGrid>
+      <w:tr>
+        <w:tc>
+          <w:tcPr>
+            <w:tcW w:type="dxa" w:w="9632"/>
+            <w:shd w:val="clear" w:color="auto" w:fill="FBE9DF"/>
+          </w:tcPr>
+          <w:p>
+            <w:r/>
+            <w:r>
+              <w:rPr>
+                <w:b/>
+                <w:i/>
+                <w:color w:val="E0672F"/>
+                <w:sz w:val="20"/>
+              </w:rPr>
+              <w:t xml:space="preserve">What changed · </w:t>
+            </w:r>
+            <w:r>
+              <w:rPr>
+                <w:i/>
+                <w:sz w:val="20"/>
+              </w:rPr>
+              <w:t>Three reactions, three different ways for the optimiser to be wrong.</w:t>
+            </w:r>
+          </w:p>
+        </w:tc>
+      </w:tr>
+    </w:tbl>
+    <w:p>
+      <w:pPr>
+        <w:spacing w:after="0"/>
+      </w:pPr>
+    </w:p>
+    <w:p>
+      <w:pPr>
+        <w:pStyle w:val="Heading1"/>
+      </w:pPr>
+      <w:r>
+        <w:t>How to measure whether the chemist helps</w:t>
+      </w:r>
+    </w:p>
+    <w:p>
+      <w:pPr>
+        <w:spacing w:after="60"/>
+      </w:pPr>
+      <w:r>
+        <w:rPr>
+          <w:b/>
+          <w:color w:val="176F8B"/>
+          <w:sz w:val="22"/>
+        </w:rPr>
+        <w:t>Compared with what?</w:t>
+      </w:r>
+    </w:p>
+    <w:p>
+      <w:pPr>
+        <w:spacing w:after="120"/>
+      </w:pPr>
+      <w:r>
+        <w:t xml:space="preserve">Three campaigns that share the same history up to the alarm and differ only in what happens then: </w:t>
+      </w:r>
+      <w:r>
+        <w:rPr>
+          <w:b/>
+        </w:rPr>
+        <w:t>the optimiser alone</w:t>
+      </w:r>
+      <w:r>
+        <w:t xml:space="preserve">, </w:t>
+      </w:r>
+      <w:r>
+        <w:rPr>
+          <w:b/>
+        </w:rPr>
+        <w:t>a random condition</w:t>
+      </w:r>
+      <w:r>
+        <w:t xml:space="preserve"> injected at every alarm, and </w:t>
+      </w:r>
+      <w:r>
+        <w:rPr>
+          <w:b/>
+        </w:rPr>
+        <w:t>a chemist's condition</w:t>
+      </w:r>
+      <w:r>
+        <w:t xml:space="preserve"> at every alarm. The random one is the honest yardstick: it tells what an intervention achieves when it carries no knowledge. Each branch is compared with its own parent campaign, so the shared start cancels out.</w:t>
+      </w:r>
+    </w:p>
+    <w:p>
+      <w:pPr>
+        <w:spacing w:after="120"/>
+      </w:pPr>
+      <w:r>
+        <w:t>That design only works if a campaign can be replayed exactly, and ours could not: two identical runs diverged. The cause was in REACTO — the optimiser was created without a random seed, so it drew a fresh one from the operating system at every step. Fixed; campaigns now replay to the twelfth decimal, and the application's behaviour is unchanged for normal use.</w:t>
+      </w:r>
+    </w:p>
+    <w:tbl>
+      <w:tblPr>
+        <w:tblW w:type="auto" w:w="0"/>
+        <w:tblLook w:firstColumn="1" w:firstRow="1" w:lastColumn="0" w:lastRow="0" w:noHBand="0" w:noVBand="1" w:val="04A0"/>
+      </w:tblPr>
+      <w:tblGrid>
+        <w:gridCol w:w="9632"/>
+      </w:tblGrid>
+      <w:tr>
+        <w:tc>
+          <w:tcPr>
+            <w:tcW w:type="dxa" w:w="9632"/>
+            <w:shd w:val="clear" w:color="auto" w:fill="FBE9DF"/>
+          </w:tcPr>
+          <w:p>
+            <w:r/>
+            <w:r>
+              <w:rPr>
+                <w:b/>
+                <w:i/>
+                <w:color w:val="E0672F"/>
+                <w:sz w:val="20"/>
+              </w:rPr>
+              <w:t xml:space="preserve">What changed · </w:t>
+            </w:r>
+            <w:r>
+              <w:rPr>
+                <w:i/>
+                <w:sz w:val="20"/>
+              </w:rPr>
+              <w:t>Paired comparison against a null model, on campaigns that replay exactly.</w:t>
+            </w:r>
+          </w:p>
+        </w:tc>
+      </w:tr>
+    </w:tbl>
+    <w:p>
+      <w:pPr>
+        <w:spacing w:after="0"/>
+      </w:pPr>
+    </w:p>
+    <w:p>
+      <w:pPr>
+        <w:pStyle w:val="Heading1"/>
+      </w:pPr>
+      <w:r>
+        <w:t>What chance achieves</w:t>
+      </w:r>
+    </w:p>
+    <w:p>
+      <w:pPr>
+        <w:spacing w:after="60"/>
+      </w:pPr>
+      <w:r>
+        <w:rPr>
+          <w:b/>
+          <w:color w:val="176F8B"/>
+          <w:sz w:val="22"/>
+        </w:rPr>
+        <w:t>Before asking chemists, what does a random point at the alarm do?</w:t>
+      </w:r>
+    </w:p>
+    <w:p>
+      <w:pPr>
+        <w:spacing w:after="120"/>
+      </w:pPr>
+      <w:r>
+        <w:t xml:space="preserve">On the arylation: 20 campaigns, 40 random branches, 130 interventions. </w:t>
+      </w:r>
+      <w:r>
+        <w:rPr>
+          <w:b/>
+        </w:rPr>
+        <w:t>A random point at the alarm changes the final result by +1.3 points on average</w:t>
+      </w:r>
+      <w:r>
+        <w:t>; 18 branches out of 40 improve, 11 are unchanged, 11 get worse; the range is −27 to +23. In other words: it shakes the campaign a lot, in both directions, and gains almost nothing. The only gain in it is luck — one random point in five happened to use a winning catalyst, and those branches gained three times more.</w:t>
       </w:r>
     </w:p>
     <w:p>
@@ -693,7 +946,7 @@
           <w:color w:val="5A6876"/>
           <w:sz w:val="18"/>
         </w:rPr>
-        <w:t>Left: five arylation campaigns, plain BO in blue, the same with a random point at each alert in red. Right: the paired gain over forty branches.</w:t>
+        <w:t>Left: five arylation campaigns, optimiser alone (blue) and the same campaign with a random point at each alarm (red). Right: how the 40 branches ended relative to their parent.</w:t>
       </w:r>
     </w:p>
     <w:p>
@@ -701,33 +954,13 @@
         <w:spacing w:after="120"/>
       </w:pPr>
       <w:r>
-        <w:t xml:space="preserve">The number that stayed with me is not +1.3 but how it got there: +4.0 on eleven branches, +2.7 on nineteen, +1.3 on forty. A human arm with five chemists lives in that regime. </w:t>
+        <w:t xml:space="preserve">One thing to remember from this: with 11 branches the gain looked like +4.0; with 19, +2.7; with 40, +1.3. Small samples flatter. The human study will have five chemists and a few answers each — </w:t>
       </w:r>
       <w:r>
         <w:rPr>
           <w:b/>
         </w:rPr>
-        <w:t>I will not conclude on a mean over a dozen answers</w:t>
-      </w:r>
-      <w:r>
-        <w:t>; the comparison has to be paired, on the same checkpoints, against this arm.</w:t>
-      </w:r>
-    </w:p>
-    <w:p>
-      <w:pPr>
-        <w:spacing w:after="120"/>
-      </w:pPr>
-      <w:r>
-        <w:t xml:space="preserve">Friday went to the question I had been circling since Tuesday: how do chemists who do not code take part? An HTML form, an invitation page and a Colab notebook were all built and all rejected. The answer was the one I had rejected first for being more work: </w:t>
-      </w:r>
-      <w:r>
-        <w:rPr>
-          <w:b/>
-        </w:rPr>
-        <w:t>a page inside REACTO</w:t>
-      </w:r>
-      <w:r>
-        <w:t>, where a chemist types a name, watches the initial design, launches the optimiser, and is stopped by the trigger.</w:t>
+        <w:t>its result must be read paired against this random arm, never as a mean on its own.</w:t>
       </w:r>
     </w:p>
     <w:tbl>
@@ -760,7 +993,7 @@
                 <w:i/>
                 <w:sz w:val="20"/>
               </w:rPr>
-              <w:t>The null is nearly zero. The chemists' page exists as a tested engine with a thin interface.</w:t>
+              <w:t>Anything the chemists gain above this is knowledge, not luck.</w:t>
             </w:r>
           </w:p>
         </w:tc>
@@ -776,7 +1009,7 @@
         <w:pStyle w:val="Heading1"/>
       </w:pPr>
       <w:r>
-        <w:t>Saturday 12 — what exactly are the chemists being asked to overturn?</w:t>
+        <w:t>What exactly are the chemists asked to fix?</w:t>
       </w:r>
     </w:p>
     <w:p>
@@ -789,7 +1022,7 @@
           <w:color w:val="176F8B"/>
           <w:sz w:val="22"/>
         </w:rPr>
-        <w:t>When I say seed 2 is trapped — is that the initial design, or the optimiser's own randomness?</w:t>
+        <w:t>When I say “this random start traps the optimiser” — is it the start, or the optimiser's own randomness?</w:t>
       </w:r>
     </w:p>
     <w:p>
@@ -797,76 +1030,16 @@
         <w:spacing w:after="120"/>
       </w:pPr>
       <w:r>
-        <w:t xml:space="preserve">One integer had always seeded both. With the acquisition now seedable we held the initial design and varied the rest: arylation seed 2 ended at 72.5 % of the front four times out of four; Suzuki II seed 3 at 37.3 % four times out of four, one visit to PCy3 in thirty experiments each time. </w:t>
+        <w:t xml:space="preserve">We held the random start fixed and reran the optimiser four times with different internal seeds. Same result every time: 72.5 % on the arylation, 37.3 % on Suzuki II. </w:t>
       </w:r>
       <w:r>
         <w:rPr>
           <w:b/>
         </w:rPr>
-        <w:t>Given this optimiser, a campaign's fate is a function of its ten starting points.</w:t>
+        <w:t>The outcome is decided by the ten starting conditions.</w:t>
       </w:r>
       <w:r>
-        <w:t xml:space="preserve"> That made the article's frame obvious to me: not “does HITL help on average”, which five chemists cannot carry, but a </w:t>
-      </w:r>
-      <w:r>
-        <w:rPr>
-          <w:i/>
-        </w:rPr>
-        <w:t>case study on trapped initial designs</w:t>
-      </w:r>
-      <w:r>
-        <w:t xml:space="preserve"> — base rate from the twenty seeds, then one trapped design per reaction, and three paired branches. Does a chemist called between experiments 15 and 22 get the campaign out of a trap that neither the optimiser nor chance leaves?</w:t>
-      </w:r>
-    </w:p>
-    <w:p>
-      <w:pPr>
-        <w:jc w:val="center"/>
-      </w:pPr>
-      <w:r>
-        <w:drawing>
-          <wp:inline xmlns:a="http://schemas.openxmlformats.org/drawingml/2006/main" xmlns:pic="http://schemas.openxmlformats.org/drawingml/2006/picture">
-            <wp:extent cx="5760000" cy="3654621"/>
-            <wp:docPr id="5" name="Picture 5"/>
-            <wp:cNvGraphicFramePr>
-              <a:graphicFrameLocks noChangeAspect="1"/>
-            </wp:cNvGraphicFramePr>
-            <a:graphic>
-              <a:graphicData uri="http://schemas.openxmlformats.org/drawingml/2006/picture">
-                <pic:pic>
-                  <pic:nvPicPr>
-                    <pic:cNvPr id="0" name="seed_choice_ii.png"/>
-                    <pic:cNvPicPr/>
-                  </pic:nvPicPr>
-                  <pic:blipFill>
-                    <a:blip r:embed="rId13"/>
-                    <a:stretch>
-                      <a:fillRect/>
-                    </a:stretch>
-                  </pic:blipFill>
-                  <pic:spPr>
-                    <a:xfrm>
-                      <a:off x="0" y="0"/>
-                      <a:ext cx="5760000" cy="3654621"/>
-                    </a:xfrm>
-                    <a:prstGeom prst="rect"/>
-                  </pic:spPr>
-                </pic:pic>
-              </a:graphicData>
-            </a:graphic>
-          </wp:inline>
-        </w:drawing>
-      </w:r>
-    </w:p>
-    <w:p>
-      <w:pPr>
-        <w:spacing w:after="160"/>
-      </w:pPr>
-      <w:r>
-        <w:rPr>
-          <w:color w:val="5A6876"/>
-          <w:sz w:val="18"/>
-        </w:rPr>
-        <w:t>Suzuki II, the twenty controls: orange campaigns end below 90 % of the front; red dashes are the alerts. The trapped ones all drew PCy3 at 0 % yield in the initial design. Seed 12 is the campaign the chemists receive.</w:t>
+        <w:t xml:space="preserve"> The optimiser itself adds no luck.</w:t>
       </w:r>
     </w:p>
     <w:p>
@@ -874,7 +1047,22 @@
         <w:spacing w:after="120"/>
       </w:pPr>
       <w:r>
-        <w:t>So we laid out all twenty controls per reaction, with what the initial design had shown of the winning ligand, and I chose: Suzuki II seed 12 (44 %, alert at 16, PCy3 seen once at 0 %), Suzuki I seed 8 (69 %, alert at 20, Xantphos seen at 40 °C, rediscovered too late), arylation seed 2 (72 %, alert at 16, a good ligand found at once and then nothing). Three different ways to be wrong.</w:t>
+        <w:t xml:space="preserve">This settles how to present the study: not “does a chemist help on average” — five chemists cannot answer that — but </w:t>
+      </w:r>
+      <w:r>
+        <w:rPr>
+          <w:b/>
+        </w:rPr>
+        <w:t>a case study on starts that trap the optimiser</w:t>
+      </w:r>
+      <w:r>
+        <w:t xml:space="preserve">. We know how often such starts occur (13, 5 and 10 out of 20). On one such start per reaction, everyone gets the same campaign; the optimiser alone and the random arm are already computed on it; the chemists' branch is what remains. The question becomes precise: </w:t>
+      </w:r>
+      <w:r>
+        <w:rPr>
+          <w:i/>
+        </w:rPr>
+        <w:t>does a chemist, called around experiment 16–20, get the campaign out of a trap that neither the optimiser nor chance escapes?</w:t>
       </w:r>
     </w:p>
     <w:p>
@@ -882,16 +1070,7 @@
         <w:spacing w:after="120"/>
       </w:pPr>
       <w:r>
-        <w:t xml:space="preserve">The rest of the day was spent being the first chemist. Opening the page in a browser exposed what HTTP tests could not (a callback the renderer refused, a race between ticks, catalyst codes in the menus where the table showed names); I asked for English, for the table to come first, for a resume list like the Optimization page, and for the chemistry — the reaction, the ligands drawn, the conditions, the prices per gram behind the cost objective — to be the first thing on screen, from the source figures rather than redrawn. Running the three campaigns myself showed the last gap: I never filled in </w:t>
-      </w:r>
-      <w:r>
-        <w:rPr>
-          <w:i/>
-        </w:rPr>
-        <w:t>why</w:t>
-      </w:r>
-      <w:r>
-        <w:t>. The field is optional; it should not be.</w:t>
+        <w:t>The three campaigns chosen: Suzuki II start 12 (ends at 44 %, alarm at 16, PCy3 tried once at 0 %), Suzuki I start 8 (69 %, alarm at 20, Xantphos tried once at 40 °C, rediscovered too late), arylation start 2 (72 %, alarm at 16, a good ligand found at once and then nothing for 28 experiments).</w:t>
       </w:r>
     </w:p>
     <w:tbl>
@@ -924,7 +1103,7 @@
                 <w:i/>
                 <w:sz w:val="20"/>
               </w:rPr>
-              <w:t>The study is now a question I can state in one sentence, on three campaigns I can name, on a page I have used.</w:t>
+              <w:t>One sentence, three named campaigns, a yardstick already measured on each.</w:t>
             </w:r>
           </w:p>
         </w:tc>
@@ -940,7 +1119,94 @@
         <w:pStyle w:val="Heading1"/>
       </w:pPr>
       <w:r>
-        <w:t>Open for next week</w:t>
+        <w:t>How the chemists take part</w:t>
+      </w:r>
+    </w:p>
+    <w:p>
+      <w:pPr>
+        <w:spacing w:after="60"/>
+      </w:pPr>
+      <w:r>
+        <w:rPr>
+          <w:b/>
+          <w:color w:val="176F8B"/>
+          <w:sz w:val="22"/>
+        </w:rPr>
+        <w:t>My colleagues do not code. How do they run a campaign?</w:t>
+      </w:r>
+    </w:p>
+    <w:p>
+      <w:pPr>
+        <w:spacing w:after="120"/>
+      </w:pPr>
+      <w:r>
+        <w:t xml:space="preserve">After a form, an invitation page and a notebook were tried and rejected, the answer was </w:t>
+      </w:r>
+      <w:r>
+        <w:rPr>
+          <w:b/>
+        </w:rPr>
+        <w:t>a page in REACTO</w:t>
+      </w:r>
+      <w:r>
+        <w:t>. A chemist enters a name, reads the chemistry of the reaction (the scheme, the catalysts drawn, the conditions, the price per gram of each reagent when cost is an objective), looks at the ten starting experiments, and launches the optimiser. Experiments appear one per second — the same for everyone, since they replay the chosen campaign. When the alarm fires the page pauses and asks for one of the three answers and a reason. If the chemist proposes a condition, the optimiser continues for real from there. Everything is saved as it goes; a chemist who leaves resumes from a list.</w:t>
+      </w:r>
+    </w:p>
+    <w:p>
+      <w:pPr>
+        <w:spacing w:after="120"/>
+      </w:pPr>
+      <w:r>
+        <w:t>I ran the three campaigns myself. It works, and it showed the last gap: I never wrote a reason. The field is optional; it should not be.</w:t>
+      </w:r>
+    </w:p>
+    <w:tbl>
+      <w:tblPr>
+        <w:tblW w:type="auto" w:w="0"/>
+        <w:tblLook w:firstColumn="1" w:firstRow="1" w:lastColumn="0" w:lastRow="0" w:noHBand="0" w:noVBand="1" w:val="04A0"/>
+      </w:tblPr>
+      <w:tblGrid>
+        <w:gridCol w:w="9632"/>
+      </w:tblGrid>
+      <w:tr>
+        <w:tc>
+          <w:tcPr>
+            <w:tcW w:type="dxa" w:w="9632"/>
+            <w:shd w:val="clear" w:color="auto" w:fill="FBE9DF"/>
+          </w:tcPr>
+          <w:p>
+            <w:r/>
+            <w:r>
+              <w:rPr>
+                <w:b/>
+                <w:i/>
+                <w:color w:val="E0672F"/>
+                <w:sz w:val="20"/>
+              </w:rPr>
+              <w:t xml:space="preserve">What changed · </w:t>
+            </w:r>
+            <w:r>
+              <w:rPr>
+                <w:i/>
+                <w:sz w:val="20"/>
+              </w:rPr>
+              <w:t>The study can start as soon as the reason field is made mandatory.</w:t>
+            </w:r>
+          </w:p>
+        </w:tc>
+      </w:tr>
+    </w:tbl>
+    <w:p>
+      <w:pPr>
+        <w:spacing w:after="0"/>
+      </w:pPr>
+    </w:p>
+    <w:p>
+      <w:pPr>
+        <w:pStyle w:val="Heading1"/>
+      </w:pPr>
+      <w:r>
+        <w:t>Still to do</w:t>
       </w:r>
     </w:p>
     <w:p>
@@ -949,7 +1215,7 @@
         <w:spacing w:after="40"/>
       </w:pPr>
       <w:r>
-        <w:t>Make the justification mandatory.</w:t>
+        <w:t>Make the reason mandatory.</w:t>
       </w:r>
     </w:p>
     <w:p>
@@ -958,7 +1224,7 @@
         <w:spacing w:after="40"/>
       </w:pPr>
       <w:r>
-        <w:t>How to compare a stopped campaign with a control that spent 40 experiments.</w:t>
+        <w:t>Decide how a stopped campaign is compared with one that ran the full 40 experiments.</w:t>
       </w:r>
     </w:p>
     <w:p>
@@ -967,7 +1233,7 @@
         <w:spacing w:after="40"/>
       </w:pPr>
       <w:r>
-        <w:t>Random branches on Suzuki, and enough draws at the first alert to place a chemist's answer on a percentile.</w:t>
+        <w:t>Compute the random arm on the two Suzuki campaigns, and more random draws at the first alarm to place each chemist's answer on a percentile.</w:t>
       </w:r>
     </w:p>
     <w:p>
@@ -976,7 +1242,7 @@
         <w:spacing w:after="40"/>
       </w:pPr>
       <w:r>
-        <w:t>Rights for the Nature figure in the article; the source of the four-case Suzuki scheme still to be credited.</w:t>
+        <w:t>Permission for the Nature figure shown on the arylation page, and the source of the Suzuki scheme to credit.</w:t>
       </w:r>
     </w:p>
     <w:p>

</xml_diff>